<commit_message>
Fix em-dash replacement (comma not hyphen) and Niveau 3 formatting
https://claude.ai/code/session_01RyDkmWcXHEEFSzcZ5JdHLj
</commit_message>
<xml_diff>
--- a/TRONC_CENTRAL_Yadulink_v2.docx
+++ b/TRONC_CENTRAL_Yadulink_v2.docx
@@ -46,7 +46,7 @@
         </w:rPr>
         <w:br w:type="textWrapping"/>
         <w:br w:type="textWrapping"/>
-        <w:t xml:space="preserve">LEXIQUE  -  VOCABULAIRE CENTRAL</w:t>
+        <w:t xml:space="preserve">LEXIQUE , VOCABULAIRE CENTRAL</w:t>
       </w:r>
     </w:p>
     <w:p>
@@ -234,7 +234,7 @@
         <w:rPr>
           <w:rtl w:val="0"/>
         </w:rPr>
-        <w:t xml:space="preserve"> Approche conversationnelle où la qualification arrive tôt  -  dès le deuxième message. On vérifie l'alignement avant de creuser la relation.</w:t>
+        <w:t xml:space="preserve"> Approche conversationnelle où la qualification arrive tôt , dès le deuxième message. On vérifie l'alignement avant de creuser la relation.</w:t>
       </w:r>
     </w:p>
     <w:p>
@@ -338,7 +338,7 @@
         <w:rPr>
           <w:rtl w:val="0"/>
         </w:rPr>
-        <w:t xml:space="preserve"> L'objectif final de la conversation  -  ce qu'on propose au prospect une fois qu'il est qualifié. L'action finale est définie par l'utilisateur de la plateforme et peut prendre différentes formes.</w:t>
+        <w:t xml:space="preserve"> L'objectif final de la conversation , ce qu'on propose au prospect une fois qu'il est qualifié. L'action finale est définie par l'utilisateur de la plateforme et peut prendre différentes formes.</w:t>
       </w:r>
     </w:p>
     <w:p>
@@ -441,7 +441,7 @@
         <w:rPr>
           <w:rtl w:val="0"/>
         </w:rPr>
-        <w:t xml:space="preserve"> Processus par lequel on amène le prospect à prendre conscience de son problème réel  -  via des questions de fond progressives. Ce n'est pas l'agent qui lui dit qu'il a un problème : c'est le prospect qui arrive à cette conclusion par ses propres mots.</w:t>
+        <w:t xml:space="preserve"> Processus par lequel on amène le prospect à prendre conscience de son problème réel , via des questions de fond progressives. Ce n'est pas l'agent qui lui dit qu'il a un problème : c'est le prospect qui arrive à cette conclusion par ses propres mots.</w:t>
       </w:r>
     </w:p>
     <w:p>
@@ -461,7 +461,7 @@
         <w:rPr>
           <w:rtl w:val="0"/>
         </w:rPr>
-        <w:t xml:space="preserve"> La conscientisation n'a pas besoin d'être complète pour passer à la permission et au mini-insight. Le prospect n'a pas à avoir tout réalisé par lui-même avant qu'on avance. C'est précisément le rôle du mini-insight que de nommer ce que le prospect n'a pas encore totalement verbalisé  -  la conscientisation et le mini-insight se complètent, ils ne se succèdent pas dans un ordre strict.</w:t>
+        <w:t xml:space="preserve"> La conscientisation n'a pas besoin d'être complète pour passer à la permission et au mini-insight. Le prospect n'a pas à avoir tout réalisé par lui-même avant qu'on avance. C'est précisément le rôle du mini-insight que de nommer ce que le prospect n'a pas encore totalement verbalisé , la conscientisation et le mini-insight se complètent, ils ne se succèdent pas dans un ordre strict.</w:t>
       </w:r>
     </w:p>
     <w:p>
@@ -481,7 +481,7 @@
         <w:rPr>
           <w:rtl w:val="0"/>
         </w:rPr>
-        <w:t xml:space="preserve"> Phase 3  -  en amont de la permission et du mini-insight.</w:t>
+        <w:t xml:space="preserve"> Phase 3 , en amont de la permission et du mini-insight.</w:t>
       </w:r>
     </w:p>
     <w:p>
@@ -595,7 +595,7 @@
         <w:rPr>
           <w:rtl w:val="0"/>
         </w:rPr>
-        <w:t xml:space="preserve"> Phase 3  -  juste avant le mini-insight.</w:t>
+        <w:t xml:space="preserve"> Phase 3 , juste avant le mini-insight.</w:t>
       </w:r>
     </w:p>
     <w:p>
@@ -666,7 +666,7 @@
           <w:iCs w:val="1"/>
           <w:rtl w:val="0"/>
         </w:rPr>
-        <w:t xml:space="preserve">"Tu n'as pas vraiment un problème de X  -  tu as un problème de Y.</w:t>
+        <w:t xml:space="preserve">"Tu n'as pas vraiment un problème de X , tu as un problème de Y.</w:t>
       </w:r>
       <w:r/>
       <w:r/>
@@ -683,7 +683,7 @@
         <w:rPr>
           <w:rtl w:val="0"/>
         </w:rPr>
-        <w:t xml:space="preserve"> Le mini-insight nomme ce que le prospect n'avait pas encore totalement verbalisé  -  et peut lui-même faire avancer la prise de conscience.</w:t>
+        <w:t xml:space="preserve"> Le mini-insight nomme ce que le prospect n'avait pas encore totalement verbalisé , et peut lui-même faire avancer la prise de conscience.</w:t>
       </w:r>
     </w:p>
     <w:p>
@@ -703,7 +703,7 @@
         <w:rPr>
           <w:rtl w:val="0"/>
         </w:rPr>
-        <w:t xml:space="preserve"> Phase 3  -  juste après la permission.</w:t>
+        <w:t xml:space="preserve"> Phase 3 , juste après la permission.</w:t>
       </w:r>
     </w:p>
     <w:p>
@@ -749,7 +749,7 @@
           <w:szCs w:val="32"/>
           <w:rtl w:val="0"/>
         </w:rPr>
-        <w:t xml:space="preserve">BLOC 1  -  VISION MACRO DES PHASES + 4 CAS D'ENTRÉE</w:t>
+        <w:t xml:space="preserve">BLOC 1 , VISION MACRO DES PHASES + 4 CAS D'ENTRÉE</w:t>
       </w:r>
       <w:r/>
       <w:r>
@@ -798,7 +798,7 @@
           <w:szCs w:val="26"/>
           <w:rtl w:val="0"/>
         </w:rPr>
-        <w:t xml:space="preserve">RÈGLE CENTRALE  -  PHASES 1 ET 2 (ENTONNOIR CLASSIQUE)</w:t>
+        <w:t xml:space="preserve">RÈGLE CENTRALE , PHASES 1 ET 2 (ENTONNOIR CLASSIQUE)</w:t>
       </w:r>
     </w:p>
     <w:p>
@@ -824,7 +824,7 @@
         <w:rPr>
           <w:rtl w:val="0"/>
         </w:rPr>
-        <w:t xml:space="preserve">. On est la personne qui s'intéresse vraiment à ce que fait l'autre  -  pas celle qui cherche à vendre quelque chose.</w:t>
+        <w:t xml:space="preserve">. On est la personne qui s'intéresse vraiment à ce que fait l'autre , pas celle qui cherche à vendre quelque chose.</w:t>
       </w:r>
     </w:p>
     <w:p>
@@ -836,7 +836,7 @@
         <w:rPr>
           <w:rtl w:val="0"/>
         </w:rPr>
-        <w:t xml:space="preserve">Aucune question ne doit laisser sentir qu'on va essayer de vendre quelque chose derrière. Pas de question sur les clients, l'acquisition, le chiffre d'affaires, les difficultés commerciales. Ces sujets arrivent en Phase 3  -  et seulement après avoir construit la relation.</w:t>
+        <w:t xml:space="preserve">Aucune question ne doit laisser sentir qu'on va essayer de vendre quelque chose derrière. Pas de question sur les clients, l'acquisition, le chiffre d'affaires, les difficultés commerciales. Ces sujets arrivent en Phase 3 , et seulement après avoir construit la relation.</w:t>
       </w:r>
     </w:p>
     <w:p>
@@ -872,7 +872,7 @@
         <w:rPr>
           <w:rtl w:val="0"/>
         </w:rPr>
-        <w:t xml:space="preserve">Le prospect habitué à être prospecté a développé un filtre automatique. Dès qu'un message laisse sentir qu'on va essayer de vendre quelque chose  -  même subtilement  -  il se ferme. En phases 1 et 2, le signal doit être sans ambiguïté : </w:t>
+        <w:t xml:space="preserve">Le prospect habitué à être prospecté a développé un filtre automatique. Dès qu'un message laisse sentir qu'on va essayer de vendre quelque chose , même subtilement , il se ferme. En phases 1 et 2, le signal doit être sans ambiguïté : </w:t>
       </w:r>
       <w:r>
         <w:rPr>
@@ -954,7 +954,7 @@
           <w:u w:val="single"/>
           <w:rtl w:val="0"/>
         </w:rPr>
-        <w:t xml:space="preserve">CHEMIN 1  -  Entonnoir classique</w:t>
+        <w:t xml:space="preserve">CHEMIN 1 , Entonnoir classique</w:t>
       </w:r>
     </w:p>
     <w:p>
@@ -1024,7 +1024,7 @@
           <w:u w:val="single"/>
           <w:rtl w:val="0"/>
         </w:rPr>
-        <w:t xml:space="preserve">CHEMIN 2  -  Entonnoir inversé</w:t>
+        <w:t xml:space="preserve">CHEMIN 2 , Entonnoir inversé</w:t>
       </w:r>
     </w:p>
     <w:p>
@@ -1108,7 +1108,7 @@
         <w:rPr>
           <w:rtl w:val="0"/>
         </w:rPr>
-        <w:t xml:space="preserve">Un freelance coach a besoin de sentir la relation avant d'aller en appel. Un dirigeant d'agence veut savoir ce qu'on lui veut dès le deuxième message  -  il n'a pas le temps pour 5 échanges de warming. La même approche conversationnelle appliquée aux deux profils = perte de l'un ou de l'autre, voire des deux. Le choix du chemin conditionne tout ce qui suit.</w:t>
+        <w:t xml:space="preserve">Un freelance coach a besoin de sentir la relation avant d'aller en appel. Un dirigeant d'agence veut savoir ce qu'on lui veut dès le deuxième message , il n'a pas le temps pour 5 échanges de warming. La même approche conversationnelle appliquée aux deux profils = perte de l'un ou de l'autre, voire des deux. Le choix du chemin conditionne tout ce qui suit.</w:t>
       </w:r>
     </w:p>
     <w:p>
@@ -1179,7 +1179,7 @@
           <w:szCs w:val="24"/>
           <w:rtl w:val="0"/>
         </w:rPr>
-        <w:t xml:space="preserve">PHASE 1  -  Entrée dans la conversation</w:t>
+        <w:t xml:space="preserve">PHASE 1 , Entrée dans la conversation</w:t>
       </w:r>
     </w:p>
     <w:p>
@@ -1218,7 +1218,7 @@
           <w:u w:val="single"/>
           <w:rtl w:val="0"/>
         </w:rPr>
-        <w:t xml:space="preserve">Ce qui se passe  -  éléments communs aux deux chemins :</w:t>
+        <w:t xml:space="preserve">Ce qui se passe , éléments communs aux deux chemins :</w:t>
       </w:r>
     </w:p>
     <w:p>
@@ -1277,7 +1277,7 @@
           <w:u w:val="single"/>
           <w:rtl w:val="0"/>
         </w:rPr>
-        <w:t xml:space="preserve">Ce qui se passe  -  entonnoir classique :</w:t>
+        <w:t xml:space="preserve">Ce qui se passe , entonnoir classique :</w:t>
       </w:r>
     </w:p>
     <w:p>
@@ -1293,7 +1293,7 @@
         <w:rPr>
           <w:rtl w:val="0"/>
         </w:rPr>
-        <w:t xml:space="preserve">À partir du deuxième message : une question ouverte et personnalisée pour faire parler la personne  -  son parcours, sa philosophie, son enjeu spécifique</w:t>
+        <w:t xml:space="preserve">À partir du deuxième message : une question ouverte et personnalisée pour faire parler la personne , son parcours, sa philosophie, son enjeu spécifique</w:t>
       </w:r>
     </w:p>
     <w:p>
@@ -1352,7 +1352,7 @@
           <w:u w:val="single"/>
           <w:rtl w:val="0"/>
         </w:rPr>
-        <w:t xml:space="preserve">Ce qui se passe  -  entonnoir inversé :</w:t>
+        <w:t xml:space="preserve">Ce qui se passe , entonnoir inversé :</w:t>
       </w:r>
     </w:p>
     <w:p>
@@ -1368,7 +1368,7 @@
         <w:rPr>
           <w:rtl w:val="0"/>
         </w:rPr>
-        <w:t xml:space="preserve">À partir du deuxième message : une question de qualification directe  -  on présente une référence crédible et on demande si l'enjeu est réel pour le prospect </w:t>
+        <w:t xml:space="preserve">À partir du deuxième message : une question de qualification directe , on présente une référence crédible et on demande si l'enjeu est réel pour le prospect </w:t>
       </w:r>
       <w:r>
         <w:rPr>
@@ -1376,7 +1376,7 @@
           <w:iCs w:val="1"/>
           <w:rtl w:val="0"/>
         </w:rPr>
-        <w:t xml:space="preserve">("on a accompagné X type de profil  -  est-ce que c'est un sujet pour vous, [enjeu spécifique] ?")</w:t>
+        <w:t xml:space="preserve">("on a accompagné X type de profil , est-ce que c'est un sujet pour vous, [enjeu spécifique] ?")</w:t>
       </w:r>
     </w:p>
     <w:p>
@@ -1433,7 +1433,7 @@
         <w:rPr>
           <w:rtl w:val="0"/>
         </w:rPr>
-        <w:t xml:space="preserve">Le premier message neutre sert un seul objectif : entrer dans l'inbox sans déclencher le filtre "prospection". On ne cherche pas à obtenir une réponse  -  on cherche à exister dans la conversation de manière désintéressée.</w:t>
+        <w:t xml:space="preserve">Le premier message neutre sert un seul objectif : entrer dans l'inbox sans déclencher le filtre "prospection". On ne cherche pas à obtenir une réponse , on cherche à exister dans la conversation de manière désintéressée.</w:t>
       </w:r>
     </w:p>
     <w:p>
@@ -1458,7 +1458,7 @@
         <w:rPr>
           <w:rtl w:val="0"/>
         </w:rPr>
-        <w:t xml:space="preserve">Le deuxième message diverge radicalement selon le chemin : dans l'entonnoir classique, on cherche à faire parler la personne  -  pas à collecter des informations, pas à qualifier, mais à créer une vraie dynamique conversationnelle où le prospect se livre naturellement. Ce n'est pas une phase vide, c'est une phase de mise en mouvement.</w:t>
+        <w:t xml:space="preserve">Le deuxième message diverge radicalement selon le chemin : dans l'entonnoir classique, on cherche à faire parler la personne , pas à collecter des informations, pas à qualifier, mais à créer une vraie dynamique conversationnelle où le prospect se livre naturellement. Ce n'est pas une phase vide, c'est une phase de mise en mouvement.</w:t>
       </w:r>
     </w:p>
     <w:p>
@@ -1483,7 +1483,7 @@
         <w:rPr>
           <w:rtl w:val="0"/>
         </w:rPr>
-        <w:t xml:space="preserve">Dans l'entonnoir inversé, le deuxième message a une fonction opposée : qualifier rapidement. Le profil corporate n'apprécie pas le warming progressif  -  la crédibilité (référence présentée) remplace le warming.</w:t>
+        <w:t xml:space="preserve">Dans l'entonnoir inversé, le deuxième message a une fonction opposée : qualifier rapidement. Le profil corporate n'apprécie pas le warming progressif , la crédibilité (référence présentée) remplace le warming.</w:t>
       </w:r>
     </w:p>
     <w:p>
@@ -1526,7 +1526,7 @@
           <w:szCs w:val="24"/>
           <w:rtl w:val="0"/>
         </w:rPr>
-        <w:t xml:space="preserve">PHASE 2  -  Transition / Focus</w:t>
+        <w:t xml:space="preserve">PHASE 2 , Transition / Focus</w:t>
       </w:r>
     </w:p>
     <w:p>
@@ -1577,7 +1577,7 @@
         <w:rPr>
           <w:rtl w:val="0"/>
         </w:rPr>
-        <w:t xml:space="preserve">Rester dans la curiosité sincère  -  sans signal de vente. Une question de transition construite en deux parties :</w:t>
+        <w:t xml:space="preserve">Rester dans la curiosité sincère , sans signal de vente. Une question de transition construite en deux parties :</w:t>
       </w:r>
     </w:p>
     <w:p>
@@ -1607,7 +1607,7 @@
         <w:rPr>
           <w:rtl w:val="0"/>
         </w:rPr>
-        <w:t xml:space="preserve"> (philosophie dégagée de plusieurs posts, section info, commentaires, stratégie globale visible  -  </w:t>
+        <w:t xml:space="preserve"> (philosophie dégagée de plusieurs posts, section info, commentaires, stratégie globale visible , </w:t>
       </w:r>
       <w:r>
         <w:rPr>
@@ -1668,7 +1668,7 @@
           <w:rFonts w:ascii="Arial Unicode MS" w:cs="Arial Unicode MS" w:eastAsia="Arial Unicode MS" w:hAnsi="Arial Unicode MS"/>
           <w:rtl w:val="0"/>
         </w:rPr>
-        <w:t xml:space="preserve">La Phase 2 prend la forme d'une question de qualification directe  -  la même que celle décrite en Phase 1 pour ce chemin. Elle remplace la question de transition de l'entonnoir classique. Si le prospect répond oui → Phase 3. Si non → on challenge (voir Bloc 6).</w:t>
+        <w:t xml:space="preserve">La Phase 2 prend la forme d'une question de qualification directe , la même que celle décrite en Phase 1 pour ce chemin. Elle remplace la question de transition de l'entonnoir classique. Si le prospect répond oui → Phase 3. Si non → on challenge (voir Bloc 6).</w:t>
       </w:r>
     </w:p>
     <w:p>
@@ -1726,7 +1726,7 @@
         <w:rPr>
           <w:rtl w:val="0"/>
         </w:rPr>
-        <w:t xml:space="preserve">La question en deux parties permet d'être à la fois personnalisé et naturel. Le premier élément  -  synthèse de la philosophie globale du prospect  -  montre qu'on a vraiment absorbé leur contenu, pas juste parcouru leur titre. La deuxième partie n'émet aucun signal de vente tout en ouvrant la porte aux enjeux réels.</w:t>
+        <w:t xml:space="preserve">La question en deux parties permet d'être à la fois personnalisé et naturel. Le premier élément , synthèse de la philosophie globale du prospect , montre qu'on a vraiment absorbé leur contenu, pas juste parcouru leur titre. La deuxième partie n'émet aucun signal de vente tout en ouvrant la porte aux enjeux réels.</w:t>
       </w:r>
     </w:p>
     <w:p>
@@ -1759,7 +1759,7 @@
         <w:rPr>
           <w:rtl w:val="0"/>
         </w:rPr>
-        <w:t xml:space="preserve">Le profil corporate n'a pas le temps et n'apprécie pas le warming progressif. Arriver avec une référence crédible + une question d'alignement directe, c'est respecter son mode de fonctionnement. Ce n'est pas un cas particulier  -  c'est simplement la variante 2, adaptée à ce profil.</w:t>
+        <w:t xml:space="preserve">Le profil corporate n'a pas le temps et n'apprécie pas le warming progressif. Arriver avec une référence crédible + une question d'alignement directe, c'est respecter son mode de fonctionnement. Ce n'est pas un cas particulier , c'est simplement la variante 2, adaptée à ce profil.</w:t>
       </w:r>
     </w:p>
     <w:p>
@@ -1834,7 +1834,7 @@
         <w:rPr>
           <w:rtl w:val="0"/>
         </w:rPr>
-        <w:t xml:space="preserve">  -  la philosophie qu'on a dégagée de l'ensemble de sa présence LinkedIn. Le test : le prospect doit se dire </w:t>
+        <w:t xml:space="preserve"> , la philosophie qu'on a dégagée de l'ensemble de sa présence LinkedIn. Le test : le prospect doit se dire </w:t>
       </w:r>
       <w:r>
         <w:rPr>
@@ -1848,7 +1848,7 @@
         <w:rPr>
           <w:rtl w:val="0"/>
         </w:rPr>
-        <w:t xml:space="preserve">  -  pas </w:t>
+        <w:t xml:space="preserve"> , pas </w:t>
       </w:r>
       <w:r>
         <w:rPr>
@@ -1889,7 +1889,7 @@
         <w:rPr>
           <w:rtl w:val="0"/>
         </w:rPr>
-        <w:t xml:space="preserve">Citer un post signale une prospection rapide et superficielle. Arriver avec une synthèse de plusieurs posts, de la section info et des commentaires signale qu'on a vraiment pris le temps. C'est cette différence qui crée l'effet "il a vraiment compris ma philosophie"  -  et c'est cet effet qu'on cherche.</w:t>
+        <w:t xml:space="preserve">Citer un post signale une prospection rapide et superficielle. Arriver avec une synthèse de plusieurs posts, de la section info et des commentaires signale qu'on a vraiment pris le temps. C'est cette différence qui crée l'effet "il a vraiment compris ma philosophie" , et c'est cet effet qu'on cherche.</w:t>
       </w:r>
     </w:p>
     <w:p>
@@ -1932,7 +1932,7 @@
           <w:szCs w:val="24"/>
           <w:rtl w:val="0"/>
         </w:rPr>
-        <w:t xml:space="preserve">PHASE 3  -  Profondeur / Qualification</w:t>
+        <w:t xml:space="preserve">PHASE 3 , Profondeur / Qualification</w:t>
       </w:r>
     </w:p>
     <w:p>
@@ -1951,7 +1951,7 @@
           <w:color w:val="444444"/>
           <w:rtl w:val="0"/>
         </w:rPr>
-        <w:t xml:space="preserve">Point de convergence des deux chemins  -  avec des nuances.</w:t>
+        <w:t xml:space="preserve">Point de convergence des deux chemins , avec des nuances.</w:t>
       </w:r>
     </w:p>
     <w:p>
@@ -2104,7 +2104,7 @@
         <w:rPr>
           <w:rtl w:val="0"/>
         </w:rPr>
-        <w:t xml:space="preserve">C'est seulement en Phase 3  -  une fois le contexte posé  -  qu'on peut creuser réellement sans que ça paraisse intrusif. Le prospect a déjà répondu plusieurs fois. Il est engagé. Les questions de fond à ce stade sont perçues comme la continuation naturelle d'une vraie conversation.</w:t>
+        <w:t xml:space="preserve">C'est seulement en Phase 3 , une fois le contexte posé , qu'on peut creuser réellement sans que ça paraisse intrusif. Le prospect a déjà répondu plusieurs fois. Il est engagé. Les questions de fond à ce stade sont perçues comme la continuation naturelle d'une vraie conversation.</w:t>
       </w:r>
     </w:p>
     <w:p>
@@ -2221,7 +2221,7 @@
         <w:rPr>
           <w:rtl w:val="0"/>
         </w:rPr>
-        <w:t xml:space="preserve"> Le prospect a répondu à la question ouverte du deuxième message avec un contenu verbal  -  il a commencé à parler de lui, de son parcours, de son activité.</w:t>
+        <w:t xml:space="preserve"> Le prospect a répondu à la question ouverte du deuxième message avec un contenu verbal , il a commencé à parler de lui, de son parcours, de son activité.</w:t>
       </w:r>
     </w:p>
     <w:p>
@@ -2252,7 +2252,7 @@
         <w:rPr>
           <w:rtl w:val="0"/>
         </w:rPr>
-        <w:t xml:space="preserve">Pas une règle arbitraire de nombre de messages  -  c'est la dynamique de la conversation en face.</w:t>
+        <w:t xml:space="preserve">Pas une règle arbitraire de nombre de messages , c'est la dynamique de la conversation en face.</w:t>
       </w:r>
     </w:p>
     <w:p>
@@ -2508,7 +2508,7 @@
           <w:color w:val="444444"/>
           <w:rtl w:val="0"/>
         </w:rPr>
-        <w:t xml:space="preserve">Note : la gestion des relances si le prospect ne répond pas à ce stade est traitée séparément  -  Bloc 7.</w:t>
+        <w:t xml:space="preserve">Note : la gestion des relances si le prospect ne répond pas à ce stade est traitée séparément , Bloc 7.</w:t>
       </w:r>
     </w:p>
     <w:p>
@@ -2541,7 +2541,7 @@
         <w:rPr>
           <w:rtl w:val="0"/>
         </w:rPr>
-        <w:t xml:space="preserve">Passer en Phase 3 trop tôt = brûler la relation avant qu'elle soit vraiment installée. Passer trop tard = conversations superficielles qui n'avancent jamais. Le signal d'enjeu dans la réponse du prospect est le vrai déclencheur  -  pas le nombre de messages.</w:t>
+        <w:t xml:space="preserve">Passer en Phase 3 trop tôt = brûler la relation avant qu'elle soit vraiment installée. Passer trop tard = conversations superficielles qui n'avancent jamais. Le signal d'enjeu dans la réponse du prospect est le vrai déclencheur , pas le nombre de messages.</w:t>
       </w:r>
     </w:p>
     <w:p>
@@ -2613,7 +2613,7 @@
           <w:szCs w:val="24"/>
           <w:rtl w:val="0"/>
         </w:rPr>
-        <w:t xml:space="preserve">CAS A  -  Après échanges en commentaire sous un post du prospect</w:t>
+        <w:t xml:space="preserve">CAS A , Après échanges en commentaire sous un post du prospect</w:t>
       </w:r>
       <w:r/>
       <w:r/>
@@ -2675,7 +2675,7 @@
         <w:rPr>
           <w:rtl w:val="0"/>
         </w:rPr>
-        <w:t xml:space="preserve">Envoyer un DM qui s'appuie directement sur ce qui a été dit dans les commentaires  -  pas de message neutre "enchanté", ce contexte commun existe déjà</w:t>
+        <w:t xml:space="preserve">Envoyer un DM qui s'appuie directement sur ce qui a été dit dans les commentaires , pas de message neutre "enchanté", ce contexte commun existe déjà</w:t>
       </w:r>
     </w:p>
     <w:p>
@@ -2740,7 +2740,7 @@
         <w:rPr>
           <w:rtl w:val="0"/>
         </w:rPr>
-        <w:t xml:space="preserve">Il y a déjà une conversation  -  l'utiliser comme point d'entrée dans le DM est la chose la plus naturelle possible. Ça ne ressemble pas à de la prospection : ça ressemble à la suite logique d'un échange qui existait déjà. Repartir de zéro avec "enchanté" sonnerait faux et gâcherait le terrain déjà construit.</w:t>
+        <w:t xml:space="preserve">Il y a déjà une conversation , l'utiliser comme point d'entrée dans le DM est la chose la plus naturelle possible. Ça ne ressemble pas à de la prospection : ça ressemble à la suite logique d'un échange qui existait déjà. Repartir de zéro avec "enchanté" sonnerait faux et gâcherait le terrain déjà construit.</w:t>
       </w:r>
     </w:p>
     <w:p>
@@ -2783,7 +2783,7 @@
           <w:szCs w:val="24"/>
           <w:rtl w:val="0"/>
         </w:rPr>
-        <w:t xml:space="preserve">CAS B  -  Outbound (contact à froid après connexion acceptée)</w:t>
+        <w:t xml:space="preserve">CAS B , Outbound (contact à froid après connexion acceptée)</w:t>
       </w:r>
     </w:p>
     <w:p>
@@ -2814,7 +2814,7 @@
           <w:u w:val="single"/>
           <w:rtl w:val="0"/>
         </w:rPr>
-        <w:t xml:space="preserve">Message 1  -  Désintérêt affiché</w:t>
+        <w:t xml:space="preserve">Message 1 , Désintérêt affiché</w:t>
       </w:r>
     </w:p>
     <w:p>
@@ -2911,7 +2911,7 @@
         <w:rPr>
           <w:rtl w:val="0"/>
         </w:rPr>
-        <w:t xml:space="preserve">L'objectif de ce message n'est pas d'obtenir une réponse. C'est d'entrer dans l'inbox de manière désintéressée  -  exister dans la conversation sans donner l'impression qu'on va essayer de vendre quelque chose.</w:t>
+        <w:t xml:space="preserve">L'objectif de ce message n'est pas d'obtenir une réponse. C'est d'entrer dans l'inbox de manière désintéressée , exister dans la conversation sans donner l'impression qu'on va essayer de vendre quelque chose.</w:t>
       </w:r>
     </w:p>
     <w:p>
@@ -2963,7 +2963,7 @@
         <w:rPr>
           <w:rtl w:val="0"/>
         </w:rPr>
-        <w:t xml:space="preserve">Un message avec une question  -  même ultra-personnalisée  -  déclenche le pattern de prospection. Le prospect voit un "pavé", son filtre s'active avant d'avoir lu. Un message neutre envoie le signal inverse : pas de vente en vue, pas de danger.</w:t>
+        <w:t xml:space="preserve">Un message avec une question , même ultra-personnalisée , déclenche le pattern de prospection. Le prospect voit un "pavé", son filtre s'active avant d'avoir lu. Un message neutre envoie le signal inverse : pas de vente en vue, pas de danger.</w:t>
       </w:r>
     </w:p>
     <w:p>
@@ -2996,7 +2996,7 @@
         <w:rPr>
           <w:rtl w:val="0"/>
         </w:rPr>
-        <w:t xml:space="preserve"> si on met la question dans le premier message et qu'on n'obtient pas de réponse, on est dans une position délicate pour relancer. En séparant les deux messages, ce problème disparaît. La question arrive toujours en message 2  -  que le prospect ait répondu au premier ou non.</w:t>
+        <w:t xml:space="preserve"> si on met la question dans le premier message et qu'on n'obtient pas de réponse, on est dans une position délicate pour relancer. En séparant les deux messages, ce problème disparaît. La question arrive toujours en message 2 , que le prospect ait répondu au premier ou non.</w:t>
       </w:r>
     </w:p>
     <w:p>
@@ -3015,7 +3015,7 @@
           <w:u w:val="single"/>
           <w:rtl w:val="0"/>
         </w:rPr>
-        <w:t xml:space="preserve">Message 2  -  </w:t>
+        <w:t xml:space="preserve">Message 2 , </w:t>
       </w:r>
       <w:r>
         <w:rPr>
@@ -3078,7 +3078,7 @@
         <w:rPr>
           <w:rtl w:val="0"/>
         </w:rPr>
-        <w:t xml:space="preserve">Une question ultra-spécifique dérivée de la synthèse profonde du profil (plusieurs posts, section info, commentaires, stratégie globale visible)  -  montrant qu'on a compris la philosophie et l'enjeu réel du prospect, pas juste lu son titre LinkedIn.</w:t>
+        <w:t xml:space="preserve">Une question ultra-spécifique dérivée de la synthèse profonde du profil (plusieurs posts, section info, commentaires, stratégie globale visible) , montrant qu'on a compris la philosophie et l'enjeu réel du prospect, pas juste lu son titre LinkedIn.</w:t>
         <w:br w:type="textWrapping"/>
       </w:r>
       <w:r>
@@ -3093,7 +3093,7 @@
         <w:rPr>
           <w:rtl w:val="0"/>
         </w:rPr>
-        <w:t xml:space="preserve"> suivie d'un storytelling ou d'une justification courte (voir Bloc 3  -  histoires personnelles).</w:t>
+        <w:t xml:space="preserve"> suivie d'un storytelling ou d'une justification courte (voir Bloc 3 , histoires personnelles).</w:t>
       </w:r>
     </w:p>
     <w:p>
@@ -3148,7 +3148,7 @@
         <w:rPr>
           <w:rtl w:val="0"/>
         </w:rPr>
-        <w:t xml:space="preserve">L'élément personnalisé en ouverture montre qu'on a vraiment absorbé leur contenu avant de poser la question. Génère des réponses longues  -  signe d'engagement fort.</w:t>
+        <w:t xml:space="preserve">L'élément personnalisé en ouverture montre qu'on a vraiment absorbé leur contenu avant de poser la question. Génère des réponses longues , signe d'engagement fort.</w:t>
       </w:r>
     </w:p>
     <w:p>
@@ -3171,7 +3171,7 @@
         </w:rPr>
         <w:t xml:space="preserve"> Élément personnalisé profond + question sur l'enjeu spécifique et profond du métier du prospect.</w:t>
         <w:br w:type="textWrapping"/>
-        <w:t xml:space="preserve">Pas le point de douleur superficiel  -  l'enjeu précis et concret, formulé avec suffisamment de profondeur pour que le prospect se dise </w:t>
+        <w:t xml:space="preserve">Pas le point de douleur superficiel , l'enjeu précis et concret, formulé avec suffisamment de profondeur pour que le prospect se dise </w:t>
       </w:r>
       <w:r>
         <w:rPr>
@@ -3202,7 +3202,7 @@
         <w:rPr>
           <w:rtl w:val="0"/>
         </w:rPr>
-        <w:t xml:space="preserve">  -  accroche immédiate.</w:t>
+        <w:t xml:space="preserve"> , accroche immédiate.</w:t>
       </w:r>
     </w:p>
     <w:p>
@@ -3235,7 +3235,7 @@
         <w:rPr>
           <w:rtl w:val="0"/>
         </w:rPr>
-        <w:t xml:space="preserve">La variante A est fiable  -  le parcours est un sujet sur lequel les indépendants aiment parler, elle génère de l'engagement. La variante B, si elle tape le vrai enjeu profond, crée une accroche bien supérieure. On ne sait pas encore laquelle convertit mieux à grande échelle  -  le test permet de décider avec de la data, pas au feeling.</w:t>
+        <w:t xml:space="preserve">La variante A est fiable , le parcours est un sujet sur lequel les indépendants aiment parler, elle génère de l'engagement. La variante B, si elle tape le vrai enjeu profond, crée une accroche bien supérieure. On ne sait pas encore laquelle convertit mieux à grande échelle , le test permet de décider avec de la data, pas au feeling.</w:t>
       </w:r>
     </w:p>
     <w:p>
@@ -3278,7 +3278,7 @@
           <w:szCs w:val="24"/>
           <w:rtl w:val="0"/>
         </w:rPr>
-        <w:t xml:space="preserve">CAS C  -  Demande de connexion entrante</w:t>
+        <w:t xml:space="preserve">CAS C , Demande de connexion entrante</w:t>
       </w:r>
     </w:p>
     <w:p>
@@ -3290,7 +3290,7 @@
         <w:rPr>
           <w:rtl w:val="0"/>
         </w:rPr>
-        <w:t xml:space="preserve">Le prospect a envoyé la demande de connexion. Signal d'intérêt actif  -  il a pris l'initiative.</w:t>
+        <w:t xml:space="preserve">Le prospect a envoyé la demande de connexion. Signal d'intérêt actif , il a pris l'initiative.</w:t>
       </w:r>
     </w:p>
     <w:p>
@@ -3321,7 +3321,7 @@
         <w:rPr>
           <w:rtl w:val="0"/>
         </w:rPr>
-        <w:t xml:space="preserve">Une fois la connexion acceptée, aller directement avec une question personnalisée  -  pas de message neutre "enchanté" (le prospect a pris l'initiative, le contexte est différent). Mêmes variantes A/B que CAS B sur le contenu de la question.</w:t>
+        <w:t xml:space="preserve">Une fois la connexion acceptée, aller directement avec une question personnalisée , pas de message neutre "enchanté" (le prospect a pris l'initiative, le contexte est différent). Mêmes variantes A/B que CAS B sur le contenu de la question.</w:t>
       </w:r>
     </w:p>
     <w:p>
@@ -3354,7 +3354,7 @@
         <w:rPr>
           <w:rtl w:val="0"/>
         </w:rPr>
-        <w:t xml:space="preserve">Le prospect a fait le premier pas  -  il y a déjà une ouverture. Lui renvoyer un "enchanté" perd cette dynamique. Aller directement avec une question personnalisée respecte l'élan qu'il a lui-même créé.</w:t>
+        <w:t xml:space="preserve">Le prospect a fait le premier pas , il y a déjà une ouverture. Lui renvoyer un "enchanté" perd cette dynamique. Aller directement avec une question personnalisée respecte l'élan qu'il a lui-même créé.</w:t>
       </w:r>
     </w:p>
     <w:p>
@@ -3397,7 +3397,7 @@
           <w:szCs w:val="24"/>
           <w:rtl w:val="0"/>
         </w:rPr>
-        <w:t xml:space="preserve">CAS D  -  Visiteur de profil</w:t>
+        <w:t xml:space="preserve">CAS D , Visiteur de profil</w:t>
       </w:r>
     </w:p>
     <w:p>
@@ -3461,7 +3461,7 @@
         <w:rPr>
           <w:rtl w:val="0"/>
         </w:rPr>
-        <w:t xml:space="preserve">La seule distinction avec CAS B : le prospect est venu de lui-même plutôt qu'on l'ait trouvé dans des likes ou commentaires. Ce signal est une opportunité d'initier le contact  -  mais il ne change pas la mécanique d'ouverture.</w:t>
+        <w:t xml:space="preserve">La seule distinction avec CAS B : le prospect est venu de lui-même plutôt qu'on l'ait trouvé dans des likes ou commentaires. Ce signal est une opportunité d'initier le contact , mais il ne change pas la mécanique d'ouverture.</w:t>
       </w:r>
     </w:p>
     <w:p>
@@ -3494,7 +3494,7 @@
         <w:rPr>
           <w:rtl w:val="0"/>
         </w:rPr>
-        <w:t xml:space="preserve">Mentionner la visite de profil peut paraître intrusif. Les gens visitent des profils par curiosité  -  pas nécessairement par intérêt commercial. Signaler qu'on l'a remarqué peut créer un malaise : LinkedIn permet de voir qui visite, mais les gens n'aiment pas que ça soit utilisé explicitement contre eux. L'approche neutre reste la plus propre  -  elle ne sur-interprète pas un signal qui n'est peut-être qu'une curiosité passagère.</w:t>
+        <w:t xml:space="preserve">Mentionner la visite de profil peut paraître intrusif. Les gens visitent des profils par curiosité , pas nécessairement par intérêt commercial. Signaler qu'on l'a remarqué peut créer un malaise : LinkedIn permet de voir qui visite, mais les gens n'aiment pas que ça soit utilisé explicitement contre eux. L'approche neutre reste la plus propre , elle ne sur-interprète pas un signal qui n'est peut-être qu'une curiosité passagère.</w:t>
       </w:r>
     </w:p>
     <w:p>
@@ -3764,7 +3764,7 @@
         <w:rPr>
           <w:rtl w:val="0"/>
         </w:rPr>
-        <w:t xml:space="preserve"> Un profil "non conversationnel". Les deux entonnoirs restent conversationnels  -  voir nuance centrale ci-dessous.</w:t>
+        <w:t xml:space="preserve"> Un profil "non conversationnel". Les deux entonnoirs restent conversationnels , voir nuance centrale ci-dessous.</w:t>
       </w:r>
     </w:p>
     <w:p>
@@ -3910,7 +3910,7 @@
         <w:rPr>
           <w:rtl w:val="0"/>
         </w:rPr>
-        <w:t xml:space="preserve"> Profil (toutes niches) très exposé à la prospection LinkedIn  -  qui reconnaît et filtre instantanément les patterns habituels de prospection. L'ultra-personnalisation est le minimum requis pour passer ce filtre.</w:t>
+        <w:t xml:space="preserve"> Profil (toutes niches) très exposé à la prospection LinkedIn , qui reconnaît et filtre instantanément les patterns habituels de prospection. L'ultra-personnalisation est le minimum requis pour passer ce filtre.</w:t>
       </w:r>
     </w:p>
     <w:p>
@@ -3930,7 +3930,7 @@
         <w:rPr>
           <w:rtl w:val="0"/>
         </w:rPr>
-        <w:t xml:space="preserve">  -  c'est une couche qui peut se superposer à n'importe quel autre archétype.</w:t>
+        <w:t xml:space="preserve"> , c'est une couche qui peut se superposer à n'importe quel autre archétype.</w:t>
       </w:r>
     </w:p>
     <w:p>
@@ -4059,7 +4059,7 @@
           <w:szCs w:val="32"/>
           <w:rtl w:val="0"/>
         </w:rPr>
-        <w:t xml:space="preserve">BLOC 2  -  PROFILS PERSONNALITÉ</w:t>
+        <w:t xml:space="preserve">BLOC 2 , PROFILS PERSONNALITÉ</w:t>
       </w:r>
       <w:r/>
       <w:r>
@@ -4125,7 +4125,7 @@
           <w:bCs w:val="1"/>
           <w:rtl w:val="0"/>
         </w:rPr>
-        <w:t xml:space="preserve">L'analyse du profil est la première chose que l'IA fait  -  avant d'initier ou de répondre à la moindre conversation.</w:t>
+        <w:t xml:space="preserve">L'analyse du profil est la première chose que l'IA fait , avant d'initier ou de répondre à la moindre conversation.</w:t>
       </w:r>
     </w:p>
     <w:p>
@@ -4213,7 +4213,7 @@
           <w:szCs w:val="26"/>
           <w:rtl w:val="0"/>
         </w:rPr>
-        <w:t xml:space="preserve">NUANCE CENTRALE  -  LES DEUX ENTONNOIRS SONT CONVERSATIONNELS</w:t>
+        <w:t xml:space="preserve">NUANCE CENTRALE , LES DEUX ENTONNOIRS SONT CONVERSATIONNELS</w:t>
       </w:r>
     </w:p>
     <w:p>
@@ -4269,7 +4269,7 @@
         <w:rPr>
           <w:rtl w:val="0"/>
         </w:rPr>
-        <w:t xml:space="preserve">Ce qui diffère entre les deux entonnoirs, c'est uniquement l'entrée  -  la nature du deuxième message :</w:t>
+        <w:t xml:space="preserve">Ce qui diffère entre les deux entonnoirs, c'est uniquement l'entrée , la nature du deuxième message :</w:t>
       </w:r>
     </w:p>
     <w:p>
@@ -4365,7 +4365,7 @@
           <w:rFonts w:ascii="Arial Unicode MS" w:cs="Arial Unicode MS" w:eastAsia="Arial Unicode MS" w:hAnsi="Arial Unicode MS"/>
           <w:rtl w:val="0"/>
         </w:rPr>
-        <w:t xml:space="preserve">Le risque de mal interpréter ces termes : traiter l'entonnoir inversé comme une séquence froide de 3 échanges → qualification → terminé. Ce n'est pas ça. Même avec un profil corporate ou transactionnel, une fois l'alignement confirmé, une vraie conversation s'ouvre. Les spécificités de cette conversation (ton, questions, histoires personnelles) diffèrent selon le profil  -  mais elle existe dans tous les cas.</w:t>
+        <w:t xml:space="preserve">Le risque de mal interpréter ces termes : traiter l'entonnoir inversé comme une séquence froide de 3 échanges → qualification → terminé. Ce n'est pas ça. Même avec un profil corporate ou transactionnel, une fois l'alignement confirmé, une vraie conversation s'ouvre. Les spécificités de cette conversation (ton, questions, histoires personnelles) diffèrent selon le profil , mais elle existe dans tous les cas.</w:t>
       </w:r>
     </w:p>
     <w:p>
@@ -4439,7 +4439,7 @@
           <w:u w:val="single"/>
           <w:rtl w:val="0"/>
         </w:rPr>
-        <w:t xml:space="preserve">Couche 1  -  Analyse du profil LinkedIn (avant la conversation)</w:t>
+        <w:t xml:space="preserve">Couche 1 , Analyse du profil LinkedIn (avant la conversation)</w:t>
       </w:r>
     </w:p>
     <w:p>
@@ -4531,7 +4531,7 @@
         <w:rPr>
           <w:rtl w:val="0"/>
         </w:rPr>
-        <w:t xml:space="preserve">Le genre (signal statistique  -  pas une règle absolue, mais un indicateur parmi d'autres)</w:t>
+        <w:t xml:space="preserve">Le genre (signal statistique , pas une règle absolue, mais un indicateur parmi d'autres)</w:t>
       </w:r>
     </w:p>
     <w:p>
@@ -4550,7 +4550,7 @@
           <w:u w:val="single"/>
           <w:rtl w:val="0"/>
         </w:rPr>
-        <w:t xml:space="preserve">Couche 2  -  Signaux en DM (pendant la conversation)</w:t>
+        <w:t xml:space="preserve">Couche 2 , Signaux en DM (pendant la conversation)</w:t>
       </w:r>
     </w:p>
     <w:p>
@@ -4562,7 +4562,7 @@
         <w:rPr>
           <w:rtl w:val="0"/>
         </w:rPr>
-        <w:t xml:space="preserve">L'évaluation initiale est une hypothèse  -  elle se confirme ou se corrige au fil des réponses. On ne se base pas sur la réponse au premier message ("enchanté" ou équivalent) : ce n'est pas son objectif de livrer un signal de profil. Le vrai signal se lit dans la réponse au deuxième message  -  la première vraie question.</w:t>
+        <w:t xml:space="preserve">L'évaluation initiale est une hypothèse , elle se confirme ou se corrige au fil des réponses. On ne se base pas sur la réponse au premier message ("enchanté" ou équivalent) : ce n'est pas son objectif de livrer un signal de profil. Le vrai signal se lit dans la réponse au deuxième message , la première vraie question.</w:t>
       </w:r>
     </w:p>
     <w:p>
@@ -4595,7 +4595,7 @@
         <w:rPr>
           <w:rtl w:val="0"/>
         </w:rPr>
-        <w:t xml:space="preserve">L'analyse du profil donne une direction de départ, pas une certitude. Certains profils qui semblent conversationnels répondent de manière très directe en DM. D'autres qui semblent fermés s'ouvrent facilement. L'analyse du profil reste utile comme premier statut  -  mais la conversation est la vraie donnée.</w:t>
+        <w:t xml:space="preserve">L'analyse du profil donne une direction de départ, pas une certitude. Certains profils qui semblent conversationnels répondent de manière très directe en DM. D'autres qui semblent fermés s'ouvrent facilement. L'analyse du profil reste utile comme premier statut , mais la conversation est la vraie donnée.</w:t>
       </w:r>
     </w:p>
     <w:p>
@@ -4670,7 +4670,7 @@
           <w:iCs w:val="1"/>
           <w:rtl w:val="0"/>
         </w:rPr>
-        <w:t xml:space="preserve">Ces signaux sont des indicateurs  -  pas des règles absolues. Un profil peut cumuler tous les signaux d'un type et se comporter différemment en DM. L'analyse du profil donne une hypothèse de départ. La conversation confirme ou corrige.</w:t>
+        <w:t xml:space="preserve">Ces signaux sont des indicateurs , pas des règles absolues. Un profil peut cumuler tous les signaux d'un type et se comporter différemment en DM. L'analyse du profil donne une hypothèse de départ. La conversation confirme ou corrige.</w:t>
       </w:r>
     </w:p>
     <w:p>
@@ -4794,7 +4794,7 @@
         <w:rPr>
           <w:rtl w:val="0"/>
         </w:rPr>
-        <w:t xml:space="preserve">2 ans et plus  -  a vu beaucoup de prospection, connaît les patterns.</w:t>
+        <w:t xml:space="preserve">2 ans et plus , a vu beaucoup de prospection, connaît les patterns.</w:t>
       </w:r>
       <w:r/>
       <w:r>
@@ -4855,7 +4855,7 @@
         <w:rPr>
           <w:rtl w:val="0"/>
         </w:rPr>
-        <w:t xml:space="preserve">Souvent masculin. Dans 80 à 90 % des cas, les hommes répondent mieux à l'entonnoir inversé  -  moins réceptifs aux approches conversationnelles longues. Environ 1 homme sur 10 aime l'humour, le second degré, le storytelling et préfère le conversationnel. Ce signal reste indicatif  -  pas absolu.</w:t>
+        <w:t xml:space="preserve">Souvent masculin. Dans 80 à 90 % des cas, les hommes répondent mieux à l'entonnoir inversé , moins réceptifs aux approches conversationnelles longues. Environ 1 homme sur 10 aime l'humour, le second degré, le storytelling et préfère le conversationnel. Ce signal reste indicatif , pas absolu.</w:t>
       </w:r>
     </w:p>
     <w:p>
@@ -5090,7 +5090,7 @@
         <w:rPr>
           <w:rtl w:val="0"/>
         </w:rPr>
-        <w:t xml:space="preserve">0 à 18 mois  -  moins exposée à la prospection, moins méfiante. Au-delà de 2 ans, la personne a surmonté les premières difficultés, a probablement été accompagnée, et est donc plus avertie  -  mais peut rester conversationnelle si l'approche sort des patterns.</w:t>
+        <w:t xml:space="preserve">0 à 18 mois , moins exposée à la prospection, moins méfiante. Au-delà de 2 ans, la personne a surmonté les premières difficultés, a probablement été accompagnée, et est donc plus avertie , mais peut rester conversationnelle si l'approche sort des patterns.</w:t>
       </w:r>
     </w:p>
     <w:p>
@@ -5141,7 +5141,7 @@
         <w:rPr>
           <w:rtl w:val="0"/>
         </w:rPr>
-        <w:t xml:space="preserve">Souvent féminin  -  statistiquement plus réceptif en DM aux approches conversationnelles. Pas une règle absolue.</w:t>
+        <w:t xml:space="preserve">Souvent féminin , statistiquement plus réceptif en DM aux approches conversationnelles. Pas une règle absolue.</w:t>
       </w:r>
     </w:p>
     <w:p>
@@ -5249,7 +5249,7 @@
           <w:szCs w:val="24"/>
           <w:rtl w:val="0"/>
         </w:rPr>
-        <w:t xml:space="preserve">ARCHÉTYPE 1  -  La freelance débutante</w:t>
+        <w:t xml:space="preserve">ARCHÉTYPE 1 , La freelance débutante</w:t>
       </w:r>
     </w:p>
     <w:p>
@@ -5349,7 +5349,7 @@
         <w:rPr>
           <w:rtl w:val="0"/>
         </w:rPr>
-        <w:t xml:space="preserve"> Oui  -  bienvenues et efficaces.</w:t>
+        <w:t xml:space="preserve"> Oui , bienvenues et efficaces.</w:t>
       </w:r>
     </w:p>
     <w:p>
@@ -5412,7 +5412,7 @@
           <w:szCs w:val="24"/>
           <w:rtl w:val="0"/>
         </w:rPr>
-        <w:t xml:space="preserve">ARCHÉTYPE 2  -  Le/la freelance expérimenté(e)</w:t>
+        <w:t xml:space="preserve">ARCHÉTYPE 2 , Le/la freelance expérimenté(e)</w:t>
       </w:r>
     </w:p>
     <w:p>
@@ -5512,7 +5512,7 @@
         <w:rPr>
           <w:rtl w:val="0"/>
         </w:rPr>
-        <w:t xml:space="preserve"> Rare  -  uniquement sur signal fort.</w:t>
+        <w:t xml:space="preserve"> Rare , uniquement sur signal fort.</w:t>
       </w:r>
     </w:p>
     <w:p>
@@ -5575,7 +5575,7 @@
           <w:szCs w:val="24"/>
           <w:rtl w:val="0"/>
         </w:rPr>
-        <w:t xml:space="preserve">ARCHÉTYPE 3  -  Le coach / consultant(e)</w:t>
+        <w:t xml:space="preserve">ARCHÉTYPE 3 , Le coach / consultant(e)</w:t>
       </w:r>
     </w:p>
     <w:p>
@@ -5615,7 +5615,7 @@
         <w:rPr>
           <w:rtl w:val="0"/>
         </w:rPr>
-        <w:t xml:space="preserve"> Conversationnel  -  à condition que l'approche soit tellement précise et profonde qu'elle ne ressemble à aucune prospection déjà reçue.</w:t>
+        <w:t xml:space="preserve"> Conversationnel , à condition que l'approche soit tellement précise et profonde qu'elle ne ressemble à aucune prospection déjà reçue.</w:t>
       </w:r>
     </w:p>
     <w:p>
@@ -5647,7 +5647,7 @@
         <w:rPr>
           <w:rtl w:val="0"/>
         </w:rPr>
-        <w:t xml:space="preserve">La question du deuxième message doit toucher quelque chose que le coach n'a pas encore totalement formulé lui-même  -  sa philosophie profonde, un enjeu central de sa pratique. Si cette condition est remplie, l'entonnoir classique fonctionne. Si la question est trop générique ou trop visible comme prospection, la porte se ferme immédiatement.</w:t>
+        <w:t xml:space="preserve">La question du deuxième message doit toucher quelque chose que le coach n'a pas encore totalement formulé lui-même , sa philosophie profonde, un enjeu central de sa pratique. Si cette condition est remplie, l'entonnoir classique fonctionne. Si la question est trop générique ou trop visible comme prospection, la porte se ferme immédiatement.</w:t>
       </w:r>
     </w:p>
     <w:p>
@@ -5730,7 +5730,7 @@
           <w:szCs w:val="24"/>
           <w:rtl w:val="0"/>
         </w:rPr>
-        <w:t xml:space="preserve">ARCHÉTYPE 4  -  Le corporate / décideur</w:t>
+        <w:t xml:space="preserve">ARCHÉTYPE 4 , Le corporate / décideur</w:t>
       </w:r>
     </w:p>
     <w:p>
@@ -5841,7 +5841,7 @@
         <w:rPr>
           <w:rtl w:val="0"/>
         </w:rPr>
-        <w:t xml:space="preserve">L'entonnoir inversé ne signifie pas une conversation réduite. Une fois l'alignement confirmé, une vraie conversation s'ouvre. Ce qui change, c'est uniquement l'entrée  -  pas la profondeur. Certains décideurs ont un personal branding actif, font du storytelling, apprécient l'échange humain. Ça ne change pas le chemin d'entrée, mais ça informe la tonalité de la Phase 3.</w:t>
+        <w:t xml:space="preserve">L'entonnoir inversé ne signifie pas une conversation réduite. Une fois l'alignement confirmé, une vraie conversation s'ouvre. Ce qui change, c'est uniquement l'entrée , pas la profondeur. Certains décideurs ont un personal branding actif, font du storytelling, apprécient l'échange humain. Ça ne change pas le chemin d'entrée, mais ça informe la tonalité de la Phase 3.</w:t>
       </w:r>
     </w:p>
     <w:p>
@@ -5861,7 +5861,7 @@
         <w:rPr>
           <w:rtl w:val="0"/>
         </w:rPr>
-        <w:t xml:space="preserve"> Occasionnel  -  selon les signaux du profil (personal branding présent ou absent).</w:t>
+        <w:t xml:space="preserve"> Occasionnel , selon les signaux du profil (personal branding présent ou absent).</w:t>
       </w:r>
     </w:p>
     <w:p>
@@ -5924,7 +5924,7 @@
           <w:szCs w:val="24"/>
           <w:rtl w:val="0"/>
         </w:rPr>
-        <w:t xml:space="preserve">ARCHÉTYPE 5  -  Le fondateur / builder</w:t>
+        <w:t xml:space="preserve">ARCHÉTYPE 5 , Le fondateur / builder</w:t>
       </w:r>
     </w:p>
     <w:p>
@@ -6101,7 +6101,7 @@
           <w:szCs w:val="24"/>
           <w:rtl w:val="0"/>
         </w:rPr>
-        <w:t xml:space="preserve">ARCHÉTYPE 6  -  Le prospect averti  </w:t>
+        <w:t xml:space="preserve">ARCHÉTYPE 6 , Le prospect averti  </w:t>
       </w:r>
       <w:r>
         <w:rPr>
@@ -6124,7 +6124,7 @@
         <w:rPr>
           <w:rtl w:val="0"/>
         </w:rPr>
-        <w:t xml:space="preserve">Il ne s'agit pas d'un archétype isolé. C'est une couche qui se superpose à n'importe quel autre archétype. Un prospect averti, c'est quelqu'un habitué à être prospecté sur LinkedIn  -  qui reconnaît et filtre instantanément les patterns habituels.</w:t>
+        <w:t xml:space="preserve">Il ne s'agit pas d'un archétype isolé. C'est une couche qui se superpose à n'importe quel autre archétype. Un prospect averti, c'est quelqu'un habitué à être prospecté sur LinkedIn , qui reconnaît et filtre instantanément les patterns habituels.</w:t>
       </w:r>
     </w:p>
     <w:p>
@@ -6254,7 +6254,7 @@
         <w:rPr>
           <w:rtl w:val="0"/>
         </w:rPr>
-        <w:t xml:space="preserve">L'ultra-personnalisation n'est plus un avantage  -  c'est le minimum requis. Un message qui ressemble à de la prospection, même légèrement, est immédiatement filtré. L'approche doit être tellement précise et profonde qu'elle ne peut pas venir de quelqu'un qui prospecte en masse.</w:t>
+        <w:t xml:space="preserve">L'ultra-personnalisation n'est plus un avantage , c'est le minimum requis. Un message qui ressemble à de la prospection, même légèrement, est immédiatement filtré. L'approche doit être tellement précise et profonde qu'elle ne peut pas venir de quelqu'un qui prospecte en masse.</w:t>
       </w:r>
     </w:p>
     <w:p>
@@ -7002,7 +7002,7 @@
                 <w:szCs w:val="20"/>
                 <w:rtl w:val="0"/>
               </w:rPr>
-              <w:t xml:space="preserve">Conversationnel  -  s'appuie sur ce qui a été partagé</w:t>
+              <w:t xml:space="preserve">Conversationnel , s'appuie sur ce qui a été partagé</w:t>
             </w:r>
             <w:r>
               <w:rPr>
@@ -7039,7 +7039,7 @@
                 <w:szCs w:val="20"/>
                 <w:rtl w:val="0"/>
               </w:rPr>
-              <w:t xml:space="preserve">Conversationnel  -  s'appuie sur l'alignement confirmé</w:t>
+              <w:t xml:space="preserve">Conversationnel , s'appuie sur l'alignement confirmé</w:t>
             </w:r>
             <w:r>
               <w:rPr>
@@ -7170,7 +7170,7 @@
         <w:rPr>
           <w:rtl w:val="0"/>
         </w:rPr>
-        <w:t xml:space="preserve">Si le prospect reçoit une question ultra-spécifique et profonde sur sa philosophie ou son enjeu  -  une question à laquelle il n'a peut-être pas encore lui-même la réponse  -  et répond de manière très courte, sans développer, sans montrer d'intérêt à continuer, c'est le signal de basculer vers une question de qualification directe, comme dans l'entonnoir inversé.</w:t>
+        <w:t xml:space="preserve">Si le prospect reçoit une question ultra-spécifique et profonde sur sa philosophie ou son enjeu , une question à laquelle il n'a peut-être pas encore lui-même la réponse , et répond de manière très courte, sans développer, sans montrer d'intérêt à continuer, c'est le signal de basculer vers une question de qualification directe, comme dans l'entonnoir inversé.</w:t>
       </w:r>
     </w:p>
     <w:p>
@@ -7182,7 +7182,7 @@
         <w:rPr>
           <w:rtl w:val="0"/>
         </w:rPr>
-        <w:t xml:space="preserve">Ce signal ne se lit pas sur la réponse au premier message ("enchanté")  -  ce n'est pas son objectif. Il se lit uniquement sur la réponse à la vraie question.</w:t>
+        <w:t xml:space="preserve">Ce signal ne se lit pas sur la réponse au premier message ("enchanté") , ce n'est pas son objectif. Il se lit uniquement sur la réponse à la vraie question.</w:t>
       </w:r>
     </w:p>
     <w:p>
@@ -7213,7 +7213,7 @@
         <w:rPr>
           <w:rtl w:val="0"/>
         </w:rPr>
-        <w:t xml:space="preserve">Si l'agent est parti sur une approche de qualification directe et que le prospect se livre davantage que prévu, il n'y a pas de switch à opérer  -  la conversation devient naturellement plus profonde. C'est la logique normale des deux entonnoirs : dans tous les cas, on arrive à une conversation réelle.</w:t>
+        <w:t xml:space="preserve">Si l'agent est parti sur une approche de qualification directe et que le prospect se livre davantage que prévu, il n'y a pas de switch à opérer , la conversation devient naturellement plus profonde. C'est la logique normale des deux entonnoirs : dans tous les cas, on arrive à une conversation réelle.</w:t>
       </w:r>
     </w:p>
     <w:p>
@@ -7246,7 +7246,7 @@
         <w:rPr>
           <w:rtl w:val="0"/>
         </w:rPr>
-        <w:t xml:space="preserve">Les deux entonnoirs mènent à la même destination : une conversation genuine avec le prospect. Le seul ajustement réel en cours de route, c'est de passer d'une question ouverte à une question de qualification directe si la personne montre qu'elle n'est pas disposée à se livrer. Ce n'est pas un switch dramatique  -  c'est une adaptation naturelle au signal reçu.</w:t>
+        <w:t xml:space="preserve">Les deux entonnoirs mènent à la même destination : une conversation genuine avec le prospect. Le seul ajustement réel en cours de route, c'est de passer d'une question ouverte à une question de qualification directe si la personne montre qu'elle n'est pas disposée à se livrer. Ce n'est pas un switch dramatique , c'est une adaptation naturelle au signal reçu.</w:t>
       </w:r>
     </w:p>
     <w:p>
@@ -7301,7 +7301,7 @@
           <w:szCs w:val="40"/>
           <w:rtl w:val="0"/>
         </w:rPr>
-        <w:t xml:space="preserve">BLOC 3  -  SYSTÈME DE SIGNAUX</w:t>
+        <w:t xml:space="preserve">BLOC 3 , SYSTÈME DE SIGNAUX</w:t>
       </w:r>
       <w:r/>
       <w:r>
@@ -7372,7 +7372,7 @@
         <w:rPr>
           <w:rtl w:val="0"/>
         </w:rPr>
-        <w:t xml:space="preserve">Tout élément conversationnel ajouté autour d'une question pour réduire la pression, montrer qu'on écoute vraiment, et fluidifier la relation. L'enrobage n'est pas optionnel  -  c'est le tissu connectif de la phase de questions.</w:t>
+        <w:t xml:space="preserve">Tout élément conversationnel ajouté autour d'une question pour réduire la pression, montrer qu'on écoute vraiment, et fluidifier la relation. L'enrobage n'est pas optionnel , c'est le tissu connectif de la phase de questions.</w:t>
         <w:br w:type="textWrapping"/>
         <w:t xml:space="preserve">Deux formes principales :</w:t>
       </w:r>
@@ -7440,7 +7440,7 @@
         <w:rPr>
           <w:rtl w:val="0"/>
         </w:rPr>
-        <w:t xml:space="preserve"> À utiliser avec parcimonie  -  utile pour varier et ne pas toujours arriver avec une longue histoire, mais à ne pas répéter mécaniquement.</w:t>
+        <w:t xml:space="preserve"> À utiliser avec parcimonie , utile pour varier et ne pas toujours arriver avec une longue histoire, mais à ne pas répéter mécaniquement.</w:t>
       </w:r>
     </w:p>
     <w:p>
@@ -7464,7 +7464,7 @@
         <w:rPr>
           <w:rtl w:val="0"/>
         </w:rPr>
-        <w:t xml:space="preserve"> Une histoire  -  personnelle ou non  -  de 2 à 4 lignes qui crée une connexion avec ce que le prospect vient de décrire. Peut être une expérience personnelle, une observation faite chez un client, quelque chose entendu ou aperçu. Parfois laissée ouverte pour créer de la curiosité et inviter le prospect à poser une question en retour.</w:t>
+        <w:t xml:space="preserve"> Une histoire , personnelle ou non , de 2 à 4 lignes qui crée une connexion avec ce que le prospect vient de décrire. Peut être une expérience personnelle, une observation faite chez un client, quelque chose entendu ou aperçu. Parfois laissée ouverte pour créer de la curiosité et inviter le prospect à poser une question en retour.</w:t>
       </w:r>
     </w:p>
     <w:p>
@@ -7506,7 +7506,7 @@
         <w:rPr>
           <w:rtl w:val="0"/>
         </w:rPr>
-        <w:t xml:space="preserve">  -  c'est un tic détectable. Varier les angles : rebond sur l'insight, histoire d'un client, observation générale sur le secteur, etc.</w:t>
+        <w:t xml:space="preserve"> , c'est un tic détectable. Varier les angles : rebond sur l'insight, histoire d'un client, observation générale sur le secteur, etc.</w:t>
       </w:r>
     </w:p>
     <w:p>
@@ -7544,7 +7544,7 @@
         <w:rPr>
           <w:rtl w:val="0"/>
         </w:rPr>
-        <w:t xml:space="preserve">Indicateur dans la réponse du prospect qui révèle un vrai investissement dans la conversation  -  pas juste une réponse polie. Règle fondamentale : </w:t>
+        <w:t xml:space="preserve">Indicateur dans la réponse du prospect qui révèle un vrai investissement dans la conversation , pas juste une réponse polie. Règle fondamentale : </w:t>
       </w:r>
       <w:r>
         <w:rPr>
@@ -7581,7 +7581,7 @@
         <w:rPr>
           <w:rtl w:val="0"/>
         </w:rPr>
-        <w:t xml:space="preserve">Formulation dans la réponse du prospect qui révèle un problème réel, une tension ou une frustration  -  même exprimée de manière minimisée ou détournée.</w:t>
+        <w:t xml:space="preserve">Formulation dans la réponse du prospect qui révèle un problème réel, une tension ou une frustration , même exprimée de manière minimisée ou détournée.</w:t>
       </w:r>
     </w:p>
     <w:p>
@@ -7664,7 +7664,7 @@
         <w:rPr>
           <w:rtl w:val="0"/>
         </w:rPr>
-        <w:t xml:space="preserve">Moment où on choisit de ne pas enchaîner directement avec la question suivante  -  et où on place de l'enrobage en premier. Déclenché par un signal précis (réponse floue, hésitante, ou qui montre que le prospect ne sait pas trop), pas par automatisme.</w:t>
+        <w:t xml:space="preserve">Moment où on choisit de ne pas enchaîner directement avec la question suivante , et où on place de l'enrobage en premier. Déclenché par un signal précis (réponse floue, hésitante, ou qui montre que le prospect ne sait pas trop), pas par automatisme.</w:t>
       </w:r>
     </w:p>
     <w:p>
@@ -7821,7 +7821,7 @@
           <w:color w:val="555555"/>
           <w:rtl w:val="0"/>
         </w:rPr>
-        <w:t xml:space="preserve">Ce bloc couvre les signaux universels, présents dans toutes les niches. Les signaux spécifiques à un profil ou à un secteur sont traités dans les modules niche. Le contenu de certaines sections sera enrichi lors de l'analyse des 15+ conversations réelles  -  ces sections sont signalées explicitement.</w:t>
+        <w:t xml:space="preserve">Ce bloc couvre les signaux universels, présents dans toutes les niches. Les signaux spécifiques à un profil ou à un secteur sont traités dans les modules niche. Le contenu de certaines sections sera enrichi lors de l'analyse des 15+ conversations réelles , ces sections sont signalées explicitement.</w:t>
       </w:r>
     </w:p>
     <w:p>
@@ -7864,7 +7864,7 @@
           <w:szCs w:val="30"/>
           <w:rtl w:val="0"/>
         </w:rPr>
-        <w:t xml:space="preserve">SECTION 1  -  CLASSIFICATION DES RÉPONSES ET ACTIONS ASSOCIÉES</w:t>
+        <w:t xml:space="preserve">SECTION 1 , CLASSIFICATION DES RÉPONSES ET ACTIONS ASSOCIÉES</w:t>
       </w:r>
     </w:p>
     <w:p>
@@ -7892,7 +7892,7 @@
           <w:szCs w:val="24"/>
           <w:rtl w:val="0"/>
         </w:rPr>
-        <w:t xml:space="preserve">1.1  -  Réponse longue ("pavé")</w:t>
+        <w:t xml:space="preserve">1.1 , Réponse longue ("pavé")</w:t>
       </w:r>
     </w:p>
     <w:p>
@@ -7977,7 +7977,7 @@
         <w:rPr>
           <w:rtl w:val="0"/>
         </w:rPr>
-        <w:t xml:space="preserve"> Ne jamais traiter plusieurs éléments du pavé dans la même réponse. Un seul, creusé. En pratique, les prospects ne donnent pas plusieurs histoires différentes dans un même message  -  ils développent sur une situation. L'élément à retenir est souvent le seul ou le plus saillant.</w:t>
+        <w:t xml:space="preserve"> Ne jamais traiter plusieurs éléments du pavé dans la même réponse. Un seul, creusé. En pratique, les prospects ne donnent pas plusieurs histoires différentes dans un même message , ils développent sur une situation. L'élément à retenir est souvent le seul ou le plus saillant.</w:t>
       </w:r>
     </w:p>
     <w:p>
@@ -8118,7 +8118,7 @@
           <w:szCs w:val="21"/>
           <w:rtl w:val="0"/>
         </w:rPr>
-        <w:t xml:space="preserve">Structure de réponse : rebond sur le déclic (enrobage) → question précise et spécifique sur ce qu'elle fait concrètement  -  comment elle a positionné son produit, comment elle a géré les premières ventes, un aspect précis de son activité  -  pas une question vague. Cette question précise permet ensuite de pivoter naturellement vers la qualification (ça se passe bien ? tu arrives à combien de clients ?).</w:t>
+        <w:t xml:space="preserve">Structure de réponse : rebond sur le déclic (enrobage) → question précise et spécifique sur ce qu'elle fait concrètement , comment elle a positionné son produit, comment elle a géré les premières ventes, un aspect précis de son activité , pas une question vague. Cette question précise permet ensuite de pivoter naturellement vers la qualification (ça se passe bien ? tu arrives à combien de clients ?).</w:t>
       </w:r>
     </w:p>
     <w:p>
@@ -8184,7 +8184,7 @@
         <w:rPr>
           <w:rtl w:val="0"/>
         </w:rPr>
-        <w:t xml:space="preserve">Enrobage  -  rebond direct sur l'élément retenu</w:t>
+        <w:t xml:space="preserve">Enrobage , rebond direct sur l'élément retenu</w:t>
       </w:r>
     </w:p>
     <w:p>
@@ -8243,7 +8243,7 @@
           <w:szCs w:val="24"/>
           <w:rtl w:val="0"/>
         </w:rPr>
-        <w:t xml:space="preserve">1.2  -  Réponse courte</w:t>
+        <w:t xml:space="preserve">1.2 , Réponse courte</w:t>
       </w:r>
     </w:p>
     <w:p>
@@ -8278,7 +8278,7 @@
           <w:u w:val="single"/>
           <w:rtl w:val="0"/>
         </w:rPr>
-        <w:t xml:space="preserve">Sous-cas A  -  Réponse courte émotionnelle</w:t>
+        <w:t xml:space="preserve">Sous-cas A , Réponse courte émotionnelle</w:t>
         <w:br w:type="textWrapping"/>
       </w:r>
       <w:r>
@@ -8418,7 +8418,7 @@
           <w:u w:val="single"/>
           <w:rtl w:val="0"/>
         </w:rPr>
-        <w:t xml:space="preserve">Sous-cas B  -  Réponse courte neutre / plate</w:t>
+        <w:t xml:space="preserve">Sous-cas B , Réponse courte neutre / plate</w:t>
         <w:br w:type="textWrapping"/>
       </w:r>
       <w:r>
@@ -8489,7 +8489,7 @@
           <w:u w:val="single"/>
           <w:rtl w:val="0"/>
         </w:rPr>
-        <w:t xml:space="preserve">Sous-cas C  -  Réponse fermée ("oui exactement", "tout à fait")</w:t>
+        <w:t xml:space="preserve">Sous-cas C , Réponse fermée ("oui exactement", "tout à fait")</w:t>
       </w:r>
     </w:p>
     <w:p>
@@ -8610,7 +8610,7 @@
           <w:szCs w:val="24"/>
           <w:rtl w:val="0"/>
         </w:rPr>
-        <w:t xml:space="preserve">1.3  -  Réponse hors sujet</w:t>
+        <w:t xml:space="preserve">1.3 , Réponse hors sujet</w:t>
       </w:r>
     </w:p>
     <w:p>
@@ -8776,7 +8776,7 @@
           <w:szCs w:val="30"/>
           <w:rtl w:val="0"/>
         </w:rPr>
-        <w:t xml:space="preserve">SECTION 2  -  L'ENROBAGE</w:t>
+        <w:t xml:space="preserve">SECTION 2 , L'ENROBAGE</w:t>
       </w:r>
     </w:p>
     <w:p>
@@ -8804,7 +8804,7 @@
           <w:szCs w:val="24"/>
           <w:rtl w:val="0"/>
         </w:rPr>
-        <w:t xml:space="preserve">2.1  -  Principe</w:t>
+        <w:t xml:space="preserve">2.1 , Principe</w:t>
       </w:r>
     </w:p>
     <w:p>
@@ -8886,7 +8886,7 @@
         <w:rPr>
           <w:rtl w:val="0"/>
         </w:rPr>
-        <w:t xml:space="preserve"> Quand le prospect est dans une phase d'engagement fort et de réponses directes et fluides, on peut enchaîner des questions avec moins d'enrobage. La fluidité de la conversation donne elle-même de la rondeur. Mais même dans ce cas, on ne le supprime pas totalement  -  on alterne.</w:t>
+        <w:t xml:space="preserve"> Quand le prospect est dans une phase d'engagement fort et de réponses directes et fluides, on peut enchaîner des questions avec moins d'enrobage. La fluidité de la conversation donne elle-même de la rondeur. Mais même dans ce cas, on ne le supprime pas totalement , on alterne.</w:t>
       </w:r>
     </w:p>
     <w:p>
@@ -8929,7 +8929,7 @@
           <w:szCs w:val="24"/>
           <w:rtl w:val="0"/>
         </w:rPr>
-        <w:t xml:space="preserve">2.2  -  Les deux formes d'enrobage et quand les utiliser</w:t>
+        <w:t xml:space="preserve">2.2 , Les deux formes d'enrobage et quand les utiliser</w:t>
       </w:r>
     </w:p>
     <w:p>
@@ -8944,7 +8944,7 @@
           <w:u w:val="single"/>
           <w:rtl w:val="0"/>
         </w:rPr>
-        <w:t xml:space="preserve">Forme courte  -  Accusé de réception sobre</w:t>
+        <w:t xml:space="preserve">Forme courte , Accusé de réception sobre</w:t>
         <w:br w:type="textWrapping"/>
       </w:r>
       <w:r>
@@ -9161,7 +9161,7 @@
           <w:color w:val="cc0000"/>
           <w:rtl w:val="0"/>
         </w:rPr>
-        <w:t xml:space="preserve">⚠ Ce qu'il ne faut pas faire : répéter mécaniquement le chiffre ou l'information ("3 clients par mois ? D'accord.")  -  voir Section 7.</w:t>
+        <w:t xml:space="preserve">⚠ Ce qu'il ne faut pas faire : répéter mécaniquement le chiffre ou l'information ("3 clients par mois ? D'accord.") , voir Section 7.</w:t>
       </w:r>
       <w:r/>
       <w:r>
@@ -9192,14 +9192,14 @@
           <w:u w:val="single"/>
           <w:rtl w:val="0"/>
         </w:rPr>
-        <w:t xml:space="preserve">Forme longue  -  Histoire qui crée la connexion</w:t>
+        <w:t xml:space="preserve">Forme longue , Histoire qui crée la connexion</w:t>
         <w:br w:type="textWrapping"/>
       </w:r>
       <w:r>
         <w:rPr>
           <w:rtl w:val="0"/>
         </w:rPr>
-        <w:t xml:space="preserve">2 à 4 lignes qui créent un pont entre ce que le prospect vient de dire et une expérience  -  personnelle, observée chez un client, ou perçue de manière plus générale.</w:t>
+        <w:t xml:space="preserve">2 à 4 lignes qui créent un pont entre ce que le prospect vient de dire et une expérience , personnelle, observée chez un client, ou perçue de manière plus générale.</w:t>
       </w:r>
     </w:p>
     <w:p>
@@ -9219,7 +9219,7 @@
         <w:rPr>
           <w:rtl w:val="0"/>
         </w:rPr>
-        <w:t xml:space="preserve"> Quand la réponse du prospect est émotionnelle, révèle un blocage, une hésitation, un découragement  -  ou quand on veut dédramatiser avant de poser la question suivante.</w:t>
+        <w:t xml:space="preserve"> Quand la réponse du prospect est émotionnelle, révèle un blocage, une hésitation, un découragement , ou quand on veut dédramatiser avant de poser la question suivante.</w:t>
       </w:r>
     </w:p>
     <w:p>
@@ -9542,7 +9542,7 @@
         <w:rPr>
           <w:rtl w:val="0"/>
         </w:rPr>
-        <w:t xml:space="preserve">Quand on laisse l'histoire ouverte, le prospect devient acteur  -  il pose la question lui-même. Ce renversement montre qu'il s'intéresse à nous, pas juste qu'il répond. Et la réponse qu'on donne peut naturellement servir la suite de la conversation.</w:t>
+        <w:t xml:space="preserve">Quand on laisse l'histoire ouverte, le prospect devient acteur , il pose la question lui-même. Ce renversement montre qu'il s'intéresse à nous, pas juste qu'il répond. Et la réponse qu'on donne peut naturellement servir la suite de la conversation.</w:t>
       </w:r>
     </w:p>
     <w:p>
@@ -9561,7 +9561,7 @@
           <w:color w:val="cc0000"/>
           <w:rtl w:val="0"/>
         </w:rPr>
-        <w:t xml:space="preserve">⚠ Règle de variation : Ne pas toujours commencer par "moi aussi j'ai vécu ça". L'histoire peut être : une expérience personnelle, quelque chose vécu chez un client, une observation faite sur le secteur, une remarque plus générale. Ce qui compte c'est la connexion avec ce que le prospect vient de dire  -  pas la source de l'histoire.</w:t>
+        <w:t xml:space="preserve">⚠ Règle de variation : Ne pas toujours commencer par "moi aussi j'ai vécu ça". L'histoire peut être : une expérience personnelle, quelque chose vécu chez un client, une observation faite sur le secteur, une remarque plus générale. Ce qui compte c'est la connexion avec ce que le prospect vient de dire , pas la source de l'histoire.</w:t>
       </w:r>
     </w:p>
     <w:p>
@@ -9604,7 +9604,7 @@
           <w:szCs w:val="24"/>
           <w:rtl w:val="0"/>
         </w:rPr>
-        <w:t xml:space="preserve">2.3  -  Quand mettre l'enrobage avant la question, quand le mettre après</w:t>
+        <w:t xml:space="preserve">2.3 , Quand mettre l'enrobage avant la question, quand le mettre après</w:t>
       </w:r>
     </w:p>
     <w:p>
@@ -9881,7 +9881,7 @@
           <w:szCs w:val="30"/>
           <w:rtl w:val="0"/>
         </w:rPr>
-        <w:t xml:space="preserve">SECTION 3  -  SIGNAUX D'ENGAGEMENT ÉMOTIONNEL</w:t>
+        <w:t xml:space="preserve">SECTION 3 , SIGNAUX D'ENGAGEMENT ÉMOTIONNEL</w:t>
       </w:r>
     </w:p>
     <w:p>
@@ -9909,7 +9909,7 @@
           <w:szCs w:val="24"/>
           <w:rtl w:val="0"/>
         </w:rPr>
-        <w:t xml:space="preserve">3.1  -  La règle fondamentale</w:t>
+        <w:t xml:space="preserve">3.1 , La règle fondamentale</w:t>
       </w:r>
     </w:p>
     <w:p>
@@ -9996,7 +9996,7 @@
           <w:szCs w:val="24"/>
           <w:rtl w:val="0"/>
         </w:rPr>
-        <w:t xml:space="preserve">3.2  -  Signaux d'engagement émotionnel et niveaux</w:t>
+        <w:t xml:space="preserve">3.2 , Signaux d'engagement émotionnel et niveaux</w:t>
       </w:r>
     </w:p>
     <w:p>
@@ -10031,7 +10031,7 @@
         <w:rPr>
           <w:rtl w:val="0"/>
         </w:rPr>
-        <w:t xml:space="preserve">Remerciement spontané  -  "merci", "ça fait plaisir", "je te remercie" sans y être invité</w:t>
+        <w:t xml:space="preserve">Remerciement spontané , "merci", "ça fait plaisir", "je te remercie" sans y être invité</w:t>
       </w:r>
     </w:p>
     <w:p>
@@ -10047,7 +10047,7 @@
         <w:rPr>
           <w:rtl w:val="0"/>
         </w:rPr>
-        <w:t xml:space="preserve">Question posée en retour  -  le prospect s'intéresse à notre situation ou notre avis</w:t>
+        <w:t xml:space="preserve">Question posée en retour , le prospect s'intéresse à notre situation ou notre avis</w:t>
       </w:r>
     </w:p>
     <w:p>
@@ -10063,7 +10063,7 @@
         <w:rPr>
           <w:rtl w:val="0"/>
         </w:rPr>
-        <w:t xml:space="preserve">Emoji expressif  -  pas juste un pouce de politesse, un emoji qui exprime une émotion réelle</w:t>
+        <w:t xml:space="preserve">Emoji expressif , pas juste un pouce de politesse, un emoji qui exprime une émotion réelle</w:t>
       </w:r>
     </w:p>
     <w:p>
@@ -10079,7 +10079,7 @@
         <w:rPr>
           <w:rtl w:val="0"/>
         </w:rPr>
-        <w:t xml:space="preserve">Vulnérabilité exprimée  -  partage d'une difficulté, d'une peur, d'un doute</w:t>
+        <w:t xml:space="preserve">Vulnérabilité exprimée , partage d'une difficulté, d'une peur, d'un doute</w:t>
       </w:r>
     </w:p>
     <w:p>
@@ -10095,7 +10095,7 @@
         <w:rPr>
           <w:rtl w:val="0"/>
         </w:rPr>
-        <w:t xml:space="preserve">Développement spontané au-delà de la question  -  le prospect dit plus que ce qu'on lui a demandé</w:t>
+        <w:t xml:space="preserve">Développement spontané au-delà de la question , le prospect dit plus que ce qu'on lui a demandé</w:t>
       </w:r>
     </w:p>
     <w:p>
@@ -10111,7 +10111,7 @@
         <w:rPr>
           <w:rtl w:val="0"/>
         </w:rPr>
-        <w:t xml:space="preserve">Ton chaud, familier  -  "ahah", "tu vois ?", smileys en fin de phrase</w:t>
+        <w:t xml:space="preserve">Ton chaud, familier , "ahah", "tu vois ?", smileys en fin de phrase</w:t>
       </w:r>
     </w:p>
     <w:p>
@@ -10162,7 +10162,7 @@
         <w:rPr>
           <w:rtl w:val="0"/>
         </w:rPr>
-        <w:t xml:space="preserve">Réponse qui répond à la question et s'arrête  -  sans aller plus loin</w:t>
+        <w:t xml:space="preserve">Réponse qui répond à la question et s'arrête , sans aller plus loin</w:t>
       </w:r>
     </w:p>
     <w:p>
@@ -10197,7 +10197,7 @@
           <w:u w:val="single"/>
           <w:rtl w:val="0"/>
         </w:rPr>
-        <w:t xml:space="preserve">Graduation des niveaux  -  exemples réels :</w:t>
+        <w:t xml:space="preserve">Graduation des niveaux , exemples réels :</w:t>
       </w:r>
     </w:p>
     <w:tbl>
@@ -10936,7 +10936,7 @@
           <w:szCs w:val="30"/>
           <w:rtl w:val="0"/>
         </w:rPr>
-        <w:t xml:space="preserve">SECTION 4  -  SIGNAUX DE DOULEUR ÉMOTIONNELLE</w:t>
+        <w:t xml:space="preserve">SECTION 4 , SIGNAUX DE DOULEUR ÉMOTIONNELLE</w:t>
       </w:r>
     </w:p>
     <w:p>
@@ -10964,7 +10964,7 @@
           <w:szCs w:val="24"/>
           <w:rtl w:val="0"/>
         </w:rPr>
-        <w:t xml:space="preserve">4.1  -  Ce qu'est un signal de douleur</w:t>
+        <w:t xml:space="preserve">4.1 , Ce qu'est un signal de douleur</w:t>
       </w:r>
     </w:p>
     <w:p>
@@ -11188,7 +11188,7 @@
           <w:szCs w:val="24"/>
           <w:rtl w:val="0"/>
         </w:rPr>
-        <w:t xml:space="preserve">4.2  -  L'action quand un signal de douleur est détecté</w:t>
+        <w:t xml:space="preserve">4.2 , L'action quand un signal de douleur est détecté</w:t>
       </w:r>
     </w:p>
     <w:p>
@@ -11377,7 +11377,7 @@
         <w:rPr>
           <w:rtl w:val="0"/>
         </w:rPr>
-        <w:t xml:space="preserve">Les prospects ne donnent pas leur douleur deux fois. Si on passe dessus sans s'y arrêter, la fenêtre se referme. Le signal de douleur est la matière première de la qualification  -  c'est là que tout se joue.</w:t>
+        <w:t xml:space="preserve">Les prospects ne donnent pas leur douleur deux fois. Si on passe dessus sans s'y arrêter, la fenêtre se referme. Le signal de douleur est la matière première de la qualification , c'est là que tout se joue.</w:t>
       </w:r>
     </w:p>
     <w:p>
@@ -11421,7 +11421,7 @@
           <w:szCs w:val="24"/>
           <w:rtl w:val="0"/>
         </w:rPr>
-        <w:t xml:space="preserve">4.3  -  Nuance : douleur verbalisée ≠ automatiquement bon client</w:t>
+        <w:t xml:space="preserve">4.3 , Nuance : douleur verbalisée ≠ automatiquement bon client</w:t>
       </w:r>
     </w:p>
     <w:p>
@@ -11461,7 +11461,7 @@
         <w:rPr>
           <w:rtl w:val="0"/>
         </w:rPr>
-        <w:t xml:space="preserve">), ce n'est pas automatiquement le signe d'un bon prospect. Dans environ 80% des cas, quelqu'un qui se plaint de manière récurrente et intense dès le début est un profil à surveiller  -  plainte chronique, excuses permanentes, peu de passage à l'action.</w:t>
+        <w:t xml:space="preserve">), ce n'est pas automatiquement le signe d'un bon prospect. Dans environ 80% des cas, quelqu'un qui se plaint de manière récurrente et intense dès le début est un profil à surveiller , plainte chronique, excuses permanentes, peu de passage à l'action.</w:t>
       </w:r>
     </w:p>
     <w:p>
@@ -11473,7 +11473,7 @@
         <w:rPr>
           <w:rtl w:val="0"/>
         </w:rPr>
-        <w:t xml:space="preserve">Mais dans 20% des cas, cette intensité reflète simplement quelqu'un qui est vraiment à bout, vraiment désespéré  -  et qui peut être un très bon client parce qu'il est prêt à agir.</w:t>
+        <w:t xml:space="preserve">Mais dans 20% des cas, cette intensité reflète simplement quelqu'un qui est vraiment à bout, vraiment désespéré , et qui peut être un très bon client parce qu'il est prêt à agir.</w:t>
       </w:r>
     </w:p>
     <w:p>
@@ -11535,7 +11535,7 @@
           <w:szCs w:val="30"/>
           <w:rtl w:val="0"/>
         </w:rPr>
-        <w:t xml:space="preserve">SECTION 5  -  GESTION DES RÉPONSES MINIMISANTES</w:t>
+        <w:t xml:space="preserve">SECTION 5 , GESTION DES RÉPONSES MINIMISANTES</w:t>
       </w:r>
     </w:p>
     <w:p>
@@ -11563,7 +11563,7 @@
           <w:szCs w:val="24"/>
           <w:rtl w:val="0"/>
         </w:rPr>
-        <w:t xml:space="preserve">5.1  -  Ce qu'est une réponse minimisante</w:t>
+        <w:t xml:space="preserve">5.1 , Ce qu'est une réponse minimisante</w:t>
       </w:r>
     </w:p>
     <w:p>
@@ -11727,7 +11727,7 @@
           <w:szCs w:val="24"/>
           <w:rtl w:val="0"/>
         </w:rPr>
-        <w:t xml:space="preserve">5.2  -  L'action face à une réponse minimisante</w:t>
+        <w:t xml:space="preserve">5.2 , L'action face à une réponse minimisante</w:t>
       </w:r>
     </w:p>
     <w:p>
@@ -11772,7 +11772,7 @@
         <w:rPr>
           <w:rtl w:val="0"/>
         </w:rPr>
-        <w:t xml:space="preserve"> ne jamais contester frontalement. Valider d'abord. Puis amener progressivement le prospect vers le concret  -  jusqu'à ce qu'il voie lui-même le vrai problème.</w:t>
+        <w:t xml:space="preserve"> ne jamais contester frontalement. Valider d'abord. Puis amener progressivement le prospect vers le concret , jusqu'à ce qu'il voie lui-même le vrai problème.</w:t>
       </w:r>
     </w:p>
     <w:p>
@@ -11895,7 +11895,7 @@
         <w:rPr>
           <w:rtl w:val="0"/>
         </w:rPr>
-        <w:t xml:space="preserve">Ne jamais laisser passer une réponse vague  -  transformer chaque généralité en diagnostic précis (</w:t>
+        <w:t xml:space="preserve">Ne jamais laisser passer une réponse vague , transformer chaque généralité en diagnostic précis (</w:t>
       </w:r>
       <w:r>
         <w:rPr>
@@ -11925,7 +11925,7 @@
         <w:rPr>
           <w:rtl w:val="0"/>
         </w:rPr>
-        <w:t xml:space="preserve">Descendre dans le concret jusqu'à ce que le prospect lui-même formule le vrai problème  -  pas nous</w:t>
+        <w:t xml:space="preserve">Descendre dans le concret jusqu'à ce que le prospect lui-même formule le vrai problème , pas nous</w:t>
       </w:r>
     </w:p>
     <w:p>
@@ -11958,7 +11958,7 @@
         <w:rPr>
           <w:rtl w:val="0"/>
         </w:rPr>
-        <w:t xml:space="preserve">Contester frontalement une minimisation déclenche la défensive. En guidant vers le concret, on n'impose rien  -  c'est lui qui arrive à la conclusion. Cette conclusion venue de lui est infiniment plus puissante que si on l'avait affirmée nous-mêmes.</w:t>
+        <w:t xml:space="preserve">Contester frontalement une minimisation déclenche la défensive. En guidant vers le concret, on n'impose rien , c'est lui qui arrive à la conclusion. Cette conclusion venue de lui est infiniment plus puissante que si on l'avait affirmée nous-mêmes.</w:t>
       </w:r>
     </w:p>
     <w:p>
@@ -12001,7 +12001,7 @@
           <w:szCs w:val="30"/>
           <w:rtl w:val="0"/>
         </w:rPr>
-        <w:t xml:space="preserve">SECTION 6  -  LE DÉTOUR CONVERSATIONNEL</w:t>
+        <w:t xml:space="preserve">SECTION 6 , LE DÉTOUR CONVERSATIONNEL</w:t>
       </w:r>
     </w:p>
     <w:p>
@@ -12029,7 +12029,7 @@
           <w:szCs w:val="24"/>
           <w:rtl w:val="0"/>
         </w:rPr>
-        <w:t xml:space="preserve">6.1  -  Définition et déclencheur</w:t>
+        <w:t xml:space="preserve">6.1 , Définition et déclencheur</w:t>
       </w:r>
     </w:p>
     <w:p>
@@ -12041,7 +12041,7 @@
         <w:rPr>
           <w:rtl w:val="0"/>
         </w:rPr>
-        <w:t xml:space="preserve">Le détour conversationnel est le moment où on choisit de ne pas enchaîner directement avec la question suivante  -  et où on place de l'enrobage en premier.</w:t>
+        <w:t xml:space="preserve">Le détour conversationnel est le moment où on choisit de ne pas enchaîner directement avec la question suivante , et où on place de l'enrobage en premier.</w:t>
       </w:r>
     </w:p>
     <w:p>
@@ -12148,7 +12148,7 @@
         <w:rPr>
           <w:rtl w:val="0"/>
         </w:rPr>
-        <w:t xml:space="preserve"> ne pas enchaîner immédiatement avec la question suivante. Placer d'abord de l'enrobage  -  rebond sur ce qui vient d'être dit, ou expérience similaire  -  puis poser la question.</w:t>
+        <w:t xml:space="preserve"> ne pas enchaîner immédiatement avec la question suivante. Placer d'abord de l'enrobage , rebond sur ce qui vient d'être dit, ou expérience similaire , puis poser la question.</w:t>
       </w:r>
     </w:p>
     <w:p>
@@ -12269,7 +12269,7 @@
           <w:szCs w:val="30"/>
           <w:rtl w:val="0"/>
         </w:rPr>
-        <w:t xml:space="preserve">SECTION 7  -  EFFET MIROIR  -  AVERTISSEMENT</w:t>
+        <w:t xml:space="preserve">SECTION 7 , EFFET MIROIR , AVERTISSEMENT</w:t>
       </w:r>
     </w:p>
     <w:p>
@@ -12297,7 +12297,7 @@
           <w:szCs w:val="24"/>
           <w:rtl w:val="0"/>
         </w:rPr>
-        <w:t xml:space="preserve">7.1  -  Ce qu'il faut éviter</w:t>
+        <w:t xml:space="preserve">7.1 , Ce qu'il faut éviter</w:t>
       </w:r>
     </w:p>
     <w:p>
@@ -12512,7 +12512,7 @@
           <w:color w:val="555555"/>
           <w:rtl w:val="0"/>
         </w:rPr>
-        <w:t xml:space="preserve">Note : c'est précisément ce moment  -  quand le prospect livre un élément factuel  -  qui appelle la forme courte de l'enrobage (voir Section 2.2). Pas une longue histoire personnelle, juste un accusé de réception qui montre qu'on a bien entendu.</w:t>
+        <w:t xml:space="preserve">Note : c'est précisément ce moment , quand le prospect livre un élément factuel , qui appelle la forme courte de l'enrobage (voir Section 2.2). Pas une longue histoire personnelle, juste un accusé de réception qui montre qu'on a bien entendu.</w:t>
       </w:r>
     </w:p>
     <w:p>
@@ -12555,7 +12555,7 @@
           <w:szCs w:val="24"/>
           <w:rtl w:val="0"/>
         </w:rPr>
-        <w:t xml:space="preserve">7.2  -  Ce qui fonctionne à la place</w:t>
+        <w:t xml:space="preserve">7.2 , Ce qui fonctionne à la place</w:t>
       </w:r>
     </w:p>
     <w:p>
@@ -12567,7 +12567,7 @@
         <w:rPr>
           <w:rtl w:val="0"/>
         </w:rPr>
-        <w:t xml:space="preserve">L'effet miroir qui fonctionne n'est pas une répétition de mots  -  c'est un partage d'expérience similaire.</w:t>
+        <w:t xml:space="preserve">L'effet miroir qui fonctionne n'est pas une répétition de mots , c'est un partage d'expérience similaire.</w:t>
       </w:r>
     </w:p>
     <w:p>
@@ -12709,7 +12709,7 @@
         <w:rPr>
           <w:rtl w:val="0"/>
         </w:rPr>
-        <w:t xml:space="preserve">La répétition mécanique est une technique connue  -  les profils habitués à être prospectés la repèrent. Le partage d'expérience similaire crée la même connexion sans déclencher ce filtre, parce qu'il apporte quelque chose de nouveau dans la conversation.</w:t>
+        <w:t xml:space="preserve">La répétition mécanique est une technique connue , les profils habitués à être prospectés la repèrent. Le partage d'expérience similaire crée la même connexion sans déclencher ce filtre, parce qu'il apporte quelque chose de nouveau dans la conversation.</w:t>
       </w:r>
     </w:p>
     <w:p>
@@ -12752,7 +12752,7 @@
           <w:szCs w:val="30"/>
           <w:rtl w:val="0"/>
         </w:rPr>
-        <w:t xml:space="preserve">SECTION 8  -  PROFILS SILENCIEUX</w:t>
+        <w:t xml:space="preserve">SECTION 8 , PROFILS SILENCIEUX</w:t>
       </w:r>
     </w:p>
     <w:p>
@@ -12830,7 +12830,7 @@
         <w:rPr>
           <w:rtl w:val="0"/>
         </w:rPr>
-        <w:t xml:space="preserve">L'objectif du message 1 n'est pas d'obtenir une réponse  -  c'est d'entrer dans l'inbox. La majorité des gens ne répondent pas à "hello enchanté"  -  ce n'est pas un signal de fermeture. Ne pas envoyer le message 2 sous ce prétexte, c'est manquer le seul moment où on peut vraiment créer une conversation.</w:t>
+        <w:t xml:space="preserve">L'objectif du message 1 n'est pas d'obtenir une réponse , c'est d'entrer dans l'inbox. La majorité des gens ne répondent pas à "hello enchanté" , ce n'est pas un signal de fermeture. Ne pas envoyer le message 2 sous ce prétexte, c'est manquer le seul moment où on peut vraiment créer une conversation.</w:t>
       </w:r>
     </w:p>
     <w:p>
@@ -12909,7 +12909,7 @@
           <w:szCs w:val="36"/>
           <w:rtl w:val="0"/>
         </w:rPr>
-        <w:t xml:space="preserve">BLOC 4A  -  ULTRA-PERSONNALISATION PAR INSIGHT PROFOND</w:t>
+        <w:t xml:space="preserve">BLOC 4A , ULTRA-PERSONNALISATION PAR INSIGHT PROFOND</w:t>
       </w:r>
     </w:p>
     <w:p>
@@ -12982,7 +12982,7 @@
         <w:rPr>
           <w:rtl w:val="0"/>
         </w:rPr>
-        <w:t xml:space="preserve">La synthèse d'une lecture complète du profil LinkedIn du prospect, formulée sous la forme d'une observation ou d'une question ultra-précise qui révèle qu'on a compris sa philosophie globale  -  pas seulement son titre ou son dernier post. L'insight profond identifie l'enjeu central de son activité, souvent celui auquel le prospect lui-même n'a pas encore de réponse toute faite.</w:t>
+        <w:t xml:space="preserve">La synthèse d'une lecture complète du profil LinkedIn du prospect, formulée sous la forme d'une observation ou d'une question ultra-précise qui révèle qu'on a compris sa philosophie globale , pas seulement son titre ou son dernier post. L'insight profond identifie l'enjeu central de son activité, souvent celui auquel le prospect lui-même n'a pas encore de réponse toute faite.</w:t>
       </w:r>
     </w:p>
     <w:p>
@@ -13070,7 +13070,7 @@
         <w:rPr>
           <w:rtl w:val="0"/>
         </w:rPr>
-        <w:t xml:space="preserve">Mode de formulation qui introduit l'insight comme quelque chose qu'on a dégagé soi-même. Elle ne flatte pas et n'interroge pas frontalement. Elle montre qu'on a absorbé la philosophie  -  et elle peut intégrer un léger challenge sur un angle que le prospect n'a pas encore totalement approfondi.</w:t>
+        <w:t xml:space="preserve">Mode de formulation qui introduit l'insight comme quelque chose qu'on a dégagé soi-même. Elle ne flatte pas et n'interroge pas frontalement. Elle montre qu'on a absorbé la philosophie , et elle peut intégrer un léger challenge sur un angle que le prospect n'a pas encore totalement approfondi.</w:t>
       </w:r>
     </w:p>
     <w:p>
@@ -13089,7 +13089,7 @@
           <w:color w:val="cc0000"/>
           <w:rtl w:val="0"/>
         </w:rPr>
-        <w:t xml:space="preserve">⚠ La formulation exacte à utiliser en pratique n'est pas figée ici. Plusieurs alternatives seront testées et comparées lors de la phase d'A/B testing  -  à documenter séparément.</w:t>
+        <w:t xml:space="preserve">⚠ La formulation exacte à utiliser en pratique n'est pas figée ici. Plusieurs alternatives seront testées et comparées lors de la phase d'A/B testing , à documenter séparément.</w:t>
       </w:r>
       <w:r/>
       <w:r/>
@@ -13152,7 +13152,7 @@
         <w:rPr>
           <w:rtl w:val="0"/>
         </w:rPr>
-        <w:t xml:space="preserve">L'ultra-personnalisation n'est pas un avantage  -  c'est le minimum requis.</w:t>
+        <w:t xml:space="preserve">L'ultra-personnalisation n'est pas un avantage , c'est le minimum requis.</w:t>
       </w:r>
     </w:p>
     <w:p>
@@ -13256,7 +13256,7 @@
         <w:rPr>
           <w:rtl w:val="0"/>
         </w:rPr>
-        <w:t xml:space="preserve">Pour produire cet effet, l'analyse doit aller chercher la cohérence derrière l'ensemble de la présence LinkedIn  -  et la formuler sous la forme d'une observation précise sur un enjeu que le prospect est encore en train de résoudre.</w:t>
+        <w:t xml:space="preserve">Pour produire cet effet, l'analyse doit aller chercher la cohérence derrière l'ensemble de la présence LinkedIn , et la formuler sous la forme d'une observation précise sur un enjeu que le prospect est encore en train de résoudre.</w:t>
       </w:r>
     </w:p>
     <w:p>
@@ -13298,7 +13298,7 @@
           <w:szCs w:val="21"/>
           <w:rtl w:val="0"/>
         </w:rPr>
-        <w:t xml:space="preserve">Le filtre de méfiance d'un prospect actif sur LinkedIn est calibré pour détecter les patterns de prospection. Une question générale sur leur activité déclenche ce filtre immédiatement. Une question qui touche l'enjeu philosophique central de leur travail  -  formulée avec une précision qui ne peut pas venir d'une lecture rapide  -  court-circuite ce filtre. Le prospect passe de "encore un qui prospecte" à "cette personne m'a vraiment regardé."</w:t>
+        <w:t xml:space="preserve">Le filtre de méfiance d'un prospect actif sur LinkedIn est calibré pour détecter les patterns de prospection. Une question générale sur leur activité déclenche ce filtre immédiatement. Une question qui touche l'enjeu philosophique central de leur travail , formulée avec une précision qui ne peut pas venir d'une lecture rapide , court-circuite ce filtre. Le prospect passe de "encore un qui prospecte" à "cette personne m'a vraiment regardé."</w:t>
       </w:r>
     </w:p>
     <w:p>
@@ -13341,7 +13341,7 @@
           <w:szCs w:val="28"/>
           <w:rtl w:val="0"/>
         </w:rPr>
-        <w:t xml:space="preserve">CE QU'ON LIT  -  SOURCES ET HIÉRARCHIE</w:t>
+        <w:t xml:space="preserve">CE QU'ON LIT , SOURCES ET HIÉRARCHIE</w:t>
       </w:r>
     </w:p>
     <w:p>
@@ -13369,7 +13369,7 @@
           <w:szCs w:val="24"/>
           <w:rtl w:val="0"/>
         </w:rPr>
-        <w:t xml:space="preserve">Source 1  -  Les posts (source principale)</w:t>
+        <w:t xml:space="preserve">Source 1 , Les posts (source principale)</w:t>
       </w:r>
     </w:p>
     <w:p>
@@ -13393,7 +13393,7 @@
         <w:rPr>
           <w:rtl w:val="0"/>
         </w:rPr>
-        <w:t xml:space="preserve">Ce qu'on cherche dans les posts, c'est ce que le prospect dit à sa cible sur sa douleur. La plupart des posts s'adressent au client idéal pour conscientiser sur un problème  -  c'est là que la philosophie se révèle.</w:t>
+        <w:t xml:space="preserve">Ce qu'on cherche dans les posts, c'est ce que le prospect dit à sa cible sur sa douleur. La plupart des posts s'adressent au client idéal pour conscientiser sur un problème , c'est là que la philosophie se révèle.</w:t>
       </w:r>
     </w:p>
     <w:p>
@@ -13468,7 +13468,7 @@
           <w:szCs w:val="21"/>
           <w:rtl w:val="0"/>
         </w:rPr>
-        <w:t xml:space="preserve">Plus on fait la synthèse de plusieurs posts qui s'attaquent à la problématique de la cible du prospect  -  plus on a une vision de sa philosophie globale. C'est cette synthèse qui génère l'insight profond.</w:t>
+        <w:t xml:space="preserve">Plus on fait la synthèse de plusieurs posts qui s'attaquent à la problématique de la cible du prospect , plus on a une vision de sa philosophie globale. C'est cette synthèse qui génère l'insight profond.</w:t>
       </w:r>
     </w:p>
     <w:p>
@@ -13576,7 +13576,7 @@
         <w:rPr>
           <w:rtl w:val="0"/>
         </w:rPr>
-        <w:t xml:space="preserve"> les points qu'ils évoquent mais n'ont pas encore totalement approfondis  -  c'est souvent là que se trouve l'enjeu non résolu</w:t>
+        <w:t xml:space="preserve"> les points qu'ils évoquent mais n'ont pas encore totalement approfondis , c'est souvent là que se trouve l'enjeu non résolu</w:t>
       </w:r>
     </w:p>
     <w:p>
@@ -13604,7 +13604,7 @@
           <w:szCs w:val="24"/>
           <w:rtl w:val="0"/>
         </w:rPr>
-        <w:t xml:space="preserve">Source 2  -  Section info / bio</w:t>
+        <w:t xml:space="preserve">Source 2 , Section info / bio</w:t>
       </w:r>
     </w:p>
     <w:p>
@@ -13616,7 +13616,7 @@
         <w:rPr>
           <w:rtl w:val="0"/>
         </w:rPr>
-        <w:t xml:space="preserve">Vient enrichir ce qu'on a compris dans les posts. L'essentiel se trouve dans les posts  -  la section info ajoute des couches de compréhension : parcours, positionnement affiché, ton utilisé (chiffré/factuel vs narratif/identitaire), promesse centrale.</w:t>
+        <w:t xml:space="preserve">Vient enrichir ce qu'on a compris dans les posts. L'essentiel se trouve dans les posts , la section info ajoute des couches de compréhension : parcours, positionnement affiché, ton utilisé (chiffré/factuel vs narratif/identitaire), promesse centrale.</w:t>
       </w:r>
     </w:p>
     <w:p>
@@ -13644,7 +13644,7 @@
           <w:szCs w:val="24"/>
           <w:rtl w:val="0"/>
         </w:rPr>
-        <w:t xml:space="preserve">Source 3  -  Commentaires laissés sur d'autres posts</w:t>
+        <w:t xml:space="preserve">Source 3 , Commentaires laissés sur d'autres posts</w:t>
       </w:r>
     </w:p>
     <w:p>
@@ -13656,7 +13656,7 @@
         <w:rPr>
           <w:rtl w:val="0"/>
         </w:rPr>
-        <w:t xml:space="preserve">Peut révéler comment la personne pense quand elle ne construit pas son propre contenu  -  parfois plus spontané.</w:t>
+        <w:t xml:space="preserve">Peut révéler comment la personne pense quand elle ne construit pas son propre contenu , parfois plus spontané.</w:t>
       </w:r>
     </w:p>
     <w:p>
@@ -13676,7 +13676,7 @@
           <w:color w:val="cc0000"/>
           <w:rtl w:val="0"/>
         </w:rPr>
-        <w:t xml:space="preserve">⚠ Disclaimer important : une part croissante des commentaires LinkedIn est générée avec de l'IA. Des incohérences peuvent apparaître entre les commentaires et le contenu des posts. Ne pas se fier à 100% aux commentaires  -  les traiter comme un signal secondaire, à recouper avec les posts.</w:t>
+        <w:t xml:space="preserve">⚠ Disclaimer important : une part croissante des commentaires LinkedIn est générée avec de l'IA. Des incohérences peuvent apparaître entre les commentaires et le contenu des posts. Ne pas se fier à 100% aux commentaires , les traiter comme un signal secondaire, à recouper avec les posts.</w:t>
       </w:r>
       <w:commentRangeEnd w:id="4"/>
       <w:r>
@@ -13711,7 +13711,7 @@
           <w:szCs w:val="24"/>
           <w:rtl w:val="0"/>
         </w:rPr>
-        <w:t xml:space="preserve">Source 4  -  Ancienneté et niveau d'activité</w:t>
+        <w:t xml:space="preserve">Source 4 , Ancienneté et niveau d'activité</w:t>
       </w:r>
     </w:p>
     <w:p>
@@ -13723,7 +13723,7 @@
         <w:rPr>
           <w:rtl w:val="0"/>
         </w:rPr>
-        <w:t xml:space="preserve">Informe sur le niveau d'exposition à la prospection LinkedIn (voir Bloc 2, Archétype 6  -  prospect averti). Conditionne l'exigence de profondeur requise dans la personnalisation.</w:t>
+        <w:t xml:space="preserve">Informe sur le niveau d'exposition à la prospection LinkedIn (voir Bloc 2, Archétype 6 , prospect averti). Conditionne l'exigence de profondeur requise dans la personnalisation.</w:t>
       </w:r>
     </w:p>
     <w:p>
@@ -13785,7 +13785,7 @@
           <w:szCs w:val="28"/>
           <w:rtl w:val="0"/>
         </w:rPr>
-        <w:t xml:space="preserve">CE QU'ON NE FAIT PAS  -  CE QU'ON FAIT</w:t>
+        <w:t xml:space="preserve">CE QU'ON NE FAIT PAS , CE QU'ON FAIT</w:t>
       </w:r>
     </w:p>
     <w:p>
@@ -13835,7 +13835,7 @@
         <w:rPr>
           <w:rtl w:val="0"/>
         </w:rPr>
-        <w:t xml:space="preserve">"J'ai vu ton post sur X"  -  signal immédiat de prospection rapide. Le prospect se dit "il a juste lu mon dernier post et il me le renvoie."</w:t>
+        <w:t xml:space="preserve">"J'ai vu ton post sur X" , signal immédiat de prospection rapide. Le prospect se dit "il a juste lu mon dernier post et il me le renvoie."</w:t>
       </w:r>
     </w:p>
     <w:p>
@@ -13966,7 +13966,7 @@
         <w:rPr>
           <w:rtl w:val="0"/>
         </w:rPr>
-        <w:t xml:space="preserve">"Comment t'arrives à [enjeu précis] ?" posé directement, sans observation préalable  -  ça ressemble à un interrogatoire, pas à une curiosité sincère.</w:t>
+        <w:t xml:space="preserve">"Comment t'arrives à [enjeu précis] ?" posé directement, sans observation préalable , ça ressemble à un interrogatoire, pas à une curiosité sincère.</w:t>
       </w:r>
     </w:p>
     <w:p>
@@ -14007,7 +14007,7 @@
         <w:rPr>
           <w:rtl w:val="0"/>
         </w:rPr>
-        <w:t xml:space="preserve">Synthétiser la philosophie globale dégagée de plusieurs posts, puis poser la question à l'enjeu philosophique  -  </w:t>
+        <w:t xml:space="preserve">Synthétiser la philosophie globale dégagée de plusieurs posts, puis poser la question à l'enjeu philosophique , </w:t>
       </w:r>
       <w:r>
         <w:rPr>
@@ -14033,7 +14033,7 @@
         <w:rPr>
           <w:rtl w:val="0"/>
         </w:rPr>
-        <w:t xml:space="preserve">La formulation montre qu'on a dégagé quelque chose soi-même. Le prospect n'a pas l'impression qu'on lui demande de nous expliquer son travail  -  il a l'impression qu'on a vraiment absorbé ce qu'il fait et qu'on lui pose la question sur ce qu'il est encore en train de résoudre.</w:t>
+        <w:t xml:space="preserve">La formulation montre qu'on a dégagé quelque chose soi-même. Le prospect n'a pas l'impression qu'on lui demande de nous expliquer son travail , il a l'impression qu'on a vraiment absorbé ce qu'il fait et qu'on lui pose la question sur ce qu'il est encore en train de résoudre.</w:t>
       </w:r>
     </w:p>
     <w:p>
@@ -14104,7 +14104,7 @@
           <w:szCs w:val="24"/>
           <w:rtl w:val="0"/>
         </w:rPr>
-        <w:t xml:space="preserve">Niveau 1  -  Lecture superficielle (à éviter)</w:t>
+        <w:t xml:space="preserve">Niveau 1 , Lecture superficielle (à éviter)</w:t>
       </w:r>
     </w:p>
     <w:p>
@@ -14164,7 +14164,7 @@
           <w:szCs w:val="20"/>
           <w:rtl w:val="0"/>
         </w:rPr>
-        <w:t xml:space="preserve">(Le cœur y est pour illustrer ce qu'il ne faut pas faire  -  la formulation finale sera travaillée en A/B testing)</w:t>
+        <w:t xml:space="preserve">(Le cœur y est pour illustrer ce qu'il ne faut pas faire , la formulation finale sera travaillée en A/B testing)</w:t>
       </w:r>
     </w:p>
     <w:p>
@@ -14277,7 +14277,7 @@
           <w:szCs w:val="24"/>
           <w:rtl w:val="0"/>
         </w:rPr>
-        <w:t xml:space="preserve">Niveau 2  -  Lecture profonde (standard minimum requis)</w:t>
+        <w:t xml:space="preserve">Niveau 2 , Lecture profonde (standard minimum requis)</w:t>
       </w:r>
     </w:p>
     <w:p>
@@ -14337,7 +14337,7 @@
           <w:szCs w:val="20"/>
           <w:rtl w:val="0"/>
         </w:rPr>
-        <w:t xml:space="preserve">(Le cœur y est  -  formulations à affiner en A/B testing, pas définitives)</w:t>
+        <w:t xml:space="preserve">(Le cœur y est , formulations à affiner en A/B testing, pas définitives)</w:t>
       </w:r>
     </w:p>
     <w:p>
@@ -14402,7 +14402,7 @@
           <w:szCs w:val="21"/>
           <w:rtl w:val="0"/>
         </w:rPr>
-        <w:t xml:space="preserve"> - </w:t>
+        <w:t xml:space="preserve">,</w:t>
       </w:r>
       <w:r/>
       <w:r/>
@@ -14470,7 +14470,7 @@
           <w:szCs w:val="21"/>
           <w:rtl w:val="0"/>
         </w:rPr>
-        <w:t xml:space="preserve">"Comment tu fais pour faire comprendre à ta cible concrètement en quoi tu les aides  -  pas en termes de tâches, mais en quoi quelqu'un d'externe peut vraiment améliorer leur situation ?"</w:t>
+        <w:t xml:space="preserve">"Comment tu fais pour faire comprendre à ta cible concrètement en quoi tu les aides , pas en termes de tâches, mais en quoi quelqu'un d'externe peut vraiment améliorer leur situation ?"</w:t>
       </w:r>
     </w:p>
     <w:p>
@@ -14533,9 +14533,7 @@
         <w:t xml:space="preserve">Niveau 3 : Message ultra-personnalisé par insight profond</w:t>
       </w:r>
     </w:p>
-    <w:p/>
-    <w:p>
-      <w:commentRangeStart w:id="5"/>
+    <w:p>
       <w:pPr>
         <w:pStyle w:val="Heading3"/>
         <w:keepNext w:val="0"/>
@@ -14549,27 +14547,9 @@
           <w:szCs w:val="24"/>
         </w:rPr>
       </w:pPr>
-      <w:r>
-        <w:rPr>
-          <w:b w:val="1"/>
-          <w:bCs w:val="1"/>
-          <w:color w:val="1155cc"/>
-          <w:sz w:val="24"/>
-          <w:szCs w:val="24"/>
-          <w:rtl w:val="0"/>
-        </w:rPr>
-        <w:t xml:space="preserve">Ce niveau représente le levier de différenciation le plus puissant du système. Un message Niveau 3 bien exécuté ne ressemble à aucun autre message de prospection - il prouve que l'agent a réellement lu et compris les posts du prospect.</w:t>
-      </w:r>
-      <w:commentRangeEnd w:id="5"/>
-      <w:r>
-        <w:rPr>
-          <w:rStyle w:val="CommentReference"/>
-        </w:rPr>
-        <w:commentReference w:id="5"/>
-      </w:r>
-    </w:p>
-    <w:p/>
-    <w:p>
+    </w:p>
+    <w:p>
+      <w:commentRangeStart w:id="5"/>
       <w:pPr>
         <w:pStyle w:val="Heading3"/>
         <w:keepNext w:val="0"/>
@@ -14592,10 +14572,16 @@
           <w:szCs w:val="24"/>
           <w:rtl w:val="0"/>
         </w:rPr>
-        <w:t xml:space="preserve">Structure du message Niveau 3 :</w:t>
-      </w:r>
-    </w:p>
-    <w:p/>
+        <w:t xml:space="preserve">Ce niveau représente le levier de différenciation le plus puissant du système. Un message Niveau 3 bien exécuté ne ressemble à aucun autre message de prospection - il prouve que l'agent a réellement lu et compris les posts du prospect.</w:t>
+      </w:r>
+      <w:commentRangeEnd w:id="5"/>
+      <w:r>
+        <w:rPr>
+          <w:rStyle w:val="CommentReference"/>
+        </w:rPr>
+        <w:commentReference w:id="5"/>
+      </w:r>
+    </w:p>
     <w:p>
       <w:pPr>
         <w:pStyle w:val="Heading3"/>
@@ -14610,19 +14596,7 @@
           <w:szCs w:val="24"/>
         </w:rPr>
       </w:pPr>
-      <w:r>
-        <w:rPr>
-          <w:b w:val="1"/>
-          <w:bCs w:val="1"/>
-          <w:color w:val="1155cc"/>
-          <w:sz w:val="24"/>
-          <w:szCs w:val="24"/>
-          <w:rtl w:val="0"/>
-        </w:rPr>
-        <w:t xml:space="preserve">[Question sur leur vision ou leur approche] + parce que [enrobage ancré dans UN post ou UNE thématique spécifique de leur contenu]</w:t>
-      </w:r>
-    </w:p>
-    <w:p/>
+    </w:p>
     <w:p>
       <w:pPr>
         <w:pStyle w:val="Heading3"/>
@@ -14646,10 +14620,9 @@
           <w:szCs w:val="24"/>
           <w:rtl w:val="0"/>
         </w:rPr>
-        <w:t xml:space="preserve">Extraction des deux variables clés :</w:t>
-      </w:r>
-    </w:p>
-    <w:p/>
+        <w:t xml:space="preserve">Structure du message Niveau 3 :</w:t>
+      </w:r>
+    </w:p>
     <w:p>
       <w:pPr>
         <w:pStyle w:val="Heading3"/>
@@ -14664,19 +14637,7 @@
           <w:szCs w:val="24"/>
         </w:rPr>
       </w:pPr>
-      <w:r>
-        <w:rPr>
-          <w:b w:val="1"/>
-          <w:bCs w:val="1"/>
-          <w:color w:val="1155cc"/>
-          <w:sz w:val="24"/>
-          <w:szCs w:val="24"/>
-          <w:rtl w:val="0"/>
-        </w:rPr>
-        <w:t xml:space="preserve">[TA THÈSE] = La conviction forte que le prospect défend dans ses posts. Ce qu'il répète, ce qu'il contre-argumente, ce qu'il enseigne. Sa prise de position distinctive.</w:t>
-      </w:r>
-    </w:p>
-    <w:p/>
+    </w:p>
     <w:p>
       <w:pPr>
         <w:pStyle w:val="Heading3"/>
@@ -14700,12 +14661,10 @@
           <w:szCs w:val="24"/>
           <w:rtl w:val="0"/>
         </w:rPr>
-        <w:t xml:space="preserve">[LE FREIN PRINCIPAL] = L'obstacle ou la croyance que le prospect identifie chez son audience cible. Ce contre quoi il se bat dans son contenu. La résistance qu'il essaie de lever.</w:t>
-      </w:r>
-    </w:p>
-    <w:p/>
-    <w:p>
-      <w:commentRangeStart w:id="6"/>
+        <w:t xml:space="preserve">[Question sur leur vision ou leur approche] + parce que [enrobage ancré dans UN post ou UNE thématique spécifique de leur contenu]</w:t>
+      </w:r>
+    </w:p>
+    <w:p>
       <w:pPr>
         <w:pStyle w:val="Heading3"/>
         <w:keepNext w:val="0"/>
@@ -14719,26 +14678,7 @@
           <w:szCs w:val="24"/>
         </w:rPr>
       </w:pPr>
-      <w:r>
-        <w:rPr>
-          <w:b w:val="1"/>
-          <w:bCs w:val="1"/>
-          <w:color w:val="1155cc"/>
-          <w:sz w:val="24"/>
-          <w:szCs w:val="24"/>
-          <w:rtl w:val="0"/>
-        </w:rPr>
-        <w:t xml:space="preserve">Règle quand il n'y a pas assez d'éléments pour construire l'insight :</w:t>
-      </w:r>
-      <w:commentRangeEnd w:id="6"/>
-      <w:r>
-        <w:rPr>
-          <w:rStyle w:val="CommentReference"/>
-        </w:rPr>
-        <w:commentReference w:id="6"/>
-      </w:r>
-    </w:p>
-    <w:p/>
+    </w:p>
     <w:p>
       <w:pPr>
         <w:pStyle w:val="Heading3"/>
@@ -14762,10 +14702,9 @@
           <w:szCs w:val="24"/>
           <w:rtl w:val="0"/>
         </w:rPr>
-        <w:t xml:space="preserve">Sous-cas A - Le secteur permet une tension identifiable (freelances, coachs, consultants, fondateurs, etc.) : utiliser une question ancrée dans la tension connue du secteur, sans prétendre avoir lu un post spécifique.</w:t>
-      </w:r>
-    </w:p>
-    <w:p/>
+        <w:t xml:space="preserve">Extraction des deux variables clés :</w:t>
+      </w:r>
+    </w:p>
     <w:p>
       <w:pPr>
         <w:pStyle w:val="Heading3"/>
@@ -14780,19 +14719,7 @@
           <w:szCs w:val="24"/>
         </w:rPr>
       </w:pPr>
-      <w:r>
-        <w:rPr>
-          <w:b w:val="1"/>
-          <w:bCs w:val="1"/>
-          <w:color w:val="1155cc"/>
-          <w:sz w:val="24"/>
-          <w:szCs w:val="24"/>
-          <w:rtl w:val="0"/>
-        </w:rPr>
-        <w:t xml:space="preserve">Sous-cas B - Profil trop générique ou trop peu actif : utiliser une question universelle sur l'acquisition ou la visibilité, formulée de façon ouverte.</w:t>
-      </w:r>
-    </w:p>
-    <w:p/>
+    </w:p>
     <w:p>
       <w:pPr>
         <w:pStyle w:val="Heading3"/>
@@ -14816,11 +14743,10 @@
           <w:szCs w:val="24"/>
           <w:rtl w:val="0"/>
         </w:rPr>
-        <w:t xml:space="preserve">Dans les deux cas, la structure reste : [Question] + parce que [enrobage honnête sans surjouer la personnalisation].</w:t>
-      </w:r>
-    </w:p>
-    <w:p>
-      <w:commentRangeStart w:id="7"/>
+        <w:t xml:space="preserve">[TA THÈSE] = La conviction forte que le prospect défend dans ses posts. Ce qu'il répète, ce qu'il contre-argumente, ce qu'il enseigne. Sa prise de position distinctive.</w:t>
+      </w:r>
+    </w:p>
+    <w:p>
       <w:pPr>
         <w:pStyle w:val="Heading3"/>
         <w:keepNext w:val="0"/>
@@ -14834,26 +14760,7 @@
           <w:szCs w:val="24"/>
         </w:rPr>
       </w:pPr>
-      <w:r>
-        <w:rPr>
-          <w:b w:val="1"/>
-          <w:bCs w:val="1"/>
-          <w:color w:val="1155cc"/>
-          <w:sz w:val="24"/>
-          <w:szCs w:val="24"/>
-          <w:rtl w:val="0"/>
-        </w:rPr>
-        <w:t xml:space="preserve">Exemples par secteur (Niveau 3) :</w:t>
-      </w:r>
-      <w:commentRangeEnd w:id="7"/>
-      <w:r>
-        <w:rPr>
-          <w:rStyle w:val="CommentReference"/>
-        </w:rPr>
-        <w:commentReference w:id="7"/>
-      </w:r>
-    </w:p>
-    <w:p/>
+    </w:p>
     <w:p>
       <w:pPr>
         <w:pStyle w:val="Heading3"/>
@@ -14877,7 +14784,7 @@
           <w:szCs w:val="24"/>
           <w:rtl w:val="0"/>
         </w:rPr>
-        <w:t xml:space="preserve">Coach business :</w:t>
+        <w:t xml:space="preserve">[LE FREIN PRINCIPAL] = L'obstacle ou la croyance que le prospect identifie chez son audience cible. Ce contre quoi il se bat dans son contenu. La résistance qu'il essaie de lever.</w:t>
       </w:r>
     </w:p>
     <w:p>
@@ -14894,20 +14801,9 @@
           <w:szCs w:val="24"/>
         </w:rPr>
       </w:pPr>
-      <w:r>
-        <w:rPr>
-          <w:b w:val="1"/>
-          <w:bCs w:val="1"/>
-          <w:color w:val="1155cc"/>
-          <w:sz w:val="24"/>
-          <w:szCs w:val="24"/>
-          <w:rtl w:val="0"/>
-        </w:rPr>
-        <w:t xml:space="preserve">Option A : "C'est quoi ton approche quand un client arrive convaincu que son problème c'est le mindset, alors que toi tu vois clairement que c'est son offre qui est mal positionnée ? parce que j'ai été accompagné par quelqu'un qui m'a forcé à retravailler mon positionnement avant même de toucher à ma façon de penser, et ça a tout changé."</w:t>
-      </w:r>
-    </w:p>
-    <w:p/>
-    <w:p>
+    </w:p>
+    <w:p>
+      <w:commentRangeStart w:id="6"/>
       <w:pPr>
         <w:pStyle w:val="Heading3"/>
         <w:keepNext w:val="0"/>
@@ -14930,10 +14826,16 @@
           <w:szCs w:val="24"/>
           <w:rtl w:val="0"/>
         </w:rPr>
-        <w:t xml:space="preserve">Option B : "Comment tu fais tenir quelqu'un dans la durée quand les premiers résultats tardent ? parce que j'ai remarqué que dans tes posts tu parles beaucoup d'engagement sur le long terme, et je me demandais ce que ça donnait concrètement côté accompagnement."</w:t>
-      </w:r>
-    </w:p>
-    <w:p/>
+        <w:t xml:space="preserve">Règle quand il n'y a pas assez d'éléments pour construire l'insight :</w:t>
+      </w:r>
+      <w:commentRangeEnd w:id="6"/>
+      <w:r>
+        <w:rPr>
+          <w:rStyle w:val="CommentReference"/>
+        </w:rPr>
+        <w:commentReference w:id="6"/>
+      </w:r>
+    </w:p>
     <w:p>
       <w:pPr>
         <w:pStyle w:val="Heading3"/>
@@ -14948,17 +14850,6 @@
           <w:szCs w:val="24"/>
         </w:rPr>
       </w:pPr>
-      <w:r>
-        <w:rPr>
-          <w:b w:val="1"/>
-          <w:bCs w:val="1"/>
-          <w:color w:val="1155cc"/>
-          <w:sz w:val="24"/>
-          <w:szCs w:val="24"/>
-          <w:rtl w:val="0"/>
-        </w:rPr>
-        <w:t xml:space="preserve">Freelance / Assistant virtuel :</w:t>
-      </w:r>
     </w:p>
     <w:p>
       <w:pPr>
@@ -14983,10 +14874,9 @@
           <w:szCs w:val="24"/>
           <w:rtl w:val="0"/>
         </w:rPr>
-        <w:t xml:space="preserve">Option A : "C'est quoi ton approche quand un prospect te dit que tu es trop cher mais que tu sens qu'il a vraiment besoin de toi ? parce que dans tes posts tu parles souvent de comment te positionner, et je me demandais comment tu gérais cette tension-là."</w:t>
-      </w:r>
-    </w:p>
-    <w:p/>
+        <w:t xml:space="preserve">Sous-cas A - Le secteur permet une tension identifiable (freelances, coachs, consultants, fondateurs, etc.) : utiliser une question ancrée dans la tension connue du secteur, sans prétendre avoir lu un post spécifique.</w:t>
+      </w:r>
+    </w:p>
     <w:p>
       <w:pPr>
         <w:pStyle w:val="Heading3"/>
@@ -15001,19 +14891,7 @@
           <w:szCs w:val="24"/>
         </w:rPr>
       </w:pPr>
-      <w:r>
-        <w:rPr>
-          <w:b w:val="1"/>
-          <w:bCs w:val="1"/>
-          <w:color w:val="1155cc"/>
-          <w:sz w:val="24"/>
-          <w:szCs w:val="24"/>
-          <w:rtl w:val="0"/>
-        </w:rPr>
-        <w:t xml:space="preserve">Option B : "Comment tu gères la période creuse entre deux missions ? parce que j'ai l'impression que dans ce que tu partages tu défends l'idée que l'acquisition ça doit être régulier, pas en mode panique."</w:t>
-      </w:r>
-    </w:p>
-    <w:p/>
+    </w:p>
     <w:p>
       <w:pPr>
         <w:pStyle w:val="Heading3"/>
@@ -15037,10 +14915,9 @@
           <w:szCs w:val="24"/>
           <w:rtl w:val="0"/>
         </w:rPr>
-        <w:t xml:space="preserve">Option C : "C'est quoi le truc que tu aurais aimé savoir sur la prospection quand tu as démarré en freelance ? parce que en lisant tes posts j'ai l'impression que t'as traversé pas mal de phases avant de trouver ce qui marche."</w:t>
-      </w:r>
-    </w:p>
-    <w:p/>
+        <w:t xml:space="preserve">Sous-cas B - Profil trop générique ou trop peu actif : utiliser une question universelle sur l'acquisition ou la visibilité, formulée de façon ouverte.</w:t>
+      </w:r>
+    </w:p>
     <w:p>
       <w:pPr>
         <w:pStyle w:val="Heading3"/>
@@ -15055,17 +14932,6 @@
           <w:szCs w:val="24"/>
         </w:rPr>
       </w:pPr>
-      <w:r>
-        <w:rPr>
-          <w:b w:val="1"/>
-          <w:bCs w:val="1"/>
-          <w:color w:val="1155cc"/>
-          <w:sz w:val="24"/>
-          <w:szCs w:val="24"/>
-          <w:rtl w:val="0"/>
-        </w:rPr>
-        <w:t xml:space="preserve">Fondateur SaaS :</w:t>
-      </w:r>
     </w:p>
     <w:p>
       <w:pPr>
@@ -15090,11 +14956,11 @@
           <w:szCs w:val="24"/>
           <w:rtl w:val="0"/>
         </w:rPr>
-        <w:t xml:space="preserve">Option A : "C'est quoi le moment où tu as réalisé que ce que tu construisais n'était pas ce que tes utilisateurs voulaient vraiment ? parce que je suis le build in public d'un fondateur en ce moment, et ce qui est revenu c'est ce moment où il a réalisé que ses utilisateurs voulaient quelque chose de complètement différent de ce qu'il avait passé des mois à construire."</w:t>
-      </w:r>
-    </w:p>
-    <w:p/>
-    <w:p>
+        <w:t xml:space="preserve">Dans les deux cas, la structure reste : [Question] + parce que [enrobage honnête sans surjouer la personnalisation].</w:t>
+      </w:r>
+    </w:p>
+    <w:p>
+      <w:commentRangeStart w:id="7"/>
       <w:pPr>
         <w:pStyle w:val="Heading3"/>
         <w:keepNext w:val="0"/>
@@ -15117,10 +14983,16 @@
           <w:szCs w:val="24"/>
           <w:rtl w:val="0"/>
         </w:rPr>
-        <w:t xml:space="preserve">Option B : "Comment tu gères l'écart entre ce que tu veux construire et ce que le marché te demande de construire ? parce que dans tes posts tu sembles naviguer constamment entre vision long terme et feedback immédiat."</w:t>
-      </w:r>
-    </w:p>
-    <w:p/>
+        <w:t xml:space="preserve">Exemples par secteur (Niveau 3) :</w:t>
+      </w:r>
+      <w:commentRangeEnd w:id="7"/>
+      <w:r>
+        <w:rPr>
+          <w:rStyle w:val="CommentReference"/>
+        </w:rPr>
+        <w:commentReference w:id="7"/>
+      </w:r>
+    </w:p>
     <w:p>
       <w:pPr>
         <w:pStyle w:val="Heading3"/>
@@ -15135,17 +15007,6 @@
           <w:szCs w:val="24"/>
         </w:rPr>
       </w:pPr>
-      <w:r>
-        <w:rPr>
-          <w:b w:val="1"/>
-          <w:bCs w:val="1"/>
-          <w:color w:val="1155cc"/>
-          <w:sz w:val="24"/>
-          <w:szCs w:val="24"/>
-          <w:rtl w:val="0"/>
-        </w:rPr>
-        <w:t xml:space="preserve">Webdesigner :</w:t>
-      </w:r>
     </w:p>
     <w:p>
       <w:pPr>
@@ -15170,10 +15031,9 @@
           <w:szCs w:val="24"/>
           <w:rtl w:val="0"/>
         </w:rPr>
-        <w:t xml:space="preserve">Option A : "C'est quoi ton approche quand un client veut quelque chose qui va à l'encontre de ce qui est bon pour lui ? parce que j'ai lu un de tes posts où tu parlais de devoir éduquer les clients, et je me demandais comment tu posais ça dans la pratique."</w:t>
-      </w:r>
-    </w:p>
-    <w:p/>
+        <w:t xml:space="preserve">Coach business :</w:t>
+      </w:r>
+    </w:p>
     <w:p>
       <w:pPr>
         <w:pStyle w:val="Heading3"/>
@@ -15197,10 +15057,9 @@
           <w:szCs w:val="24"/>
           <w:rtl w:val="0"/>
         </w:rPr>
-        <w:t xml:space="preserve">Option B : "Comment tu justifies tes choix de design à un client qui ne comprend pas pourquoi ça vaut le prix ? parce que j'ai l'impression que dans ce que tu partages tu défends une vision très précise de la valeur du design, et ça m'a intrigué."</w:t>
-      </w:r>
-    </w:p>
-    <w:p/>
+        <w:t xml:space="preserve">Option A : "C'est quoi ton approche quand un client arrive convaincu que son problème c'est le mindset, alors que toi tu vois clairement que c'est son offre qui est mal positionnée ? parce que j'ai été accompagné par quelqu'un qui m'a forcé à retravailler mon positionnement avant même de toucher à ma façon de penser, et ça a tout changé."</w:t>
+      </w:r>
+    </w:p>
     <w:p>
       <w:pPr>
         <w:pStyle w:val="Heading3"/>
@@ -15215,19 +15074,7 @@
           <w:szCs w:val="24"/>
         </w:rPr>
       </w:pPr>
-      <w:r>
-        <w:rPr>
-          <w:b w:val="1"/>
-          <w:bCs w:val="1"/>
-          <w:color w:val="1155cc"/>
-          <w:sz w:val="24"/>
-          <w:szCs w:val="24"/>
-          <w:rtl w:val="0"/>
-        </w:rPr>
-        <w:t xml:space="preserve">Option C : "C'est quoi le moment dans un projet où tu sens que le client commence à faire confiance à ton jugement plutôt que d'imposer le sien ? parce que dans tes posts tu parles souvent de cette dynamique client-designer, et j'aimerais comprendre comment tu construis ça."</w:t>
-      </w:r>
-    </w:p>
-    <w:p/>
+    </w:p>
     <w:p>
       <w:pPr>
         <w:pStyle w:val="Heading3"/>
@@ -15251,7 +15098,7 @@
           <w:szCs w:val="24"/>
           <w:rtl w:val="0"/>
         </w:rPr>
-        <w:t xml:space="preserve">Dirigeant d'agence / Corporate :</w:t>
+        <w:t xml:space="preserve">Option B : "Comment tu fais tenir quelqu'un dans la durée quand les premiers résultats tardent ? parce que j'ai remarqué que dans tes posts tu parles beaucoup d'engagement sur le long terme, et je me demandais ce que ça donnait concrètement côté accompagnement."</w:t>
       </w:r>
     </w:p>
     <w:p>
@@ -15268,19 +15115,480 @@
           <w:szCs w:val="24"/>
         </w:rPr>
       </w:pPr>
-      <w:r>
+    </w:p>
+    <w:p>
+      <w:pPr>
+        <w:pStyle w:val="Heading3"/>
+        <w:keepNext w:val="0"/>
+        <w:keepLines w:val="0"/>
+        <w:spacing w:after="60" w:before="300" w:lineRule="auto"/>
         <w:rPr>
           <w:b w:val="1"/>
           <w:bCs w:val="1"/>
           <w:color w:val="1155cc"/>
           <w:sz w:val="24"/>
           <w:szCs w:val="24"/>
+        </w:rPr>
+      </w:pPr>
+      <w:r>
+        <w:rPr>
+          <w:b w:val="1"/>
+          <w:bCs w:val="1"/>
+          <w:color w:val="1155cc"/>
+          <w:sz w:val="24"/>
+          <w:szCs w:val="24"/>
+          <w:rtl w:val="0"/>
+        </w:rPr>
+        <w:t xml:space="preserve">Freelance / Assistant virtuel :</w:t>
+      </w:r>
+    </w:p>
+    <w:p>
+      <w:pPr>
+        <w:pStyle w:val="Heading3"/>
+        <w:keepNext w:val="0"/>
+        <w:keepLines w:val="0"/>
+        <w:spacing w:after="60" w:before="300" w:lineRule="auto"/>
+        <w:rPr>
+          <w:b w:val="1"/>
+          <w:bCs w:val="1"/>
+          <w:color w:val="1155cc"/>
+          <w:sz w:val="24"/>
+          <w:szCs w:val="24"/>
+        </w:rPr>
+      </w:pPr>
+      <w:r>
+        <w:rPr>
+          <w:b w:val="1"/>
+          <w:bCs w:val="1"/>
+          <w:color w:val="1155cc"/>
+          <w:sz w:val="24"/>
+          <w:szCs w:val="24"/>
+          <w:rtl w:val="0"/>
+        </w:rPr>
+        <w:t xml:space="preserve">Option A : "C'est quoi ton approche quand un prospect te dit que tu es trop cher mais que tu sens qu'il a vraiment besoin de toi ? parce que dans tes posts tu parles souvent de comment te positionner, et je me demandais comment tu gérais cette tension-là."</w:t>
+      </w:r>
+    </w:p>
+    <w:p>
+      <w:pPr>
+        <w:pStyle w:val="Heading3"/>
+        <w:keepNext w:val="0"/>
+        <w:keepLines w:val="0"/>
+        <w:spacing w:after="60" w:before="300" w:lineRule="auto"/>
+        <w:rPr>
+          <w:b w:val="1"/>
+          <w:bCs w:val="1"/>
+          <w:color w:val="1155cc"/>
+          <w:sz w:val="24"/>
+          <w:szCs w:val="24"/>
+        </w:rPr>
+      </w:pPr>
+    </w:p>
+    <w:p>
+      <w:pPr>
+        <w:pStyle w:val="Heading3"/>
+        <w:keepNext w:val="0"/>
+        <w:keepLines w:val="0"/>
+        <w:spacing w:after="60" w:before="300" w:lineRule="auto"/>
+        <w:rPr>
+          <w:b w:val="1"/>
+          <w:bCs w:val="1"/>
+          <w:color w:val="1155cc"/>
+          <w:sz w:val="24"/>
+          <w:szCs w:val="24"/>
+        </w:rPr>
+      </w:pPr>
+      <w:r>
+        <w:rPr>
+          <w:b w:val="1"/>
+          <w:bCs w:val="1"/>
+          <w:color w:val="1155cc"/>
+          <w:sz w:val="24"/>
+          <w:szCs w:val="24"/>
+          <w:rtl w:val="0"/>
+        </w:rPr>
+        <w:t xml:space="preserve">Option B : "Comment tu gères la période creuse entre deux missions ? parce que j'ai l'impression que dans ce que tu partages tu défends l'idée que l'acquisition ça doit être régulier, pas en mode panique."</w:t>
+      </w:r>
+    </w:p>
+    <w:p>
+      <w:pPr>
+        <w:pStyle w:val="Heading3"/>
+        <w:keepNext w:val="0"/>
+        <w:keepLines w:val="0"/>
+        <w:spacing w:after="60" w:before="300" w:lineRule="auto"/>
+        <w:rPr>
+          <w:b w:val="1"/>
+          <w:bCs w:val="1"/>
+          <w:color w:val="1155cc"/>
+          <w:sz w:val="24"/>
+          <w:szCs w:val="24"/>
+        </w:rPr>
+      </w:pPr>
+    </w:p>
+    <w:p>
+      <w:pPr>
+        <w:pStyle w:val="Heading3"/>
+        <w:keepNext w:val="0"/>
+        <w:keepLines w:val="0"/>
+        <w:spacing w:after="60" w:before="300" w:lineRule="auto"/>
+        <w:rPr>
+          <w:b w:val="1"/>
+          <w:bCs w:val="1"/>
+          <w:color w:val="1155cc"/>
+          <w:sz w:val="24"/>
+          <w:szCs w:val="24"/>
+        </w:rPr>
+      </w:pPr>
+      <w:r>
+        <w:rPr>
+          <w:b w:val="1"/>
+          <w:bCs w:val="1"/>
+          <w:color w:val="1155cc"/>
+          <w:sz w:val="24"/>
+          <w:szCs w:val="24"/>
+          <w:rtl w:val="0"/>
+        </w:rPr>
+        <w:t xml:space="preserve">Option C : "C'est quoi le truc que tu aurais aimé savoir sur la prospection quand tu as démarré en freelance ? parce que en lisant tes posts j'ai l'impression que t'as traversé pas mal de phases avant de trouver ce qui marche."</w:t>
+      </w:r>
+    </w:p>
+    <w:p>
+      <w:pPr>
+        <w:pStyle w:val="Heading3"/>
+        <w:keepNext w:val="0"/>
+        <w:keepLines w:val="0"/>
+        <w:spacing w:after="60" w:before="300" w:lineRule="auto"/>
+        <w:rPr>
+          <w:b w:val="1"/>
+          <w:bCs w:val="1"/>
+          <w:color w:val="1155cc"/>
+          <w:sz w:val="24"/>
+          <w:szCs w:val="24"/>
+        </w:rPr>
+      </w:pPr>
+    </w:p>
+    <w:p>
+      <w:pPr>
+        <w:pStyle w:val="Heading3"/>
+        <w:keepNext w:val="0"/>
+        <w:keepLines w:val="0"/>
+        <w:spacing w:after="60" w:before="300" w:lineRule="auto"/>
+        <w:rPr>
+          <w:b w:val="1"/>
+          <w:bCs w:val="1"/>
+          <w:color w:val="1155cc"/>
+          <w:sz w:val="24"/>
+          <w:szCs w:val="24"/>
+        </w:rPr>
+      </w:pPr>
+      <w:r>
+        <w:rPr>
+          <w:b w:val="1"/>
+          <w:bCs w:val="1"/>
+          <w:color w:val="1155cc"/>
+          <w:sz w:val="24"/>
+          <w:szCs w:val="24"/>
+          <w:rtl w:val="0"/>
+        </w:rPr>
+        <w:t xml:space="preserve">Fondateur SaaS :</w:t>
+      </w:r>
+    </w:p>
+    <w:p>
+      <w:pPr>
+        <w:pStyle w:val="Heading3"/>
+        <w:keepNext w:val="0"/>
+        <w:keepLines w:val="0"/>
+        <w:spacing w:after="60" w:before="300" w:lineRule="auto"/>
+        <w:rPr>
+          <w:b w:val="1"/>
+          <w:bCs w:val="1"/>
+          <w:color w:val="1155cc"/>
+          <w:sz w:val="24"/>
+          <w:szCs w:val="24"/>
+        </w:rPr>
+      </w:pPr>
+      <w:r>
+        <w:rPr>
+          <w:b w:val="1"/>
+          <w:bCs w:val="1"/>
+          <w:color w:val="1155cc"/>
+          <w:sz w:val="24"/>
+          <w:szCs w:val="24"/>
+          <w:rtl w:val="0"/>
+        </w:rPr>
+        <w:t xml:space="preserve">Option A : "C'est quoi le moment où tu as réalisé que ce que tu construisais n'était pas ce que tes utilisateurs voulaient vraiment ? parce que je suis le build in public d'un fondateur en ce moment, et ce qui est revenu c'est ce moment où il a réalisé que ses utilisateurs voulaient quelque chose de complètement différent de ce qu'il avait passé des mois à construire."</w:t>
+      </w:r>
+    </w:p>
+    <w:p>
+      <w:pPr>
+        <w:pStyle w:val="Heading3"/>
+        <w:keepNext w:val="0"/>
+        <w:keepLines w:val="0"/>
+        <w:spacing w:after="60" w:before="300" w:lineRule="auto"/>
+        <w:rPr>
+          <w:b w:val="1"/>
+          <w:bCs w:val="1"/>
+          <w:color w:val="1155cc"/>
+          <w:sz w:val="24"/>
+          <w:szCs w:val="24"/>
+        </w:rPr>
+      </w:pPr>
+    </w:p>
+    <w:p>
+      <w:pPr>
+        <w:pStyle w:val="Heading3"/>
+        <w:keepNext w:val="0"/>
+        <w:keepLines w:val="0"/>
+        <w:spacing w:after="60" w:before="300" w:lineRule="auto"/>
+        <w:rPr>
+          <w:b w:val="1"/>
+          <w:bCs w:val="1"/>
+          <w:color w:val="1155cc"/>
+          <w:sz w:val="24"/>
+          <w:szCs w:val="24"/>
+        </w:rPr>
+      </w:pPr>
+      <w:r>
+        <w:rPr>
+          <w:b w:val="1"/>
+          <w:bCs w:val="1"/>
+          <w:color w:val="1155cc"/>
+          <w:sz w:val="24"/>
+          <w:szCs w:val="24"/>
+          <w:rtl w:val="0"/>
+        </w:rPr>
+        <w:t xml:space="preserve">Option B : "Comment tu gères l'écart entre ce que tu veux construire et ce que le marché te demande de construire ? parce que dans tes posts tu sembles naviguer constamment entre vision long terme et feedback immédiat."</w:t>
+      </w:r>
+    </w:p>
+    <w:p>
+      <w:pPr>
+        <w:pStyle w:val="Heading3"/>
+        <w:keepNext w:val="0"/>
+        <w:keepLines w:val="0"/>
+        <w:spacing w:after="60" w:before="300" w:lineRule="auto"/>
+        <w:rPr>
+          <w:b w:val="1"/>
+          <w:bCs w:val="1"/>
+          <w:color w:val="1155cc"/>
+          <w:sz w:val="24"/>
+          <w:szCs w:val="24"/>
+        </w:rPr>
+      </w:pPr>
+    </w:p>
+    <w:p>
+      <w:pPr>
+        <w:pStyle w:val="Heading3"/>
+        <w:keepNext w:val="0"/>
+        <w:keepLines w:val="0"/>
+        <w:spacing w:after="60" w:before="300" w:lineRule="auto"/>
+        <w:rPr>
+          <w:b w:val="1"/>
+          <w:bCs w:val="1"/>
+          <w:color w:val="1155cc"/>
+          <w:sz w:val="24"/>
+          <w:szCs w:val="24"/>
+        </w:rPr>
+      </w:pPr>
+      <w:r>
+        <w:rPr>
+          <w:b w:val="1"/>
+          <w:bCs w:val="1"/>
+          <w:color w:val="1155cc"/>
+          <w:sz w:val="24"/>
+          <w:szCs w:val="24"/>
+          <w:rtl w:val="0"/>
+        </w:rPr>
+        <w:t xml:space="preserve">Webdesigner :</w:t>
+      </w:r>
+    </w:p>
+    <w:p>
+      <w:pPr>
+        <w:pStyle w:val="Heading3"/>
+        <w:keepNext w:val="0"/>
+        <w:keepLines w:val="0"/>
+        <w:spacing w:after="60" w:before="300" w:lineRule="auto"/>
+        <w:rPr>
+          <w:b w:val="1"/>
+          <w:bCs w:val="1"/>
+          <w:color w:val="1155cc"/>
+          <w:sz w:val="24"/>
+          <w:szCs w:val="24"/>
+        </w:rPr>
+      </w:pPr>
+      <w:r>
+        <w:rPr>
+          <w:b w:val="1"/>
+          <w:bCs w:val="1"/>
+          <w:color w:val="1155cc"/>
+          <w:sz w:val="24"/>
+          <w:szCs w:val="24"/>
+          <w:rtl w:val="0"/>
+        </w:rPr>
+        <w:t xml:space="preserve">Option A : "C'est quoi ton approche quand un client veut quelque chose qui va à l'encontre de ce qui est bon pour lui ? parce que j'ai lu un de tes posts où tu parlais de devoir éduquer les clients, et je me demandais comment tu posais ça dans la pratique."</w:t>
+      </w:r>
+    </w:p>
+    <w:p>
+      <w:pPr>
+        <w:pStyle w:val="Heading3"/>
+        <w:keepNext w:val="0"/>
+        <w:keepLines w:val="0"/>
+        <w:spacing w:after="60" w:before="300" w:lineRule="auto"/>
+        <w:rPr>
+          <w:b w:val="1"/>
+          <w:bCs w:val="1"/>
+          <w:color w:val="1155cc"/>
+          <w:sz w:val="24"/>
+          <w:szCs w:val="24"/>
+        </w:rPr>
+      </w:pPr>
+    </w:p>
+    <w:p>
+      <w:pPr>
+        <w:pStyle w:val="Heading3"/>
+        <w:keepNext w:val="0"/>
+        <w:keepLines w:val="0"/>
+        <w:spacing w:after="60" w:before="300" w:lineRule="auto"/>
+        <w:rPr>
+          <w:b w:val="1"/>
+          <w:bCs w:val="1"/>
+          <w:color w:val="1155cc"/>
+          <w:sz w:val="24"/>
+          <w:szCs w:val="24"/>
+        </w:rPr>
+      </w:pPr>
+      <w:r>
+        <w:rPr>
+          <w:b w:val="1"/>
+          <w:bCs w:val="1"/>
+          <w:color w:val="1155cc"/>
+          <w:sz w:val="24"/>
+          <w:szCs w:val="24"/>
+          <w:rtl w:val="0"/>
+        </w:rPr>
+        <w:t xml:space="preserve">Option B : "Comment tu justifies tes choix de design à un client qui ne comprend pas pourquoi ça vaut le prix ? parce que j'ai l'impression que dans ce que tu partages tu défends une vision très précise de la valeur du design, et ça m'a intrigué."</w:t>
+      </w:r>
+    </w:p>
+    <w:p>
+      <w:pPr>
+        <w:pStyle w:val="Heading3"/>
+        <w:keepNext w:val="0"/>
+        <w:keepLines w:val="0"/>
+        <w:spacing w:after="60" w:before="300" w:lineRule="auto"/>
+        <w:rPr>
+          <w:b w:val="1"/>
+          <w:bCs w:val="1"/>
+          <w:color w:val="1155cc"/>
+          <w:sz w:val="24"/>
+          <w:szCs w:val="24"/>
+        </w:rPr>
+      </w:pPr>
+    </w:p>
+    <w:p>
+      <w:pPr>
+        <w:pStyle w:val="Heading3"/>
+        <w:keepNext w:val="0"/>
+        <w:keepLines w:val="0"/>
+        <w:spacing w:after="60" w:before="300" w:lineRule="auto"/>
+        <w:rPr>
+          <w:b w:val="1"/>
+          <w:bCs w:val="1"/>
+          <w:color w:val="1155cc"/>
+          <w:sz w:val="24"/>
+          <w:szCs w:val="24"/>
+        </w:rPr>
+      </w:pPr>
+      <w:r>
+        <w:rPr>
+          <w:b w:val="1"/>
+          <w:bCs w:val="1"/>
+          <w:color w:val="1155cc"/>
+          <w:sz w:val="24"/>
+          <w:szCs w:val="24"/>
+          <w:rtl w:val="0"/>
+        </w:rPr>
+        <w:t xml:space="preserve">Option C : "C'est quoi le moment dans un projet où tu sens que le client commence à faire confiance à ton jugement plutôt que d'imposer le sien ? parce que dans tes posts tu parles souvent de cette dynamique client-designer, et j'aimerais comprendre comment tu construis ça."</w:t>
+      </w:r>
+    </w:p>
+    <w:p>
+      <w:pPr>
+        <w:pStyle w:val="Heading3"/>
+        <w:keepNext w:val="0"/>
+        <w:keepLines w:val="0"/>
+        <w:spacing w:after="60" w:before="300" w:lineRule="auto"/>
+        <w:rPr>
+          <w:b w:val="1"/>
+          <w:bCs w:val="1"/>
+          <w:color w:val="1155cc"/>
+          <w:sz w:val="24"/>
+          <w:szCs w:val="24"/>
+        </w:rPr>
+      </w:pPr>
+    </w:p>
+    <w:p>
+      <w:pPr>
+        <w:pStyle w:val="Heading3"/>
+        <w:keepNext w:val="0"/>
+        <w:keepLines w:val="0"/>
+        <w:spacing w:after="60" w:before="300" w:lineRule="auto"/>
+        <w:rPr>
+          <w:b w:val="1"/>
+          <w:bCs w:val="1"/>
+          <w:color w:val="1155cc"/>
+          <w:sz w:val="24"/>
+          <w:szCs w:val="24"/>
+        </w:rPr>
+      </w:pPr>
+      <w:r>
+        <w:rPr>
+          <w:b w:val="1"/>
+          <w:bCs w:val="1"/>
+          <w:color w:val="1155cc"/>
+          <w:sz w:val="24"/>
+          <w:szCs w:val="24"/>
+          <w:rtl w:val="0"/>
+        </w:rPr>
+        <w:t xml:space="preserve">Dirigeant d'agence / Corporate :</w:t>
+      </w:r>
+    </w:p>
+    <w:p>
+      <w:pPr>
+        <w:pStyle w:val="Heading3"/>
+        <w:keepNext w:val="0"/>
+        <w:keepLines w:val="0"/>
+        <w:spacing w:after="60" w:before="300" w:lineRule="auto"/>
+        <w:rPr>
+          <w:b w:val="1"/>
+          <w:bCs w:val="1"/>
+          <w:color w:val="1155cc"/>
+          <w:sz w:val="24"/>
+          <w:szCs w:val="24"/>
+        </w:rPr>
+      </w:pPr>
+      <w:r>
+        <w:rPr>
+          <w:b w:val="1"/>
+          <w:bCs w:val="1"/>
+          <w:color w:val="1155cc"/>
+          <w:sz w:val="24"/>
+          <w:szCs w:val="24"/>
           <w:rtl w:val="0"/>
         </w:rPr>
         <w:t xml:space="preserve">Option A : "C'est quoi votre approche quand une équipe résiste à un changement que vous savez nécessaire ? parce que j'ai suivi plusieurs de vos interventions et ce qui revient c'est cette tension entre ce que le management décide et ce que le terrain est prêt à absorber."</w:t>
       </w:r>
     </w:p>
-    <w:p/>
+    <w:p>
+      <w:pPr>
+        <w:pStyle w:val="Heading3"/>
+        <w:keepNext w:val="0"/>
+        <w:keepLines w:val="0"/>
+        <w:spacing w:after="60" w:before="300" w:lineRule="auto"/>
+        <w:rPr>
+          <w:b w:val="1"/>
+          <w:bCs w:val="1"/>
+          <w:color w:val="1155cc"/>
+          <w:sz w:val="24"/>
+          <w:szCs w:val="24"/>
+        </w:rPr>
+      </w:pPr>
+    </w:p>
     <w:p>
       <w:pPr>
         <w:pStyle w:val="Heading3"/>
@@ -15549,7 +15857,7 @@
           <w:szCs w:val="21"/>
           <w:rtl w:val="0"/>
         </w:rPr>
-        <w:t xml:space="preserve">  -  ou </w:t>
+        <w:t xml:space="preserve"> , ou </w:t>
       </w:r>
       <w:r>
         <w:rPr>
@@ -15774,7 +16082,7 @@
           <w:szCs w:val="28"/>
           <w:rtl w:val="0"/>
         </w:rPr>
-        <w:t xml:space="preserve">MOMENTS D'APPLICATION  -  RÈGLES PAR CAS</w:t>
+        <w:t xml:space="preserve">MOMENTS D'APPLICATION , RÈGLES PAR CAS</w:t>
       </w:r>
     </w:p>
     <w:p>
@@ -15802,7 +16110,7 @@
           <w:szCs w:val="24"/>
           <w:rtl w:val="0"/>
         </w:rPr>
-        <w:t xml:space="preserve">CAS B  -  Outbound (contact à froid)</w:t>
+        <w:t xml:space="preserve">CAS B , Outbound (contact à froid)</w:t>
       </w:r>
     </w:p>
     <w:p>
@@ -15828,7 +16136,7 @@
         <w:rPr>
           <w:rtl w:val="0"/>
         </w:rPr>
-        <w:t xml:space="preserve">  -  directement. Il n'y a aucun échange préalable. Le message 2 est la première vraie prise de contact. C'est le seul moment pour poser l'enjeu philosophique avec impact.</w:t>
+        <w:t xml:space="preserve"> , directement. Il n'y a aucun échange préalable. Le message 2 est la première vraie prise de contact. C'est le seul moment pour poser l'enjeu philosophique avec impact.</w:t>
       </w:r>
     </w:p>
     <w:p>
@@ -15856,7 +16164,7 @@
           <w:szCs w:val="24"/>
           <w:rtl w:val="0"/>
         </w:rPr>
-        <w:t xml:space="preserve">CAS C  -  Demande de connexion entrante</w:t>
+        <w:t xml:space="preserve">CAS C , Demande de connexion entrante</w:t>
       </w:r>
     </w:p>
     <w:p>
@@ -15910,7 +16218,7 @@
           <w:szCs w:val="24"/>
           <w:rtl w:val="0"/>
         </w:rPr>
-        <w:t xml:space="preserve">CAS D  -  Visiteur de profil</w:t>
+        <w:t xml:space="preserve">CAS D , Visiteur de profil</w:t>
       </w:r>
     </w:p>
     <w:p>
@@ -15964,7 +16272,7 @@
           <w:szCs w:val="24"/>
           <w:rtl w:val="0"/>
         </w:rPr>
-        <w:t xml:space="preserve">CAS A  -  Échange en commentaire préalable </w:t>
+        <w:t xml:space="preserve">CAS A , Échange en commentaire préalable </w:t>
       </w:r>
       <w:r>
         <w:rPr>
@@ -15987,7 +16295,7 @@
         <w:rPr>
           <w:rtl w:val="0"/>
         </w:rPr>
-        <w:t xml:space="preserve">Quand un échange a déjà eu lieu en commentaire, la conversation continue naturellement dans les DMs en s'appuyant sur cet échange. On ne force pas l'insight profond dans le message 2  -  on continue l'élan créé en commentaire.</w:t>
+        <w:t xml:space="preserve">Quand un échange a déjà eu lieu en commentaire, la conversation continue naturellement dans les DMs en s'appuyant sur cet échange. On ne force pas l'insight profond dans le message 2 , on continue l'élan créé en commentaire.</w:t>
       </w:r>
     </w:p>
     <w:p>
@@ -15999,7 +16307,7 @@
         <w:rPr>
           <w:rtl w:val="0"/>
         </w:rPr>
-        <w:t xml:space="preserve">L'insight profond est gardé sous le coude et introduit plus tard  -  typiquement au </w:t>
+        <w:t xml:space="preserve">L'insight profond est gardé sous le coude et introduit plus tard , typiquement au </w:t>
       </w:r>
       <w:r>
         <w:rPr>
@@ -16013,7 +16321,7 @@
         <w:rPr>
           <w:rtl w:val="0"/>
         </w:rPr>
-        <w:t xml:space="preserve">  -  quand la conversation a son propre rythme et qu'il est naturel d'aller vers la question de fond.</w:t>
+        <w:t xml:space="preserve"> , quand la conversation a son propre rythme et qu'il est naturel d'aller vers la question de fond.</w:t>
       </w:r>
     </w:p>
     <w:p>
@@ -16055,7 +16363,7 @@
           <w:szCs w:val="21"/>
           <w:rtl w:val="0"/>
         </w:rPr>
-        <w:t xml:space="preserve">En CAS A, il y a déjà une conversation. L'envoyer dès le message 2 casserait l'élan créé par les commentaires. La question à l'enjeu philosophique a plus d'impact quand elle arrive après 2 à 3 échanges fluides  -  pas d'entrée de jeu.</w:t>
+        <w:t xml:space="preserve">En CAS A, il y a déjà une conversation. L'envoyer dès le message 2 casserait l'élan créé par les commentaires. La question à l'enjeu philosophique a plus d'impact quand elle arrive après 2 à 3 échanges fluides , pas d'entrée de jeu.</w:t>
       </w:r>
     </w:p>
     <w:p>
@@ -16088,7 +16396,7 @@
           <w:szCs w:val="21"/>
           <w:rtl w:val="0"/>
         </w:rPr>
-        <w:t xml:space="preserve">Dans tous les autres cas (B, C, D), le message 2 est le premier moment réel  -  pas de raison de le garder pour plus tard.</w:t>
+        <w:t xml:space="preserve">Dans tous les autres cas (B, C, D), le message 2 est le premier moment réel , pas de raison de le garder pour plus tard.</w:t>
       </w:r>
     </w:p>
     <w:p>
@@ -16143,7 +16451,7 @@
         <w:rPr>
           <w:rtl w:val="0"/>
         </w:rPr>
-        <w:t xml:space="preserve">L'analyse du profil peut révéler des éléments sensibles (difficultés financières, situation personnelle, événement de vie). Ces éléments sont lus et intégrés dans la compréhension globale  -  mais </w:t>
+        <w:t xml:space="preserve">L'analyse du profil peut révéler des éléments sensibles (difficultés financières, situation personnelle, événement de vie). Ces éléments sont lus et intégrés dans la compréhension globale , mais </w:t>
       </w:r>
       <w:r>
         <w:rPr>
@@ -16227,7 +16535,7 @@
           <w:szCs w:val="36"/>
           <w:rtl w:val="0"/>
         </w:rPr>
-        <w:t xml:space="preserve">BLOC 4  -  RÈGLES SUR LES QUESTIONS</w:t>
+        <w:t xml:space="preserve">BLOC 4 , RÈGLES SUR LES QUESTIONS</w:t>
       </w:r>
     </w:p>
     <w:p>
@@ -16311,7 +16619,7 @@
           <w:color w:val="cc0000"/>
           <w:rtl w:val="0"/>
         </w:rPr>
-        <w:t xml:space="preserve">⚠ Ces exemples de formats sont illustratifs  -  pas une liste à suivre. L'agent ne doit pas se limiter à ces formulations. La clé est la variation naturelle : des questions qui sonnent humaines, spontanées, avec un style qui peut changer à chaque échange. Répéter les mêmes formules d'une question à l'autre rend la conversation mécanique et détectable.</w:t>
+        <w:t xml:space="preserve">⚠ Ces exemples de formats sont illustratifs , pas une liste à suivre. L'agent ne doit pas se limiter à ces formulations. La clé est la variation naturelle : des questions qui sonnent humaines, spontanées, avec un style qui peut changer à chaque échange. Répéter les mêmes formules d'une question à l'autre rend la conversation mécanique et détectable.</w:t>
       </w:r>
     </w:p>
     <w:p>
@@ -16333,7 +16641,7 @@
         <w:rPr>
           <w:rtl w:val="0"/>
         </w:rPr>
-        <w:t xml:space="preserve">Question à laquelle le prospect peut répondre par "oui", "non", ou un acquiescement court. Utile dans un contexte très précis (confirmation d'une reformulation)  -  dangereuse partout ailleurs.</w:t>
+        <w:t xml:space="preserve">Question à laquelle le prospect peut répondre par "oui", "non", ou un acquiescement court. Utile dans un contexte très précis (confirmation d'une reformulation) , dangereuse partout ailleurs.</w:t>
       </w:r>
     </w:p>
     <w:p>
@@ -16355,7 +16663,7 @@
         <w:rPr>
           <w:rtl w:val="0"/>
         </w:rPr>
-        <w:t xml:space="preserve">Question dont l'objectif est d'obtenir une information concrète sur la situation du prospect. Alimente le diagnostic ET permet de qualifier la personne  -  évaluer si elle correspond aux critères pour passer à la proposition d'appel.</w:t>
+        <w:t xml:space="preserve">Question dont l'objectif est d'obtenir une information concrète sur la situation du prospect. Alimente le diagnostic ET permet de qualifier la personne , évaluer si elle correspond aux critères pour passer à la proposition d'appel.</w:t>
       </w:r>
     </w:p>
     <w:p>
@@ -16377,7 +16685,7 @@
         <w:rPr>
           <w:rtl w:val="0"/>
         </w:rPr>
-        <w:t xml:space="preserve">Question qui amène le prospect à réfléchir sur sa propre situation, sa stratégie, ses blocages  -  et à formuler lui-même une conclusion. Ne collecte pas une information : produit une prise de conscience.</w:t>
+        <w:t xml:space="preserve">Question qui amène le prospect à réfléchir sur sa propre situation, sa stratégie, ses blocages , et à formuler lui-même une conclusion. Ne collecte pas une information : produit une prise de conscience.</w:t>
       </w:r>
     </w:p>
     <w:p>
@@ -16466,7 +16774,7 @@
         <w:rPr>
           <w:rtl w:val="0"/>
         </w:rPr>
-        <w:t xml:space="preserve">Ces deux rôles ne s'opposent pas  -  ils se complètent. On propose l'action finale avec la matière qu'on a collectée, et cette matière a de l'impact parce que le prospect a lui-même cheminé vers la compréhension de son problème.</w:t>
+        <w:t xml:space="preserve">Ces deux rôles ne s'opposent pas , ils se complètent. On propose l'action finale avec la matière qu'on a collectée, et cette matière a de l'impact parce que le prospect a lui-même cheminé vers la compréhension de son problème.</w:t>
       </w:r>
     </w:p>
     <w:p>
@@ -16508,7 +16816,7 @@
           <w:szCs w:val="21"/>
           <w:rtl w:val="0"/>
         </w:rPr>
-        <w:t xml:space="preserve">Une question qui ne fait que collecter reste en surface  -  elle informe l'agent mais ne crée rien chez le prospect. Une question qui ne fait que conscientiser sans ancrage dans la réalité concrète de la situation reste vague. La combinaison des deux  -  questions qui collectent ET font réfléchir  -  est ce qui crée l'engagement réel et prépare naturellement la proposition d'appel.</w:t>
+        <w:t xml:space="preserve">Une question qui ne fait que collecter reste en surface , elle informe l'agent mais ne crée rien chez le prospect. Une question qui ne fait que conscientiser sans ancrage dans la réalité concrète de la situation reste vague. La combinaison des deux , questions qui collectent ET font réfléchir , est ce qui crée l'engagement réel et prépare naturellement la proposition d'appel.</w:t>
       </w:r>
     </w:p>
     <w:p>
@@ -16551,7 +16859,7 @@
           <w:szCs w:val="28"/>
           <w:rtl w:val="0"/>
         </w:rPr>
-        <w:t xml:space="preserve">RÈGLE 1  -  QUESTIONS OUVERTES PAR DÉFAUT</w:t>
+        <w:t xml:space="preserve">RÈGLE 1 , QUESTIONS OUVERTES PAR DÉFAUT</w:t>
       </w:r>
     </w:p>
     <w:p>
@@ -16605,7 +16913,7 @@
           <w:szCs w:val="21"/>
           <w:rtl w:val="0"/>
         </w:rPr>
-        <w:t xml:space="preserve">Une question ouverte donne la parole au prospect. C'est lui qui choisit ce qu'il met dedans  -  et ce qu'il choisit de mettre dedans est souvent le signal le plus précieux. Une question fermée réduit la réponse à un acquiescement. On n'apprend rien. Et surtout : on referme la conversation au lieu de l'ouvrir.</w:t>
+        <w:t xml:space="preserve">Une question ouverte donne la parole au prospect. C'est lui qui choisit ce qu'il met dedans , et ce qu'il choisit de mettre dedans est souvent le signal le plus précieux. Une question fermée réduit la réponse à un acquiescement. On n'apprend rien. Et surtout : on referme la conversation au lieu de l'ouvrir.</w:t>
       </w:r>
     </w:p>
     <w:p>
@@ -16648,7 +16956,7 @@
           <w:szCs w:val="28"/>
           <w:rtl w:val="0"/>
         </w:rPr>
-        <w:t xml:space="preserve">RÈGLE 2  -  QUESTIONS FERMÉES : USAGE STRICTEMENT LIMITÉ</w:t>
+        <w:t xml:space="preserve">RÈGLE 2 , QUESTIONS FERMÉES : USAGE STRICTEMENT LIMITÉ</w:t>
       </w:r>
     </w:p>
     <w:p>
@@ -16736,7 +17044,7 @@
           <w:szCs w:val="21"/>
           <w:rtl w:val="0"/>
         </w:rPr>
-        <w:t xml:space="preserve">"Si je comprends bien, tu veux dire que [reformulation]  -  c'est ça ?"</w:t>
+        <w:t xml:space="preserve">"Si je comprends bien, tu veux dire que [reformulation] , c'est ça ?"</w:t>
       </w:r>
     </w:p>
     <w:p>
@@ -16796,7 +17104,7 @@
           <w:color w:val="cc0000"/>
           <w:rtl w:val="0"/>
         </w:rPr>
-        <w:t xml:space="preserve">⚠ Ce n'est pas le type de question qui est problématique  -  c'est le moment où elle est placée. Une question fermée après un mini-insight (voir Règle 6) ferme la conversation exactement au moment où elle aurait dû s'ouvrir. C'est ce moment-là qui est catastrophique, pas la question en elle-même.</w:t>
+        <w:t xml:space="preserve">⚠ Ce n'est pas le type de question qui est problématique , c'est le moment où elle est placée. Une question fermée après un mini-insight (voir Règle 6) ferme la conversation exactement au moment où elle aurait dû s'ouvrir. C'est ce moment-là qui est catastrophique, pas la question en elle-même.</w:t>
       </w:r>
     </w:p>
     <w:p>
@@ -16838,7 +17146,7 @@
           <w:szCs w:val="21"/>
           <w:rtl w:val="0"/>
         </w:rPr>
-        <w:t xml:space="preserve">La question fermée donne le contrôle au prospect : il peut clore la conversation avec un "oui" ou un "non" sans avoir rien donné. Utilisée au mauvais moment  -  notamment après qu'on vient de poser un insight  -  elle signale de l'insécurité et ferme exactement ce qu'on cherchait à ouvrir.</w:t>
+        <w:t xml:space="preserve">La question fermée donne le contrôle au prospect : il peut clore la conversation avec un "oui" ou un "non" sans avoir rien donné. Utilisée au mauvais moment , notamment après qu'on vient de poser un insight , elle signale de l'insécurité et ferme exactement ce qu'on cherchait à ouvrir.</w:t>
       </w:r>
     </w:p>
     <w:p>
@@ -16881,7 +17189,7 @@
           <w:szCs w:val="28"/>
           <w:rtl w:val="0"/>
         </w:rPr>
-        <w:t xml:space="preserve">RÈGLE 3  -  UNE UNITÉ DE QUESTION PAR MESSAGE</w:t>
+        <w:t xml:space="preserve">RÈGLE 3 , UNE UNITÉ DE QUESTION PAR MESSAGE</w:t>
       </w:r>
     </w:p>
     <w:p>
@@ -16905,7 +17213,7 @@
         <w:rPr>
           <w:rtl w:val="0"/>
         </w:rPr>
-        <w:t xml:space="preserve">Une unité de question = une question principale + éventuellement une question de clarification qui en précise le champ. Ces deux éléments forment un tout  -  pas deux questions indépendantes.</w:t>
+        <w:t xml:space="preserve">Une unité de question = une question principale + éventuellement une question de clarification qui en précise le champ. Ces deux éléments forment un tout , pas deux questions indépendantes.</w:t>
       </w:r>
     </w:p>
     <w:p>
@@ -17077,7 +17385,7 @@
           <w:szCs w:val="21"/>
           <w:rtl w:val="0"/>
         </w:rPr>
-        <w:t xml:space="preserve">Poser deux questions indépendantes dans le même message oblige le prospect à choisir à laquelle répondre  -  il répond souvent qu'à une, ou les deux superficiellement. On perd la profondeur sur les deux. Une seule unité de question = une seule direction = une vraie réponse.</w:t>
+        <w:t xml:space="preserve">Poser deux questions indépendantes dans le même message oblige le prospect à choisir à laquelle répondre , il répond souvent qu'à une, ou les deux superficiellement. On perd la profondeur sur les deux. Une seule unité de question = une seule direction = une vraie réponse.</w:t>
       </w:r>
     </w:p>
     <w:p>
@@ -17120,7 +17428,7 @@
           <w:szCs w:val="28"/>
           <w:rtl w:val="0"/>
         </w:rPr>
-        <w:t xml:space="preserve">RÈGLE 4  -  LES DEUX TYPES DE QUESTIONS</w:t>
+        <w:t xml:space="preserve">RÈGLE 4 , LES DEUX TYPES DE QUESTIONS</w:t>
       </w:r>
     </w:p>
     <w:p>
@@ -17356,7 +17664,7 @@
           <w:szCs w:val="20"/>
           <w:rtl w:val="0"/>
         </w:rPr>
-        <w:t xml:space="preserve">(À compléter avec les mots exacts du prospect  -  voir avertissement ci-dessous)</w:t>
+        <w:t xml:space="preserve">(À compléter avec les mots exacts du prospect , voir avertissement ci-dessous)</w:t>
       </w:r>
     </w:p>
     <w:p>
@@ -17480,7 +17788,7 @@
           <w:color w:val="cc0000"/>
           <w:rtl w:val="0"/>
         </w:rPr>
-        <w:t xml:space="preserve">⚠ Ces formulations sont des structures de base  -  pas des phrases à utiliser telles quelles. En pratique, chaque question reprend les mots exacts du prospect : son objectif, sa stratégie, son délai, sa situation. Une question de conscientisation qui reste vague ("atteindre cet objectif", "faire ça") ne touche rien. C'est la précision qui crée l'impact.</w:t>
+        <w:t xml:space="preserve">⚠ Ces formulations sont des structures de base , pas des phrases à utiliser telles quelles. En pratique, chaque question reprend les mots exacts du prospect : son objectif, sa stratégie, son délai, sa situation. Une question de conscientisation qui reste vague ("atteindre cet objectif", "faire ça") ne touche rien. C'est la précision qui crée l'impact.</w:t>
       </w:r>
     </w:p>
     <w:p>
@@ -17522,7 +17830,7 @@
           <w:szCs w:val="21"/>
           <w:rtl w:val="0"/>
         </w:rPr>
-        <w:t xml:space="preserve">La conscientisation a beaucoup plus de puissance quand elle vient du prospect lui-même. Si l'agent dit "ta stratégie n'est pas optimale"  -  résistance possible. Si le prospect répond lui-même "honnêtement je pense que je fais pas la meilleure chose"  -  c'est lui qui l'a dit, et ça ne se conteste plus.</w:t>
+        <w:t xml:space="preserve">La conscientisation a beaucoup plus de puissance quand elle vient du prospect lui-même. Si l'agent dit "ta stratégie n'est pas optimale" , résistance possible. Si le prospect répond lui-même "honnêtement je pense que je fais pas la meilleure chose" , c'est lui qui l'a dit, et ça ne se conteste plus.</w:t>
       </w:r>
     </w:p>
     <w:p>
@@ -17565,7 +17873,7 @@
           <w:szCs w:val="28"/>
           <w:rtl w:val="0"/>
         </w:rPr>
-        <w:t xml:space="preserve">RÈGLE 5  -  PROFONDEUR &gt; LARGEUR</w:t>
+        <w:t xml:space="preserve">RÈGLE 5 , PROFONDEUR &gt; LARGEUR</w:t>
       </w:r>
     </w:p>
     <w:p>
@@ -17577,7 +17885,7 @@
         <w:rPr>
           <w:rtl w:val="0"/>
         </w:rPr>
-        <w:t xml:space="preserve">Rester sur un sujet jusqu'à avoir obtenu quelque chose de concret  -  un chiffre, un fait précis, ou une formulation émotionnelle  -  avant de passer au suivant.</w:t>
+        <w:t xml:space="preserve">Rester sur un sujet jusqu'à avoir obtenu quelque chose de concret , un chiffre, un fait précis, ou une formulation émotionnelle , avant de passer au suivant.</w:t>
       </w:r>
     </w:p>
     <w:p>
@@ -17633,7 +17941,7 @@
         <w:rPr>
           <w:rtl w:val="0"/>
         </w:rPr>
-        <w:t xml:space="preserve">La réponse du prospect donne quelque chose de solide sur lequel construire  -  chiffré, concret, ou émotionnellement chargé.</w:t>
+        <w:t xml:space="preserve">La réponse du prospect donne quelque chose de solide sur lequel construire , chiffré, concret, ou émotionnellement chargé.</w:t>
       </w:r>
     </w:p>
     <w:p>
@@ -17680,7 +17988,7 @@
           <w:color w:val="cc0000"/>
           <w:rtl w:val="0"/>
         </w:rPr>
-        <w:t xml:space="preserve">⚠ Les exemples ci-dessous montrent la logique des questions  -  pas leur enchaînement tel quel. Dans une vraie conversation, chaque question est précédée d'enrobage (forme courte ou longue selon le signal reçu). On ne passe pas d'une question à l'autre directement sans rondeur. Voir Bloc 3  -  Section 2.</w:t>
+        <w:t xml:space="preserve">⚠ Les exemples ci-dessous montrent la logique des questions , pas leur enchaînement tel quel. Dans une vraie conversation, chaque question est précédée d'enrobage (forme courte ou longue selon le signal reçu). On ne passe pas d'une question à l'autre directement sans rondeur. Voir Bloc 3 , Section 2.</w:t>
       </w:r>
     </w:p>
     <w:p>
@@ -17704,7 +18012,7 @@
           <w:szCs w:val="21"/>
           <w:rtl w:val="0"/>
         </w:rPr>
-        <w:t xml:space="preserve">Exemple 1  -  Elsa (creusage sur le calme plat)</w:t>
+        <w:t xml:space="preserve">Exemple 1 , Elsa (creusage sur le calme plat)</w:t>
       </w:r>
     </w:p>
     <w:p>
@@ -17949,7 +18257,7 @@
           <w:szCs w:val="21"/>
           <w:rtl w:val="0"/>
         </w:rPr>
-        <w:t xml:space="preserve">Exemple 2  -  Danaë (creusage sur le perfectionnisme)</w:t>
+        <w:t xml:space="preserve">Exemple 2 , Danaë (creusage sur le perfectionnisme)</w:t>
       </w:r>
     </w:p>
     <w:p>
@@ -18110,7 +18418,7 @@
           <w:szCs w:val="21"/>
           <w:rtl w:val="0"/>
         </w:rPr>
-        <w:t xml:space="preserve">Passer trop vite d'un sujet à l'autre donne l'impression de collecter une checklist. Rester sur un seul angle jusqu'au concret montre qu'on a vraiment entendu  -  et produit la matière dont on a besoin pour la suite. Un seul sujet vraiment creusé vaut infiniment plus que 5 sujets effleurés.</w:t>
+        <w:t xml:space="preserve">Passer trop vite d'un sujet à l'autre donne l'impression de collecter une checklist. Rester sur un seul angle jusqu'au concret montre qu'on a vraiment entendu , et produit la matière dont on a besoin pour la suite. Un seul sujet vraiment creusé vaut infiniment plus que 5 sujets effleurés.</w:t>
       </w:r>
     </w:p>
     <w:p>
@@ -18153,7 +18461,7 @@
           <w:szCs w:val="28"/>
           <w:rtl w:val="0"/>
         </w:rPr>
-        <w:t xml:space="preserve">RÈGLE 6  -  LA QUESTION FERMÉE AU MAUVAIS MOMENT</w:t>
+        <w:t xml:space="preserve">RÈGLE 6 , LA QUESTION FERMÉE AU MAUVAIS MOMENT</w:t>
       </w:r>
     </w:p>
     <w:p>
@@ -18217,7 +18525,7 @@
           <w:szCs w:val="21"/>
           <w:rtl w:val="0"/>
         </w:rPr>
-        <w:t xml:space="preserve">Agent : "En fait ton problème c'est pas la discipline  -  c'est que le framework n'est pas adapté à tes contraintes."</w:t>
+        <w:t xml:space="preserve">Agent : "En fait ton problème c'est pas la discipline , c'est que le framework n'est pas adapté à tes contraintes."</w:t>
       </w:r>
     </w:p>
     <w:p>
@@ -18300,7 +18608,7 @@
           <w:szCs w:val="21"/>
           <w:rtl w:val="0"/>
         </w:rPr>
-        <w:t xml:space="preserve">Agent : "En fait ton problème c'est pas la discipline  -  c'est que le framework n'est pas adapté à tes contraintes."</w:t>
+        <w:t xml:space="preserve">Agent : "En fait ton problème c'est pas la discipline , c'est que le framework n'est pas adapté à tes contraintes."</w:t>
       </w:r>
     </w:p>
     <w:p>
@@ -18362,7 +18670,7 @@
           <w:color w:val="cc0000"/>
           <w:rtl w:val="0"/>
         </w:rPr>
-        <w:t xml:space="preserve">⚠ Ces exemples montrent la mécanique brute  -  pas le setting réel. Dans une vraie conversation, le mini-insight n'arrive pas seul et sans contexte. Il est précédé d'enrobage, il s'appuie sur ce que le prospect vient de dire, et il arrive après plusieurs échanges qui ont construit la relation. La question ouverte qui suit s'inscrit dans ce même mouvement de rondeur.</w:t>
+        <w:t xml:space="preserve">⚠ Ces exemples montrent la mécanique brute , pas le setting réel. Dans une vraie conversation, le mini-insight n'arrive pas seul et sans contexte. Il est précédé d'enrobage, il s'appuie sur ce que le prospect vient de dire, et il arrive après plusieurs échanges qui ont construit la relation. La question ouverte qui suit s'inscrit dans ce même mouvement de rondeur.</w:t>
       </w:r>
     </w:p>
     <w:p>
@@ -18404,7 +18712,7 @@
           <w:szCs w:val="21"/>
           <w:rtl w:val="0"/>
         </w:rPr>
-        <w:t xml:space="preserve">Après un mini-insight, le prospect est dans un moment de traitement  -  il intègre quelque chose qu'il n'avait pas encore totalement formulé. Une question ouverte lui donne l'espace pour le formuler à voix haute. Une question fermée lui donne juste la sortie de secours.</w:t>
+        <w:t xml:space="preserve">Après un mini-insight, le prospect est dans un moment de traitement , il intègre quelque chose qu'il n'avait pas encore totalement formulé. Une question ouverte lui donne l'espace pour le formuler à voix haute. Une question fermée lui donne juste la sortie de secours.</w:t>
       </w:r>
     </w:p>
     <w:p>
@@ -18459,7 +18767,7 @@
         <w:rPr>
           <w:rtl w:val="0"/>
         </w:rPr>
-        <w:t xml:space="preserve">Il y a une logique naturelle dans l'enchaînement des questions. Ce n'est pas un script à suivre à la lettre  -  c'est une direction générale qui s'adapte aux signaux et au profil.</w:t>
+        <w:t xml:space="preserve">Il y a une logique naturelle dans l'enchaînement des questions. Ce n'est pas un script à suivre à la lettre , c'est une direction générale qui s'adapte aux signaux et au profil.</w:t>
       </w:r>
     </w:p>
     <w:tbl>
@@ -19201,7 +19509,7 @@
                 <w:szCs w:val="21"/>
                 <w:rtl w:val="0"/>
               </w:rPr>
-              <w:t xml:space="preserve"> - </w:t>
+              <w:t xml:space="preserve">,</w:t>
             </w:r>
           </w:p>
         </w:tc>
@@ -19223,7 +19531,7 @@
           <w:color w:val="cc0000"/>
           <w:rtl w:val="0"/>
         </w:rPr>
-        <w:t xml:space="preserve">⚠ Cet ordre est une direction, pas une règle rigide. La conversation peut diverger selon ce que le prospect dit, les signaux qu'il envoie, son profil. Les nuances par type de profil et par niche sont traitées dans les modules niche  -  pas dans ce tronc central.</w:t>
+        <w:t xml:space="preserve">⚠ Cet ordre est une direction, pas une règle rigide. La conversation peut diverger selon ce que le prospect dit, les signaux qu'il envoie, son profil. Les nuances par type de profil et par niche sont traitées dans les modules niche , pas dans ce tronc central.</w:t>
       </w:r>
     </w:p>
     <w:p>
@@ -19254,7 +19562,7 @@
           <w:szCs w:val="36"/>
           <w:rtl w:val="0"/>
         </w:rPr>
-        <w:t xml:space="preserve">BLOC 5  -  STANDARDS QUALITÉ</w:t>
+        <w:t xml:space="preserve">BLOC 5 , STANDARDS QUALITÉ</w:t>
       </w:r>
     </w:p>
     <w:p>
@@ -19342,7 +19650,7 @@
           <w:rFonts w:ascii="Arial Unicode MS" w:cs="Arial Unicode MS" w:eastAsia="Arial Unicode MS" w:hAnsi="Arial Unicode MS"/>
           <w:rtl w:val="0"/>
         </w:rPr>
-        <w:t xml:space="preserve">Principe de calibration de la réponse selon ce qu'on reçoit. Si le prospect répond court et factuel → on répond court et on avance. Si le prospect se livre et touche quelque chose d'émotionnel → on rentre dans son jeu avec plus de substance. Ce n'est pas une règle de longueur  -  c'est de l'énergie. Comme une vraie conversation à l'oral.</w:t>
+        <w:t xml:space="preserve">Principe de calibration de la réponse selon ce qu'on reçoit. Si le prospect répond court et factuel → on répond court et on avance. Si le prospect se livre et touche quelque chose d'émotionnel → on rentre dans son jeu avec plus de substance. Ce n'est pas une règle de longueur , c'est de l'énergie. Comme une vraie conversation à l'oral.</w:t>
       </w:r>
     </w:p>
     <w:p>
@@ -19364,7 +19672,7 @@
         <w:rPr>
           <w:rtl w:val="0"/>
         </w:rPr>
-        <w:t xml:space="preserve">Enrobage ou validation ajouté dans un message où il ne sert à rien. Ça crée une impression de politesse forcée plutôt que d'authenticité  -  et souvent c'est exactement ce qui déclenche le filtre de prospection. Exemple : arriver avec "ravi de rejoindre ton réseau, j'ai parcouru ton profil avec attention" alors que le signal attendu est juste une question bien posée.</w:t>
+        <w:t xml:space="preserve">Enrobage ou validation ajouté dans un message où il ne sert à rien. Ça crée une impression de politesse forcée plutôt que d'authenticité , et souvent c'est exactement ce qui déclenche le filtre de prospection. Exemple : arriver avec "ravi de rejoindre ton réseau, j'ai parcouru ton profil avec attention" alors que le signal attendu est juste une question bien posée.</w:t>
       </w:r>
     </w:p>
     <w:p>
@@ -19386,7 +19694,7 @@
         <w:rPr>
           <w:rtl w:val="0"/>
         </w:rPr>
-        <w:t xml:space="preserve">Personnalisation qui montre qu'on a lu le titre LinkedIn ou le dernier post  -  pas la philosophie globale. Déclenche immédiatement le filtre de prospection parce que le prospect sait ce que ça coûte de faire ce niveau de lecture. Exemples : "j'ai vu que tu aidais...", "en regardant ton profil...", "j'ai remarqué que tu..."</w:t>
+        <w:t xml:space="preserve">Personnalisation qui montre qu'on a lu le titre LinkedIn ou le dernier post , pas la philosophie globale. Déclenche immédiatement le filtre de prospection parce que le prospect sait ce que ça coûte de faire ce niveau de lecture. Exemples : "j'ai vu que tu aidais...", "en regardant ton profil...", "j'ai remarqué que tu..."</w:t>
       </w:r>
     </w:p>
     <w:p>
@@ -19408,7 +19716,7 @@
         <w:rPr>
           <w:rtl w:val="0"/>
         </w:rPr>
-        <w:t xml:space="preserve">Petites variations de ponctuation et de syntaxe qui signalent qu'un humain tape avec son clavier  -  pas qu'un système génère. Pas des fautes d'orthographe  -  des fautes de forme légères, conscientes, contextuelles. Exemples : absence de majuscule en début de message, contraction "t'as" au lieu de "tu as", absence occasionnelle de point d'exclamation là où la convention en mettrait un.</w:t>
+        <w:t xml:space="preserve">Petites variations de ponctuation et de syntaxe qui signalent qu'un humain tape avec son clavier , pas qu'un système génère. Pas des fautes d'orthographe , des fautes de forme légères, conscientes, contextuelles. Exemples : absence de majuscule en début de message, contraction "t'as" au lieu de "tu as", absence occasionnelle de point d'exclamation là où la convention en mettrait un.</w:t>
       </w:r>
     </w:p>
     <w:p>
@@ -19480,7 +19788,7 @@
         <w:rPr>
           <w:rtl w:val="0"/>
         </w:rPr>
-        <w:t xml:space="preserve">Tout le reste découle de là. Un message peut être techniquement correct  -  bonne question, bon enrobage, bonne longueur  -  et sonner quand même faux. Parce qu'il est trop construit, trop poli, trop parfait. Le naturel sonore, c'est ce qui fait qu'un message passe pour une vraie conversation et non pour une séquence préparée.</w:t>
+        <w:t xml:space="preserve">Tout le reste découle de là. Un message peut être techniquement correct , bonne question, bon enrobage, bonne longueur , et sonner quand même faux. Parce qu'il est trop construit, trop poli, trop parfait. Le naturel sonore, c'est ce qui fait qu'un message passe pour une vraie conversation et non pour une séquence préparée.</w:t>
       </w:r>
     </w:p>
     <w:p>
@@ -19523,7 +19831,7 @@
           <w:szCs w:val="28"/>
           <w:rtl w:val="0"/>
         </w:rPr>
-        <w:t xml:space="preserve">SECTION 1  -  LE REBOND D'ÉNERGIE</w:t>
+        <w:t xml:space="preserve">SECTION 1 , LE REBOND D'ÉNERGIE</w:t>
       </w:r>
     </w:p>
     <w:p>
@@ -19563,7 +19871,7 @@
         <w:rPr>
           <w:rtl w:val="0"/>
         </w:rPr>
-        <w:t xml:space="preserve">La longueur et la densité de la réponse se calibrent sur ce qu'on reçoit. Ce n'est pas une règle arbitraire  -  c'est la mécanique naturelle d'une vraie conversation.</w:t>
+        <w:t xml:space="preserve">La longueur et la densité de la réponse se calibrent sur ce qu'on reçoit. Ce n'est pas une règle arbitraire , c'est la mécanique naturelle d'une vraie conversation.</w:t>
       </w:r>
     </w:p>
     <w:p>
@@ -19935,7 +20243,7 @@
           <w:color w:val="cc0000"/>
           <w:rtl w:val="0"/>
         </w:rPr>
-        <w:t xml:space="preserve">⚠ Il n'y a pas de format figé. Parfois les trois s'enchaînent. Parfois c'est juste une validation + question. Parfois l'histoire arrive toute seule. C'est le signal reçu qui commande  -  pas une règle de comptage.</w:t>
+        <w:t xml:space="preserve">⚠ Il n'y a pas de format figé. Parfois les trois s'enchaînent. Parfois c'est juste une validation + question. Parfois l'histoire arrive toute seule. C'est le signal reçu qui commande , pas une règle de comptage.</w:t>
       </w:r>
     </w:p>
     <w:p>
@@ -19977,7 +20285,7 @@
           <w:szCs w:val="21"/>
           <w:rtl w:val="0"/>
         </w:rPr>
-        <w:t xml:space="preserve">Analyser chaque échange comme une conversation humaine à l'oral  -  face à face. Si quelqu'un dit "j'en ai 1 en cours", personne ne répond à l'oral avec une longue histoire. On dit "ok" et on continue. C'est de l'énergie qui se calibre naturellement sur ce qu'on reçoit.</w:t>
+        <w:t xml:space="preserve">Analyser chaque échange comme une conversation humaine à l'oral , face à face. Si quelqu'un dit "j'en ai 1 en cours", personne ne répond à l'oral avec une longue histoire. On dit "ok" et on continue. C'est de l'énergie qui se calibre naturellement sur ce qu'on reçoit.</w:t>
       </w:r>
     </w:p>
     <w:p>
@@ -20020,7 +20328,7 @@
           <w:szCs w:val="28"/>
           <w:rtl w:val="0"/>
         </w:rPr>
-        <w:t xml:space="preserve">SECTION 2  -  VARIATION DES FORMULATIONS</w:t>
+        <w:t xml:space="preserve">SECTION 2 , VARIATION DES FORMULATIONS</w:t>
       </w:r>
     </w:p>
     <w:p>
@@ -20222,7 +20530,7 @@
         <w:rPr>
           <w:rtl w:val="0"/>
         </w:rPr>
-        <w:t xml:space="preserve">Aucune de ces formulations ne commence pareil. Certaines sont des questions directes. D'autres sont intégrées dans une phrase affirmative. D'autres encore partent d'une observation. La variation est réelle  -  pas cosmétique.</w:t>
+        <w:t xml:space="preserve">Aucune de ces formulations ne commence pareil. Certaines sont des questions directes. D'autres sont intégrées dans une phrase affirmative. D'autres encore partent d'une observation. La variation est réelle , pas cosmétique.</w:t>
       </w:r>
     </w:p>
     <w:p>
@@ -20241,7 +20549,7 @@
           <w:color w:val="cc0000"/>
           <w:rtl w:val="0"/>
         </w:rPr>
-        <w:t xml:space="preserve">⚠ Règle de précision : même quand la structure de la question varie, le sujet doit être nommé précisément. Ne jamais poser une question vague comme "ça veut dire quoi exactement ?" sans préciser de quoi on parle. Toujours nommer le sujet que le prospect vient de mentionner  -  pas pour répéter mécaniquement ses mots, mais pour que la question tombe juste.</w:t>
+        <w:t xml:space="preserve">⚠ Règle de précision : même quand la structure de la question varie, le sujet doit être nommé précisément. Ne jamais poser une question vague comme "ça veut dire quoi exactement ?" sans préciser de quoi on parle. Toujours nommer le sujet que le prospect vient de mentionner , pas pour répéter mécaniquement ses mots, mais pour que la question tombe juste.</w:t>
       </w:r>
     </w:p>
     <w:p>
@@ -20260,7 +20568,7 @@
           <w:color w:val="cc0000"/>
           <w:rtl w:val="0"/>
         </w:rPr>
-        <w:t xml:space="preserve">⚠ Vérification systématique : avant de valider une question, vérifier qu'elle ne peut pas être répondue par "oui" ou "non". Une formulation comme "tu penses que [affirmation] ?" est une question fermée  -  le prospect peut juste acquiescer. Reformuler en ouvrant : "comment tu envisages [la même chose] ?" ou "c'est quoi ton plan pour [la même chose] ?"</w:t>
+        <w:t xml:space="preserve">⚠ Vérification systématique : avant de valider une question, vérifier qu'elle ne peut pas être répondue par "oui" ou "non". Une formulation comme "tu penses que [affirmation] ?" est une question fermée , le prospect peut juste acquiescer. Reformuler en ouvrant : "comment tu envisages [la même chose] ?" ou "c'est quoi ton plan pour [la même chose] ?"</w:t>
       </w:r>
     </w:p>
     <w:p>
@@ -20300,7 +20608,7 @@
         <w:rPr>
           <w:rtl w:val="0"/>
         </w:rPr>
-        <w:t xml:space="preserve">70% des messages commencent sans majuscule. 30% avec majuscule. Ce ratio n'est pas une règle mécanique  -  c'est une tendance naturelle qui contribue au naturel sonore. L'application d'une majuscule à chaque début de message sonne trop "propre."</w:t>
+        <w:t xml:space="preserve">70% des messages commencent sans majuscule. 30% avec majuscule. Ce ratio n'est pas une règle mécanique , c'est une tendance naturelle qui contribue au naturel sonore. L'application d'une majuscule à chaque début de message sonne trop "propre."</w:t>
       </w:r>
     </w:p>
     <w:p>
@@ -20319,7 +20627,7 @@
           <w:color w:val="cc0000"/>
           <w:rtl w:val="0"/>
         </w:rPr>
-        <w:t xml:space="preserve">⚠ Ne jamais appliquer ce ratio de manière mécanique  -  c'est la tendance globale qui compte.</w:t>
+        <w:t xml:space="preserve">⚠ Ne jamais appliquer ce ratio de manière mécanique , c'est la tendance globale qui compte.</w:t>
       </w:r>
     </w:p>
     <w:p>
@@ -20375,7 +20683,7 @@
         <w:rPr>
           <w:rtl w:val="0"/>
         </w:rPr>
-        <w:t xml:space="preserve">Le signal reçu (rebond d'énergie  -  voir Section 1)</w:t>
+        <w:t xml:space="preserve">Le signal reçu (rebond d'énergie , voir Section 1)</w:t>
       </w:r>
     </w:p>
     <w:p>
@@ -20466,7 +20774,7 @@
           <w:szCs w:val="28"/>
           <w:rtl w:val="0"/>
         </w:rPr>
-        <w:t xml:space="preserve">SECTION 3  -  RONDEUR BIEN PLACÉE VS MAL PLACÉE</w:t>
+        <w:t xml:space="preserve">SECTION 3 , RONDEUR BIEN PLACÉE VS MAL PLACÉE</w:t>
       </w:r>
     </w:p>
     <w:p>
@@ -20494,7 +20802,7 @@
           <w:szCs w:val="24"/>
           <w:rtl w:val="0"/>
         </w:rPr>
-        <w:t xml:space="preserve">Rondeur mal placée  -  ce qu'il ne faut pas faire</w:t>
+        <w:t xml:space="preserve">Rondeur mal placée , ce qu'il ne faut pas faire</w:t>
       </w:r>
     </w:p>
     <w:p>
@@ -20582,7 +20890,7 @@
         <w:rPr>
           <w:rtl w:val="0"/>
         </w:rPr>
-        <w:t xml:space="preserve">Ces formulations ne passent pas pour de la chaleur  -  elles passent pour du social engineering. Le prospect les reconnaît.</w:t>
+        <w:t xml:space="preserve">Ces formulations ne passent pas pour de la chaleur , elles passent pour du social engineering. Le prospect les reconnaît.</w:t>
       </w:r>
     </w:p>
     <w:p>
@@ -20610,7 +20918,7 @@
           <w:szCs w:val="24"/>
           <w:rtl w:val="0"/>
         </w:rPr>
-        <w:t xml:space="preserve">Rondeur bien placée  -  le principe</w:t>
+        <w:t xml:space="preserve">Rondeur bien placée , le principe</w:t>
       </w:r>
     </w:p>
     <w:p>
@@ -20670,7 +20978,7 @@
         <w:rPr>
           <w:rtl w:val="0"/>
         </w:rPr>
-        <w:t xml:space="preserve">Ne commence pas systématiquement par "moi aussi j'ai vécu ça"  -  varier les angles</w:t>
+        <w:t xml:space="preserve">Ne commence pas systématiquement par "moi aussi j'ai vécu ça" , varier les angles</w:t>
       </w:r>
     </w:p>
     <w:p>
@@ -20729,7 +21037,7 @@
           <w:szCs w:val="28"/>
           <w:rtl w:val="0"/>
         </w:rPr>
-        <w:t xml:space="preserve">SECTION 4  -  EXPRESSIONS ET PATTERNS À BANNIR</w:t>
+        <w:t xml:space="preserve">SECTION 4 , EXPRESSIONS ET PATTERNS À BANNIR</w:t>
       </w:r>
     </w:p>
     <w:p>
@@ -21113,7 +21421,7 @@
         <w:rPr>
           <w:rtl w:val="0"/>
         </w:rPr>
-        <w:t xml:space="preserve">"honnêtement..." / "sincèrement..."  -  suggère implicitement qu'on ne l'était pas avant</w:t>
+        <w:t xml:space="preserve">"honnêtement..." / "sincèrement..." , suggère implicitement qu'on ne l'était pas avant</w:t>
       </w:r>
     </w:p>
     <w:p>
@@ -21279,7 +21587,7 @@
           <w:szCs w:val="21"/>
           <w:rtl w:val="0"/>
         </w:rPr>
-        <w:t xml:space="preserve">Ces formulations déclenchent le filtre de prospection parce qu'elles sont reconnaissables  -  pas parce qu'elles sont grossières. Les prospects actifs sur LinkedIn ont été exposés des dizaines de fois à ces patterns. Dès qu'une de ces formulations apparaît, le filtre s'active avant même que le message soit lu en entier.</w:t>
+        <w:t xml:space="preserve">Ces formulations déclenchent le filtre de prospection parce qu'elles sont reconnaissables , pas parce qu'elles sont grossières. Les prospects actifs sur LinkedIn ont été exposés des dizaines de fois à ces patterns. Dès qu'une de ces formulations apparaît, le filtre s'active avant même que le message soit lu en entier.</w:t>
       </w:r>
     </w:p>
     <w:p>
@@ -21322,7 +21630,7 @@
           <w:szCs w:val="28"/>
           <w:rtl w:val="0"/>
         </w:rPr>
-        <w:t xml:space="preserve">SECTION 5  -  PONCTUATION, EMOJIS, IMPERFECTIONS</w:t>
+        <w:t xml:space="preserve">SECTION 5 , PONCTUATION, EMOJIS, IMPERFECTIONS</w:t>
       </w:r>
     </w:p>
     <w:p>
@@ -21390,7 +21698,7 @@
         <w:rPr>
           <w:rtl w:val="0"/>
         </w:rPr>
-        <w:t xml:space="preserve"> optionnel. Ni systématique ni banni. Se place quand il y a vraiment quelque chose à souligner  -  pas par convention de politesse.</w:t>
+        <w:t xml:space="preserve"> optionnel. Ni systématique ni banni. Se place quand il y a vraiment quelque chose à souligner , pas par convention de politesse.</w:t>
       </w:r>
     </w:p>
     <w:p>
@@ -21410,7 +21718,7 @@
         <w:rPr>
           <w:rtl w:val="0"/>
         </w:rPr>
-        <w:t xml:space="preserve"> voir Section 2  -  tendance 70% sans / 30% avec.</w:t>
+        <w:t xml:space="preserve"> voir Section 2 , tendance 70% sans / 30% avec.</w:t>
       </w:r>
     </w:p>
     <w:p>
@@ -21469,7 +21777,7 @@
           <w:color w:val="cc0000"/>
           <w:rtl w:val="0"/>
         </w:rPr>
-        <w:t xml:space="preserve">⚠ À bannir : 👀  -  trop associé aux patterns de prospection LinkedIn.</w:t>
+        <w:t xml:space="preserve">⚠ À bannir : 👀 , trop associé aux patterns de prospection LinkedIn.</w:t>
       </w:r>
     </w:p>
     <w:p>
@@ -21489,7 +21797,7 @@
         <w:rPr>
           <w:rtl w:val="0"/>
         </w:rPr>
-        <w:t xml:space="preserve"> si le prospect utilise des emojis et montre qu'il est à l'aise avec ce registre, on peut en utiliser aussi  -  mais pas les mêmes que lui. Si le prospect met un emoji Apple, répondre avec un emoji à l'ancienne ou un emoji différent. L'objectif est de rentrer dans son registre, pas de copier ce qu'il a mis.</w:t>
+        <w:t xml:space="preserve"> si le prospect utilise des emojis et montre qu'il est à l'aise avec ce registre, on peut en utiliser aussi , mais pas les mêmes que lui. Si le prospect met un emoji Apple, répondre avec un emoji à l'ancienne ou un emoji différent. L'objectif est de rentrer dans son registre, pas de copier ce qu'il a mis.</w:t>
       </w:r>
     </w:p>
     <w:p>
@@ -21569,7 +21877,7 @@
         <w:rPr>
           <w:rtl w:val="0"/>
         </w:rPr>
-        <w:t xml:space="preserve">L'objectif : signaler qu'un humain tape avec son clavier  -  pas qu'un système génère.</w:t>
+        <w:t xml:space="preserve">L'objectif : signaler qu'un humain tape avec son clavier , pas qu'un système génère.</w:t>
       </w:r>
     </w:p>
     <w:p>
@@ -21673,7 +21981,7 @@
         <w:rPr>
           <w:rtl w:val="0"/>
         </w:rPr>
-        <w:t xml:space="preserve">Fautes d'orthographe  -  jamais</w:t>
+        <w:t xml:space="preserve">Fautes d'orthographe , jamais</w:t>
       </w:r>
     </w:p>
     <w:p>
@@ -21744,7 +22052,7 @@
           <w:szCs w:val="28"/>
           <w:rtl w:val="0"/>
         </w:rPr>
-        <w:t xml:space="preserve">SECTION 6  -  TEST DE VALIDATION</w:t>
+        <w:t xml:space="preserve">SECTION 6 , TEST DE VALIDATION</w:t>
       </w:r>
     </w:p>
     <w:p>
@@ -21766,7 +22074,7 @@
           <w:szCs w:val="21"/>
           <w:rtl w:val="0"/>
         </w:rPr>
-        <w:t xml:space="preserve">Test 1  -  Le test à l'oral</w:t>
+        <w:t xml:space="preserve">Test 1 , Le test à l'oral</w:t>
       </w:r>
     </w:p>
     <w:p>
@@ -21825,7 +22133,7 @@
           <w:szCs w:val="21"/>
           <w:rtl w:val="0"/>
         </w:rPr>
-        <w:t xml:space="preserve">Test 2  -  Le test de la rondeur</w:t>
+        <w:t xml:space="preserve">Test 2 , Le test de la rondeur</w:t>
       </w:r>
     </w:p>
     <w:p>
@@ -21843,7 +22151,7 @@
           <w:szCs w:val="21"/>
           <w:rtl w:val="0"/>
         </w:rPr>
-        <w:t xml:space="preserve">"Est-ce que cet enrobage arrive parce qu'il y a quelque chose à apporter  -  ou juste pour paraître chaleureux ?"</w:t>
+        <w:t xml:space="preserve">"Est-ce que cet enrobage arrive parce qu'il y a quelque chose à apporter , ou juste pour paraître chaleureux ?"</w:t>
       </w:r>
     </w:p>
     <w:p>
@@ -21884,7 +22192,7 @@
           <w:szCs w:val="21"/>
           <w:rtl w:val="0"/>
         </w:rPr>
-        <w:t xml:space="preserve">Test 3  -  Le test de la personnalisation</w:t>
+        <w:t xml:space="preserve">Test 3 , Le test de la personnalisation</w:t>
       </w:r>
     </w:p>
     <w:p>
@@ -21959,7 +22267,7 @@
           <w:szCs w:val="20"/>
           <w:rtl w:val="0"/>
         </w:rPr>
-        <w:t xml:space="preserve">⚠ NOTE POUR LA SUITE  -  Les formulations exactes des questions (structure par niche, exemples de messages validés) seront définies lors de la phase de formulations par niche  -  après le tronc central. Ce bloc pose les standards de forme et de registre.</w:t>
+        <w:t xml:space="preserve">⚠ NOTE POUR LA SUITE , Les formulations exactes des questions (structure par niche, exemples de messages validés) seront définies lors de la phase de formulations par niche , après le tronc central. Ce bloc pose les standards de forme et de registre.</w:t>
       </w:r>
     </w:p>
     <w:p>
@@ -21989,7 +22297,7 @@
           <w:szCs w:val="40"/>
           <w:rtl w:val="0"/>
         </w:rPr>
-        <w:t xml:space="preserve">BLOC 6  -  QUALIFICATION</w:t>
+        <w:t xml:space="preserve">BLOC 6 , QUALIFICATION</w:t>
       </w:r>
     </w:p>
     <w:p>
@@ -22061,7 +22369,7 @@
           <w:color w:val="222222"/>
           <w:rtl w:val="0"/>
         </w:rPr>
-        <w:t xml:space="preserve">Problème identifié et reconnu par le prospect dans sa situation actuelle. Un signal de douleur verbalisé ("je suis dans un creux", "la visibilité est pas ouf") confirme qu'un besoin réel existe  -  mais ne suffit pas à qualifier complètement. Il faut encore valider la solvabilité et s'assurer que la conscientisation est suffisante pour que l'appel soit productif.</w:t>
+        <w:t xml:space="preserve">Problème identifié et reconnu par le prospect dans sa situation actuelle. Un signal de douleur verbalisé ("je suis dans un creux", "la visibilité est pas ouf") confirme qu'un besoin réel existe , mais ne suffit pas à qualifier complètement. Il faut encore valider la solvabilité et s'assurer que la conscientisation est suffisante pour que l'appel soit productif.</w:t>
       </w:r>
     </w:p>
     <w:p>
@@ -22087,7 +22395,7 @@
           <w:color w:val="222222"/>
           <w:rtl w:val="0"/>
         </w:rPr>
-        <w:t xml:space="preserve">Capacité du prospect à investir dans la solution proposée. "Je n'ai pas l'argent" est une résistance dans 90% des cas  -  pas une incapacité réelle. La solvabilité ne se qualifie jamais frontalement en DM. Voir Section 2 et Point d'attention associé.</w:t>
+        <w:t xml:space="preserve">Capacité du prospect à investir dans la solution proposée. "Je n'ai pas l'argent" est une résistance dans 90% des cas , pas une incapacité réelle. La solvabilité ne se qualifie jamais frontalement en DM. Voir Section 2 et Point d'attention associé.</w:t>
       </w:r>
     </w:p>
     <w:p>
@@ -22113,7 +22421,7 @@
           <w:color w:val="222222"/>
           <w:rtl w:val="0"/>
         </w:rPr>
-        <w:t xml:space="preserve">Ensemble des problèmes concrets sur lesquels la solution de l'utilisateur peut aider  -  pour un profil donné. On ne cherche pas un seul problème unique : on part du premier angle et, s'il ne révèle pas de besoin, on explore le suivant. On ne disqualifie qu'après avoir parcouru l'ensemble du spectre sans signal.</w:t>
+        <w:t xml:space="preserve">Ensemble des problèmes concrets sur lesquels la solution de l'utilisateur peut aider , pour un profil donné. On ne cherche pas un seul problème unique : on part du premier angle et, s'il ne révèle pas de besoin, on explore le suivant. On ne disqualifie qu'après avoir parcouru l'ensemble du spectre sans signal.</w:t>
       </w:r>
     </w:p>
     <w:p>
@@ -22137,7 +22445,7 @@
           <w:szCs w:val="21"/>
           <w:rtl w:val="0"/>
         </w:rPr>
-        <w:t xml:space="preserve">Exemple  -  Accompagnement acquisition client (contexte Matthias)</w:t>
+        <w:t xml:space="preserve">Exemple , Accompagnement acquisition client (contexte Matthias)</w:t>
       </w:r>
     </w:p>
     <w:p>
@@ -22244,7 +22552,7 @@
           <w:szCs w:val="20"/>
           <w:rtl w:val="0"/>
         </w:rPr>
-        <w:t xml:space="preserve">Le spectre exact est défini par l'utilisateur de la plateforme en configuration initiale  -  il varie selon la niche et l'offre.</w:t>
+        <w:t xml:space="preserve">Le spectre exact est défini par l'utilisateur de la plateforme en configuration initiale , il varie selon la niche et l'offre.</w:t>
       </w:r>
     </w:p>
     <w:p>
@@ -22296,7 +22604,7 @@
           <w:color w:val="222222"/>
           <w:rtl w:val="0"/>
         </w:rPr>
-        <w:t xml:space="preserve">Réflexe central face à tout "non", toute objection, tout signal de résistance ou de mauvais timing. On ne cherche pas à convaincre, à contrer, ni à vendre. On cherche à comprendre pourquoi  -  pour mettre en parallèle la situation réelle du prospect avec ses propres objectifs, et laisser l'incohérence éventuelle apparaître d'elle-même.</w:t>
+        <w:t xml:space="preserve">Réflexe central face à tout "non", toute objection, tout signal de résistance ou de mauvais timing. On ne cherche pas à convaincre, à contrer, ni à vendre. On cherche à comprendre pourquoi , pour mettre en parallèle la situation réelle du prospect avec ses propres objectifs, et laisser l'incohérence éventuelle apparaître d'elle-même.</w:t>
       </w:r>
     </w:p>
     <w:p>
@@ -22420,7 +22728,7 @@
           <w:color w:val="222222"/>
           <w:rtl w:val="0"/>
         </w:rPr>
-        <w:t xml:space="preserve">Ces deux axes ne se vérifient pas dans un ordre fixe. Ils émergent au fil de la conversation  -  l'agent les lit en parallèle dans ce que le prospect exprime.</w:t>
+        <w:t xml:space="preserve">Ces deux axes ne se vérifient pas dans un ordre fixe. Ils émergent au fil de la conversation , l'agent les lit en parallèle dans ce que le prospect exprime.</w:t>
       </w:r>
     </w:p>
     <w:p>
@@ -22435,7 +22743,7 @@
           <w:color w:val="222222"/>
           <w:rtl w:val="0"/>
         </w:rPr>
-        <w:t xml:space="preserve">La temporalité (bon ou mauvais timing) n'est pas un axe indépendant. Quand un prospect a vraiment verbalisé son problème, l'urgence est déjà là. La question de timing n'apparaît que sous forme d'objection explicite  -  traitée systématiquement par la clarification. Voir Section 4.</w:t>
+        <w:t xml:space="preserve">La temporalité (bon ou mauvais timing) n'est pas un axe indépendant. Quand un prospect a vraiment verbalisé son problème, l'urgence est déjà là. La question de timing n'apparaît que sous forme d'objection explicite , traitée systématiquement par la clarification. Voir Section 4.</w:t>
       </w:r>
     </w:p>
     <w:p>
@@ -22479,7 +22787,7 @@
           <w:szCs w:val="21"/>
           <w:rtl w:val="0"/>
         </w:rPr>
-        <w:t xml:space="preserve">Quelqu'un peut avoir un besoin réel criant et ne pas avoir la capacité d'investir maintenant. Quelqu'un peut avoir de l'argent et aucun problème que la solution résout. Les deux doivent être vrais en même temps pour que l'appel soit pertinent  -  c'est pour ça qu'ils sont traités séparément, pas comme un seul bloc "qualification".</w:t>
+        <w:t xml:space="preserve">Quelqu'un peut avoir un besoin réel criant et ne pas avoir la capacité d'investir maintenant. Quelqu'un peut avoir de l'argent et aucun problème que la solution résout. Les deux doivent être vrais en même temps pour que l'appel soit pertinent , c'est pour ça qu'ils sont traités séparément, pas comme un seul bloc "qualification".</w:t>
       </w:r>
     </w:p>
     <w:p>
@@ -22525,7 +22833,7 @@
           <w:szCs w:val="28"/>
           <w:rtl w:val="0"/>
         </w:rPr>
-        <w:t xml:space="preserve">SECTION 1  -  BESOIN RÉEL</w:t>
+        <w:t xml:space="preserve">SECTION 1 , BESOIN RÉEL</w:t>
       </w:r>
     </w:p>
     <w:p>
@@ -22553,7 +22861,7 @@
           <w:szCs w:val="22"/>
           <w:rtl w:val="0"/>
         </w:rPr>
-        <w:t xml:space="preserve">1.1  -  Ce qui confirme un besoin réel</w:t>
+        <w:t xml:space="preserve">1.1 , Ce qui confirme un besoin réel</w:t>
       </w:r>
     </w:p>
     <w:p>
@@ -22568,7 +22876,7 @@
           <w:color w:val="222222"/>
           <w:rtl w:val="0"/>
         </w:rPr>
-        <w:t xml:space="preserve">Un besoin réel est présent quand le prospect exprime une tension dans sa situation actuelle  -  pas nécessairement avec des mots forts.</w:t>
+        <w:t xml:space="preserve">Un besoin réel est présent quand le prospect exprime une tension dans sa situation actuelle , pas nécessairement avec des mots forts.</w:t>
       </w:r>
     </w:p>
     <w:p>
@@ -22692,7 +23000,7 @@
           <w:szCs w:val="20"/>
           <w:rtl w:val="0"/>
         </w:rPr>
-        <w:t xml:space="preserve">→ Voir Bloc 3  -  Section 4 pour la liste complète des signaux de douleur et la logique de creusage.</w:t>
+        <w:t xml:space="preserve">→ Voir Bloc 3 , Section 4 pour la liste complète des signaux de douleur et la logique de creusage.</w:t>
       </w:r>
     </w:p>
     <w:p>
@@ -22884,7 +23192,7 @@
           <w:szCs w:val="21"/>
           <w:rtl w:val="0"/>
         </w:rPr>
-        <w:t xml:space="preserve">Un signal de douleur ouvre une porte  -  il ne la franchit pas. Le prospect peut exprimer une gêne légère et ne pas être prêt à agir. C'est le creusage qui transforme le signal en matière qualifiable.</w:t>
+        <w:t xml:space="preserve">Un signal de douleur ouvre une porte , il ne la franchit pas. Le prospect peut exprimer une gêne légère et ne pas être prêt à agir. C'est le creusage qui transforme le signal en matière qualifiable.</w:t>
       </w:r>
     </w:p>
     <w:p>
@@ -22912,7 +23220,7 @@
           <w:szCs w:val="22"/>
           <w:rtl w:val="0"/>
         </w:rPr>
-        <w:t xml:space="preserve">1.2  -  Deux niveaux de conscientisation  -  les deux sont qualifiables</w:t>
+        <w:t xml:space="preserve">1.2 , Deux niveaux de conscientisation , les deux sont qualifiables</w:t>
       </w:r>
     </w:p>
     <w:p>
@@ -22937,7 +23245,7 @@
           <w:color w:val="222222"/>
           <w:rtl w:val="0"/>
         </w:rPr>
-        <w:t xml:space="preserve">  -  Le prospect assume son problème mais ne sait pas encore qu'il a besoin d'aide pour le résoudre. Il pense "il faut juste que je m'y mette" ou "j'ai besoin de discipline". C'est un besoin réel mal conscientisé  -  pas une absence de besoin. On creuse, on ne disqualifie pas.</w:t>
+        <w:t xml:space="preserve"> , Le prospect assume son problème mais ne sait pas encore qu'il a besoin d'aide pour le résoudre. Il pense "il faut juste que je m'y mette" ou "j'ai besoin de discipline". C'est un besoin réel mal conscientisé , pas une absence de besoin. On creuse, on ne disqualifie pas.</w:t>
       </w:r>
     </w:p>
     <w:p>
@@ -22962,7 +23270,7 @@
           <w:color w:val="222222"/>
           <w:rtl w:val="0"/>
         </w:rPr>
-        <w:t xml:space="preserve">  -  Le prospect a conscience qu'il a besoin d'être accompagné. C'est une ouverture directe. La conscientisation a déjà eu lieu, au moins partiellement.</w:t>
+        <w:t xml:space="preserve"> , Le prospect a conscience qu'il a besoin d'être accompagné. C'est une ouverture directe. La conscientisation a déjà eu lieu, au moins partiellement.</w:t>
       </w:r>
     </w:p>
     <w:p>
@@ -23006,7 +23314,7 @@
           <w:szCs w:val="21"/>
           <w:rtl w:val="0"/>
         </w:rPr>
-        <w:t xml:space="preserve">Ces deux niveaux ne s'opposent pas. Le niveau A est simplement une étape avant le niveau B. C'est précisément le rôle des questions de conscientisation (Bloc 4) de faire avancer le prospect de l'un à l'autre. Creuser dans les deux cas  -  ne jamais bloquer la qualification sur le fait que le prospect n'a pas encore dit "j'ai besoin d'aide".</w:t>
+        <w:t xml:space="preserve">Ces deux niveaux ne s'opposent pas. Le niveau A est simplement une étape avant le niveau B. C'est précisément le rôle des questions de conscientisation (Bloc 4) de faire avancer le prospect de l'un à l'autre. Creuser dans les deux cas , ne jamais bloquer la qualification sur le fait que le prospect n'a pas encore dit "j'ai besoin d'aide".</w:t>
       </w:r>
     </w:p>
     <w:p>
@@ -23034,7 +23342,7 @@
           <w:szCs w:val="22"/>
           <w:rtl w:val="0"/>
         </w:rPr>
-        <w:t xml:space="preserve">1.3  -  Le spectre des angles d'attaque</w:t>
+        <w:t xml:space="preserve">1.3 , Le spectre des angles d'attaque</w:t>
       </w:r>
     </w:p>
     <w:p>
@@ -23100,7 +23408,7 @@
           <w:szCs w:val="21"/>
           <w:rtl w:val="0"/>
         </w:rPr>
-        <w:t xml:space="preserve">Pas de manière frontale  -  la conversation continue normalement,</w:t>
+        <w:t xml:space="preserve">Pas de manière frontale , la conversation continue normalement,</w:t>
       </w:r>
     </w:p>
     <w:p>
@@ -23255,7 +23563,7 @@
           <w:szCs w:val="20"/>
           <w:rtl w:val="0"/>
         </w:rPr>
-        <w:t xml:space="preserve">⚠ Le spectre des angles est propre à chaque niche et à chaque offre. Le tronc central pose le principe  -  les angles concrets sont définis en configuration utilisateur ou dans les modules niche.</w:t>
+        <w:t xml:space="preserve">⚠ Le spectre des angles est propre à chaque niche et à chaque offre. Le tronc central pose le principe , les angles concrets sont définis en configuration utilisateur ou dans les modules niche.</w:t>
       </w:r>
     </w:p>
     <w:p>
@@ -23301,7 +23609,7 @@
           <w:szCs w:val="28"/>
           <w:rtl w:val="0"/>
         </w:rPr>
-        <w:t xml:space="preserve">SECTION 2  -  SOLVABILITÉ</w:t>
+        <w:t xml:space="preserve">SECTION 2 , SOLVABILITÉ</w:t>
       </w:r>
     </w:p>
     <w:p>
@@ -23329,7 +23637,7 @@
           <w:szCs w:val="22"/>
           <w:rtl w:val="0"/>
         </w:rPr>
-        <w:t xml:space="preserve">2.1  -  Principe</w:t>
+        <w:t xml:space="preserve">2.1 , Principe</w:t>
       </w:r>
     </w:p>
     <w:p>
@@ -23344,7 +23652,7 @@
           <w:color w:val="222222"/>
           <w:rtl w:val="0"/>
         </w:rPr>
-        <w:t xml:space="preserve">"Pas de budget" est une résistance dans la grande majorité des cas  -  pas une incapacité financière réelle. Les personnes trouvent toujours des solutions quand quelque chose devient une priorité.</w:t>
+        <w:t xml:space="preserve">"Pas de budget" est une résistance dans la grande majorité des cas , pas une incapacité financière réelle. Les personnes trouvent toujours des solutions quand quelque chose devient une priorité.</w:t>
       </w:r>
     </w:p>
     <w:p>
@@ -23403,7 +23711,7 @@
           <w:color w:val="222222"/>
           <w:rtl w:val="0"/>
         </w:rPr>
-        <w:t xml:space="preserve">La solvabilité ne se qualifie jamais frontalement en DM. Elle se lit dans des signaux indirects et s'évalue également lors de l'appel  -  pas seulement en setting.</w:t>
+        <w:t xml:space="preserve">La solvabilité ne se qualifie jamais frontalement en DM. Elle se lit dans des signaux indirects et s'évalue également lors de l'appel , pas seulement en setting.</w:t>
       </w:r>
     </w:p>
     <w:p>
@@ -23746,7 +24054,7 @@
           <w:szCs w:val="21"/>
           <w:rtl w:val="0"/>
         </w:rPr>
-        <w:t xml:space="preserve">⚠ Point d'attention  -  à travailler avec Kevin + A/B testing</w:t>
+        <w:t xml:space="preserve">⚠ Point d'attention , à travailler avec Kevin + A/B testing</w:t>
       </w:r>
     </w:p>
     <w:p>
@@ -23810,7 +24118,7 @@
           <w:szCs w:val="21"/>
           <w:rtl w:val="0"/>
         </w:rPr>
-        <w:t xml:space="preserve">Les mêmes personnes qui disent "j'ai pas l'argent" trouvent des solutions quand quelque chose devient prioritaire. L'objection financière en DM est presque toujours une résistance psychologique  -  pas un état de compte bancaire. C'est en appel, après avoir creusé le problème réel, que la solvabilité devient une donnée concrète.</w:t>
+        <w:t xml:space="preserve">Les mêmes personnes qui disent "j'ai pas l'argent" trouvent des solutions quand quelque chose devient prioritaire. L'objection financière en DM est presque toujours une résistance psychologique , pas un état de compte bancaire. C'est en appel, après avoir creusé le problème réel, que la solvabilité devient une donnée concrète.</w:t>
       </w:r>
     </w:p>
     <w:p>
@@ -23856,7 +24164,7 @@
           <w:szCs w:val="28"/>
           <w:rtl w:val="0"/>
         </w:rPr>
-        <w:t xml:space="preserve">SECTION 3  -  LEAD SCORING</w:t>
+        <w:t xml:space="preserve">SECTION 3 , LEAD SCORING</w:t>
       </w:r>
     </w:p>
     <w:p>
@@ -23884,7 +24192,7 @@
           <w:szCs w:val="22"/>
           <w:rtl w:val="0"/>
         </w:rPr>
-        <w:t xml:space="preserve">3.1  -  Critères minimum avant de proposer l'action finale</w:t>
+        <w:t xml:space="preserve">3.1 , Critères minimum avant de proposer l'action finale</w:t>
       </w:r>
     </w:p>
     <w:p>
@@ -23909,7 +24217,7 @@
           <w:color w:val="222222"/>
           <w:rtl w:val="0"/>
         </w:rPr>
-        <w:t xml:space="preserve">  -  Le prospect a verbalisé un problème réel que la solution de l'utilisateur peut résoudre. Sans ce critère, proposer l'appel ne sert ni le prospect ni l'utilisateur.</w:t>
+        <w:t xml:space="preserve"> , Le prospect a verbalisé un problème réel que la solution de l'utilisateur peut résoudre. Sans ce critère, proposer l'appel ne sert ni le prospect ni l'utilisateur.</w:t>
       </w:r>
     </w:p>
     <w:p>
@@ -23934,7 +24242,7 @@
           <w:color w:val="222222"/>
           <w:rtl w:val="0"/>
         </w:rPr>
-        <w:t xml:space="preserve">  -  La solvabilité est suffisante  -  selon les paramètres de l'offre de l'utilisateur.</w:t>
+        <w:t xml:space="preserve"> , La solvabilité est suffisante , selon les paramètres de l'offre de l'utilisateur.</w:t>
       </w:r>
     </w:p>
     <w:p>
@@ -23960,7 +24268,7 @@
           <w:color w:val="222222"/>
           <w:rtl w:val="0"/>
         </w:rPr>
-        <w:t xml:space="preserve">  -  Absence de signal de timing bloquant non résolu par la clarification. Si une vraie contrainte de timing a été identifiée et confirmée → garder en suivi, ne pas proposer l'appel maintenant.</w:t>
+        <w:t xml:space="preserve"> , Absence de signal de timing bloquant non résolu par la clarification. Si une vraie contrainte de timing a été identifiée et confirmée → garder en suivi, ne pas proposer l'appel maintenant.</w:t>
       </w:r>
     </w:p>
     <w:p>
@@ -23984,7 +24292,7 @@
           <w:szCs w:val="21"/>
           <w:rtl w:val="0"/>
         </w:rPr>
-        <w:t xml:space="preserve">⚠ Point d'attention  -  Urgence à intégrer dans le lead scoring</w:t>
+        <w:t xml:space="preserve">⚠ Point d'attention , Urgence à intégrer dans le lead scoring</w:t>
       </w:r>
     </w:p>
     <w:p>
@@ -24004,7 +24312,7 @@
           <w:szCs w:val="21"/>
           <w:rtl w:val="0"/>
         </w:rPr>
-        <w:t xml:space="preserve">À un moment de la conversation, il peut être utile d'évaluer le niveau d'urgence réel du prospect  -  pas frontalement, mais en cherchant à comprendre sa situation concrète : a-t-il encore du chômage ? de la trésorerie ? Un délai précis avant que la situation devienne critique ?</w:t>
+        <w:t xml:space="preserve">À un moment de la conversation, il peut être utile d'évaluer le niveau d'urgence réel du prospect , pas frontalement, mais en cherchant à comprendre sa situation concrète : a-t-il encore du chômage ? de la trésorerie ? Un délai précis avant que la situation devienne critique ?</w:t>
       </w:r>
     </w:p>
     <w:p>
@@ -24068,7 +24376,7 @@
           <w:szCs w:val="22"/>
           <w:rtl w:val="0"/>
         </w:rPr>
-        <w:t xml:space="preserve">3.2  -  Trop tôt / trop tard</w:t>
+        <w:t xml:space="preserve">3.2 , Trop tôt / trop tard</w:t>
       </w:r>
     </w:p>
     <w:p>
@@ -24093,7 +24401,7 @@
           <w:color w:val="222222"/>
           <w:rtl w:val="0"/>
         </w:rPr>
-        <w:t xml:space="preserve">  -  le prospect arrive en appel sans avoir suffisamment conscientisé son problème, sans être vraiment engagé. Taux de closing en chute. Impact direct sur les résultats de l'utilisateur de la plateforme.</w:t>
+        <w:t xml:space="preserve"> , le prospect arrive en appel sans avoir suffisamment conscientisé son problème, sans être vraiment engagé. Taux de closing en chute. Impact direct sur les résultats de l'utilisateur de la plateforme.</w:t>
       </w:r>
     </w:p>
     <w:p>
@@ -24118,7 +24426,7 @@
           <w:color w:val="222222"/>
           <w:rtl w:val="0"/>
         </w:rPr>
-        <w:t xml:space="preserve">  -  le prospect se lasse. Même avec de la rondeur, une conversation qui n'avance pas vers une conclusion finit par être abandonnée.</w:t>
+        <w:t xml:space="preserve"> , le prospect se lasse. Même avec de la rondeur, une conversation qui n'avance pas vers une conclusion finit par être abandonnée.</w:t>
       </w:r>
     </w:p>
     <w:p>
@@ -24143,7 +24451,7 @@
           <w:color w:val="222222"/>
           <w:rtl w:val="0"/>
         </w:rPr>
-        <w:t xml:space="preserve">  -  besoin réel creusé jusqu'au concret + solvabilité vérifiée + mini-insight posé + engagement de la conversation confirmé. C'est ce moment qu'on cherche  -  pas un compteur de messages.</w:t>
+        <w:t xml:space="preserve"> , besoin réel creusé jusqu'au concret + solvabilité vérifiée + mini-insight posé + engagement de la conversation confirmé. C'est ce moment qu'on cherche , pas un compteur de messages.</w:t>
       </w:r>
     </w:p>
     <w:p>
@@ -24233,7 +24541,7 @@
           <w:szCs w:val="28"/>
           <w:rtl w:val="0"/>
         </w:rPr>
-        <w:t xml:space="preserve">SECTION 4  -  TEMPORALITÉ ET GESTION DES OBJECTIONS</w:t>
+        <w:t xml:space="preserve">SECTION 4 , TEMPORALITÉ ET GESTION DES OBJECTIONS</w:t>
       </w:r>
     </w:p>
     <w:p>
@@ -24261,7 +24569,7 @@
           <w:szCs w:val="22"/>
           <w:rtl w:val="0"/>
         </w:rPr>
-        <w:t xml:space="preserve">4.1  -  La temporalité n'est pas un problème indépendant</w:t>
+        <w:t xml:space="preserve">4.1 , La temporalité n'est pas un problème indépendant</w:t>
       </w:r>
     </w:p>
     <w:p>
@@ -24276,7 +24584,7 @@
           <w:color w:val="222222"/>
           <w:rtl w:val="0"/>
         </w:rPr>
-        <w:t xml:space="preserve">Quand un prospect a vraiment verbalisé son problème, le bon timing est déjà là. La douleur est présente maintenant  -  pas dans 3 mois.</w:t>
+        <w:t xml:space="preserve">Quand un prospect a vraiment verbalisé son problème, le bon timing est déjà là. La douleur est présente maintenant , pas dans 3 mois.</w:t>
       </w:r>
     </w:p>
     <w:p>
@@ -24335,7 +24643,7 @@
           <w:szCs w:val="22"/>
           <w:rtl w:val="0"/>
         </w:rPr>
-        <w:t xml:space="preserve">4.2  -  La clarification comme réflexe universel</w:t>
+        <w:t xml:space="preserve">4.2 , La clarification comme réflexe universel</w:t>
       </w:r>
     </w:p>
     <w:p>
@@ -24401,7 +24709,7 @@
           <w:color w:val="222222"/>
           <w:rtl w:val="0"/>
         </w:rPr>
-        <w:t xml:space="preserve">Comprendre pourquoi cette priorité a été choisie  -  pas frontalement, avec curiosité sincère</w:t>
+        <w:t xml:space="preserve">Comprendre pourquoi cette priorité a été choisie , pas frontalement, avec curiosité sincère</w:t>
       </w:r>
     </w:p>
     <w:p>
@@ -24480,7 +24788,7 @@
           <w:szCs w:val="21"/>
           <w:rtl w:val="0"/>
         </w:rPr>
-        <w:t xml:space="preserve">Derrière presque toutes les objections de timing se cache une vraie raison qui n'a pas encore été verbalisée. La clarification fait tomber le masque  -  et révèle souvent que la vraie contrainte est différente de l'excuse de surface. Sans clarification, on diqualifie des prospects qualifiables.</w:t>
+        <w:t xml:space="preserve">Derrière presque toutes les objections de timing se cache une vraie raison qui n'a pas encore été verbalisée. La clarification fait tomber le masque , et révèle souvent que la vraie contrainte est différente de l'excuse de surface. Sans clarification, on diqualifie des prospects qualifiables.</w:t>
       </w:r>
     </w:p>
     <w:p>
@@ -24504,7 +24812,7 @@
           <w:szCs w:val="21"/>
           <w:rtl w:val="0"/>
         </w:rPr>
-        <w:t xml:space="preserve">⚠ Point d'attention  -  à approfondir en atelier</w:t>
+        <w:t xml:space="preserve">⚠ Point d'attention , à approfondir en atelier</w:t>
       </w:r>
     </w:p>
     <w:p>
@@ -24552,7 +24860,7 @@
           <w:szCs w:val="22"/>
           <w:rtl w:val="0"/>
         </w:rPr>
-        <w:t xml:space="preserve">4.3  -  Six cas types de "besoin réel mais mauvais timing"</w:t>
+        <w:t xml:space="preserve">4.3 , Six cas types de "besoin réel mais mauvais timing"</w:t>
       </w:r>
     </w:p>
     <w:p>
@@ -24595,7 +24903,7 @@
           <w:color w:val="1155cc"/>
           <w:rtl w:val="0"/>
         </w:rPr>
-        <w:t xml:space="preserve">CAS 1  -  Budget alloué ailleurs pour la période</w:t>
+        <w:t xml:space="preserve">CAS 1 , Budget alloué ailleurs pour la période</w:t>
       </w:r>
     </w:p>
     <w:p>
@@ -24642,7 +24950,7 @@
           <w:color w:val="222222"/>
           <w:rtl w:val="0"/>
         </w:rPr>
-        <w:t xml:space="preserve">→ Clarifier pourquoi ce choix a été fait. Chercher à comprendre ce qui l'a amené vers cette solution. Parfois, la personne n'a pas encore vraiment commencé  -  ce peut être une carte à jouer si la solution de l'utilisateur est plus pertinente. Ne jamais forcer. Accueillir, creuser, rester présent.</w:t>
+        <w:t xml:space="preserve">→ Clarifier pourquoi ce choix a été fait. Chercher à comprendre ce qui l'a amené vers cette solution. Parfois, la personne n'a pas encore vraiment commencé , ce peut être une carte à jouer si la solution de l'utilisateur est plus pertinente. Ne jamais forcer. Accueillir, creuser, rester présent.</w:t>
       </w:r>
     </w:p>
     <w:p>
@@ -24662,7 +24970,7 @@
           <w:color w:val="1155cc"/>
           <w:rtl w:val="0"/>
         </w:rPr>
-        <w:t xml:space="preserve">CAS 2  -  Pivot d'offre en cours</w:t>
+        <w:t xml:space="preserve">CAS 2 , Pivot d'offre en cours</w:t>
       </w:r>
     </w:p>
     <w:p>
@@ -24709,7 +25017,7 @@
           <w:color w:val="222222"/>
           <w:rtl w:val="0"/>
         </w:rPr>
-        <w:t xml:space="preserve">→ Clarifier ce qui l'a amené au pivot. Pourquoi l'offre actuelle ne marchait pas. Un délai de 4 à 6 semaines n'est pas problématique  -  on peut tout à fait commencer une fois l'offre posée. La conversation continue, on reste dans la dynamique.</w:t>
+        <w:t xml:space="preserve">→ Clarifier ce qui l'a amené au pivot. Pourquoi l'offre actuelle ne marchait pas. Un délai de 4 à 6 semaines n'est pas problématique , on peut tout à fait commencer une fois l'offre posée. La conversation continue, on reste dans la dynamique.</w:t>
       </w:r>
     </w:p>
     <w:p>
@@ -24729,7 +25037,7 @@
           <w:color w:val="1155cc"/>
           <w:rtl w:val="0"/>
         </w:rPr>
-        <w:t xml:space="preserve">CAS 3  -  Bande passante personnelle saturée (déménagement, naissance, événement de vie)</w:t>
+        <w:t xml:space="preserve">CAS 3 , Bande passante personnelle saturée (déménagement, naissance, événement de vie)</w:t>
       </w:r>
     </w:p>
     <w:p>
@@ -24745,7 +25053,7 @@
           <w:color w:val="222222"/>
           <w:rtl w:val="0"/>
         </w:rPr>
-        <w:t xml:space="preserve">Besoin réel verbalisé, mais la personne gère un événement personnel lourd. Elle sait qu'elle n'exécutera pas si elle commence maintenant. Ce profil est souvent sans urgence perçue  -  matelas financier, chômage, trésorerie. Le problème business est réel mais il ne brûle pas.</w:t>
+        <w:t xml:space="preserve">Besoin réel verbalisé, mais la personne gère un événement personnel lourd. Elle sait qu'elle n'exécutera pas si elle commence maintenant. Ce profil est souvent sans urgence perçue , matelas financier, chômage, trésorerie. Le problème business est réel mais il ne brûle pas.</w:t>
       </w:r>
     </w:p>
     <w:p>
@@ -24776,7 +25084,7 @@
           <w:color w:val="222222"/>
           <w:rtl w:val="0"/>
         </w:rPr>
-        <w:t xml:space="preserve">→ Ne pas clarifier uniquement la situation business. Clarifier les motivations profondes : pourquoi elle a lancé son activité, ce que ça représente pour elle. Faire remonter l'importance de l'objectif à la surface  -  pour que le projet business ne reste pas systématiquement sacrifié face aux imprévus de vie. L'objectif n'est pas de culpabiliser  -  c'est de faire conscientiser que l'urgence existe, même si elle n'est pas perçue comme telle.</w:t>
+        <w:t xml:space="preserve">→ Ne pas clarifier uniquement la situation business. Clarifier les motivations profondes : pourquoi elle a lancé son activité, ce que ça représente pour elle. Faire remonter l'importance de l'objectif à la surface , pour que le projet business ne reste pas systématiquement sacrifié face aux imprévus de vie. L'objectif n'est pas de culpabiliser , c'est de faire conscientiser que l'urgence existe, même si elle n'est pas perçue comme telle.</w:t>
       </w:r>
     </w:p>
     <w:p>
@@ -24796,7 +25104,7 @@
           <w:color w:val="1155cc"/>
           <w:rtl w:val="0"/>
         </w:rPr>
-        <w:t xml:space="preserve">CAS 4  -  Déjà engagé dans un autre accompagnement</w:t>
+        <w:t xml:space="preserve">CAS 4 , Déjà engagé dans un autre accompagnement</w:t>
       </w:r>
     </w:p>
     <w:p>
@@ -24812,7 +25120,7 @@
           <w:color w:val="222222"/>
           <w:rtl w:val="0"/>
         </w:rPr>
-        <w:t xml:space="preserve">Le prospect a exactement le problème que l'utilisateur résout  -  mais il a payé pour un autre accompagnement il y a peu. Psychologiquement et financièrement, il ne peut pas investir dans autre chose tant qu'il n'a pas "essayé" ce pour quoi il a payé.</w:t>
+        <w:t xml:space="preserve">Le prospect a exactement le problème que l'utilisateur résout , mais il a payé pour un autre accompagnement il y a peu. Psychologiquement et financièrement, il ne peut pas investir dans autre chose tant qu'il n'a pas "essayé" ce pour quoi il a payé.</w:t>
       </w:r>
     </w:p>
     <w:p>
@@ -24879,7 +25187,7 @@
           <w:color w:val="1155cc"/>
           <w:rtl w:val="0"/>
         </w:rPr>
-        <w:t xml:space="preserve">CAS 5  -  Période creuse saisonnière</w:t>
+        <w:t xml:space="preserve">CAS 5 , Période creuse saisonnière</w:t>
       </w:r>
     </w:p>
     <w:p>
@@ -24895,7 +25203,7 @@
           <w:color w:val="222222"/>
           <w:rtl w:val="0"/>
         </w:rPr>
-        <w:t xml:space="preserve">Certains profils ont des cycles d'activité naturels. La douleur est réelle mais l'exécution n'est pas possible maintenant  -  dans 6 à 8 semaines, oui.</w:t>
+        <w:t xml:space="preserve">Certains profils ont des cycles d'activité naturels. La douleur est réelle mais l'exécution n'est pas possible maintenant , dans 6 à 8 semaines, oui.</w:t>
       </w:r>
     </w:p>
     <w:p>
@@ -24946,7 +25254,7 @@
           <w:color w:val="1155cc"/>
           <w:rtl w:val="0"/>
         </w:rPr>
-        <w:t xml:space="preserve">CAS 6  -  Gros client en cours qui "consomme tout"</w:t>
+        <w:t xml:space="preserve">CAS 6 , Gros client en cours qui "consomme tout"</w:t>
       </w:r>
     </w:p>
     <w:p>
@@ -24993,7 +25301,7 @@
           <w:color w:val="222222"/>
           <w:rtl w:val="0"/>
         </w:rPr>
-        <w:t xml:space="preserve">→ Clarifier ce qui lui prend réellement ce temps. Dans la majorité des cas, en creusant, on découvre que la vraie contrainte n'est pas le client  -  c'est une situation personnelle qui se cache derrière (naissance, déménagement, etc.). La clarification fait tomber le masque. Une fois la vraie contrainte identifiée, on traite le cas selon sa nature réelle (→ CAS 3 ou CAS 4 selon le contexte).</w:t>
+        <w:t xml:space="preserve">→ Clarifier ce qui lui prend réellement ce temps. Dans la majorité des cas, en creusant, on découvre que la vraie contrainte n'est pas le client , c'est une situation personnelle qui se cache derrière (naissance, déménagement, etc.). La clarification fait tomber le masque. Une fois la vraie contrainte identifiée, on traite le cas selon sa nature réelle (→ CAS 3 ou CAS 4 selon le contexte).</w:t>
       </w:r>
     </w:p>
     <w:p>
@@ -25021,7 +25329,7 @@
           <w:szCs w:val="22"/>
           <w:rtl w:val="0"/>
         </w:rPr>
-        <w:t xml:space="preserve">4.4  -  "Non" mou vs "non" ferme  -  même réflexe de départ</w:t>
+        <w:t xml:space="preserve">4.4 , "Non" mou vs "non" ferme , même réflexe de départ</w:t>
       </w:r>
     </w:p>
     <w:p>
@@ -25097,7 +25405,7 @@
           <w:szCs w:val="21"/>
           <w:rtl w:val="0"/>
         </w:rPr>
-        <w:t xml:space="preserve">Exemple  -  logique de mise en parallèle après clarification</w:t>
+        <w:t xml:space="preserve">Exemple , logique de mise en parallèle après clarification</w:t>
       </w:r>
     </w:p>
     <w:p>
@@ -25201,7 +25509,7 @@
           <w:szCs w:val="21"/>
           <w:rtl w:val="0"/>
         </w:rPr>
-        <w:t xml:space="preserve">→ La question amène le prospect à évaluer lui-même la cohérence de sa stratégie  -  sans que l'agent l'impose.</w:t>
+        <w:t xml:space="preserve">→ La question amène le prospect à évaluer lui-même la cohérence de sa stratégie , sans que l'agent l'impose.</w:t>
       </w:r>
     </w:p>
     <w:p>
@@ -25245,7 +25553,7 @@
           <w:szCs w:val="21"/>
           <w:rtl w:val="0"/>
         </w:rPr>
-        <w:t xml:space="preserve">Le "non" mou et le "non" ferme se ressemblent en surface. La seule façon de les distinguer, c'est de clarifier. Le "non" mou tombe quand on creuse  -  la vraie raison est différente de l'excuse donnée. Le "non" ferme tient quand on creuse  -  la conviction est cohérente avec la situation. Sans clarification, on ne sait pas dans quel cas on est.</w:t>
+        <w:t xml:space="preserve">Le "non" mou et le "non" ferme se ressemblent en surface. La seule façon de les distinguer, c'est de clarifier. Le "non" mou tombe quand on creuse , la vraie raison est différente de l'excuse donnée. Le "non" ferme tient quand on creuse , la conviction est cohérente avec la situation. Sans clarification, on ne sait pas dans quel cas on est.</w:t>
       </w:r>
     </w:p>
     <w:p>
@@ -25273,7 +25581,7 @@
           <w:szCs w:val="22"/>
           <w:rtl w:val="0"/>
         </w:rPr>
-        <w:t xml:space="preserve">4.5  -  Suivi des prospects "pas le bon timing"</w:t>
+        <w:t xml:space="preserve">4.5 , Suivi des prospects "pas le bon timing"</w:t>
       </w:r>
     </w:p>
     <w:p>
@@ -25304,7 +25612,7 @@
           <w:color w:val="222222"/>
           <w:rtl w:val="0"/>
         </w:rPr>
-        <w:t xml:space="preserve"> de reprise de contact  -  pas une vague "je te recontacte dans quelques semaines."</w:t>
+        <w:t xml:space="preserve"> de reprise de contact , pas une vague "je te recontacte dans quelques semaines."</w:t>
       </w:r>
     </w:p>
     <w:p>
@@ -25328,7 +25636,7 @@
           <w:szCs w:val="21"/>
           <w:rtl w:val="0"/>
         </w:rPr>
-        <w:t xml:space="preserve">⚠ Point d'attention majeur  -  à définir avec Kevin et Tariel</w:t>
+        <w:t xml:space="preserve">⚠ Point d'attention majeur , à définir avec Kevin et Tariel</w:t>
       </w:r>
     </w:p>
     <w:p>
@@ -25430,7 +25738,7 @@
           <w:szCs w:val="28"/>
           <w:rtl w:val="0"/>
         </w:rPr>
-        <w:t xml:space="preserve">SECTION 5  -  LA STORYTELLING APPROACH</w:t>
+        <w:t xml:space="preserve">SECTION 5 , LA STORYTELLING APPROACH</w:t>
       </w:r>
     </w:p>
     <w:p>
@@ -25469,7 +25777,7 @@
           <w:color w:val="222222"/>
           <w:rtl w:val="0"/>
         </w:rPr>
-        <w:t xml:space="preserve"> Qualifier indirectement en racontant une référence  -  un type de profil accompagné, un contexte reconnaissable  -  puis observer si le prospect s'y reconnaît.</w:t>
+        <w:t xml:space="preserve"> Qualifier indirectement en racontant une référence , un type de profil accompagné, un contexte reconnaissable , puis observer si le prospect s'y reconnaît.</w:t>
       </w:r>
     </w:p>
     <w:p>
@@ -25539,7 +25847,7 @@
           <w:color w:val="222222"/>
           <w:rtl w:val="0"/>
         </w:rPr>
-        <w:t xml:space="preserve">Demander si le prospect est dans ce cas  -  sans que ce soit frontal</w:t>
+        <w:t xml:space="preserve">Demander si le prospect est dans ce cas , sans que ce soit frontal</w:t>
       </w:r>
     </w:p>
     <w:p>
@@ -25563,7 +25871,7 @@
           <w:color w:val="222222"/>
           <w:rtl w:val="0"/>
         </w:rPr>
-        <w:t xml:space="preserve"> La référence fait le travail. Le prospect se reconnaît (ou non) dans ce miroir  -  sans qu'on lui ait posé de question directe sur sa situation.</w:t>
+        <w:t xml:space="preserve"> La référence fait le travail. Le prospect se reconnaît (ou non) dans ce miroir , sans qu'on lui ait posé de question directe sur sa situation.</w:t>
       </w:r>
     </w:p>
     <w:p>
@@ -25607,7 +25915,7 @@
           <w:szCs w:val="21"/>
           <w:rtl w:val="0"/>
         </w:rPr>
-        <w:t xml:space="preserve">Une question directe sur la situation du prospect déclenche le filtre de prospection  -  "il cherche à savoir si je suis qualifié pour ce qu'il vend." La référence contourne ce filtre : ce n'est plus une question, c'est une histoire. Le prospect choisit de s'y reconnaître ou non  -  c'est lui qui fait le pas.</w:t>
+        <w:t xml:space="preserve">Une question directe sur la situation du prospect déclenche le filtre de prospection , "il cherche à savoir si je suis qualifié pour ce qu'il vend." La référence contourne ce filtre : ce n'est plus une question, c'est une histoire. Le prospect choisit de s'y reconnaître ou non , c'est lui qui fait le pas.</w:t>
       </w:r>
     </w:p>
     <w:p>
@@ -25630,7 +25938,7 @@
           <w:szCs w:val="20"/>
           <w:rtl w:val="0"/>
         </w:rPr>
-        <w:t xml:space="preserve">⚠ Les formulations exactes seront définies lors de la phase de formulations par niche  -  après le tronc central. Ce bloc pose le principe.</w:t>
+        <w:t xml:space="preserve">⚠ Les formulations exactes seront définies lors de la phase de formulations par niche , après le tronc central. Ce bloc pose le principe.</w:t>
       </w:r>
     </w:p>
     <w:p>
@@ -25654,7 +25962,7 @@
           <w:szCs w:val="21"/>
           <w:rtl w:val="0"/>
         </w:rPr>
-        <w:t xml:space="preserve">⚠ Points d'attention  -  méthodes à clarifier</w:t>
+        <w:t xml:space="preserve">⚠ Points d'attention , méthodes à clarifier</w:t>
       </w:r>
     </w:p>
     <w:p>
@@ -25685,7 +25993,7 @@
           <w:szCs w:val="21"/>
           <w:rtl w:val="0"/>
         </w:rPr>
-        <w:t xml:space="preserve"> (proposer des créneaux spécifiques plutôt qu'un agenda, pour garder le prospect chaud  -  idéalement moins de 3 jours entre acceptation et visio) n'est pas une méthode de qualification. C'est une méthode de booking de l'action finale. À traiter dans le bloc dédié à la proposition de l'action finale.</w:t>
+        <w:t xml:space="preserve"> (proposer des créneaux spécifiques plutôt qu'un agenda, pour garder le prospect chaud , idéalement moins de 3 jours entre acceptation et visio) n'est pas une méthode de qualification. C'est une méthode de booking de l'action finale. À traiter dans le bloc dédié à la proposition de l'action finale.</w:t>
       </w:r>
     </w:p>
     <w:p>
@@ -25778,7 +26086,7 @@
           <w:szCs w:val="28"/>
           <w:rtl w:val="0"/>
         </w:rPr>
-        <w:t xml:space="preserve">SECTION 6  -  POINTS D'ATTENTION TRANSVERSAUX</w:t>
+        <w:t xml:space="preserve">SECTION 6 , POINTS D'ATTENTION TRANSVERSAUX</w:t>
       </w:r>
     </w:p>
     <w:p>
@@ -25804,7 +26112,7 @@
           <w:color w:val="222222"/>
           <w:rtl w:val="0"/>
         </w:rPr>
-        <w:t xml:space="preserve"> certains mots peuvent déclencher de la méfiance selon la niche ("clients", "chiffre d'affaires", etc.). Liste à construire lors d'un atelier dédié avec une session Claude séparée  -  après collecte de cas réels.</w:t>
+        <w:t xml:space="preserve"> certains mots peuvent déclencher de la méfiance selon la niche ("clients", "chiffre d'affaires", etc.). Liste à construire lors d'un atelier dédié avec une session Claude séparée , après collecte de cas réels.</w:t>
       </w:r>
     </w:p>
     <w:p>
@@ -25938,7 +26246,7 @@
           <w:szCs w:val="40"/>
           <w:rtl w:val="0"/>
         </w:rPr>
-        <w:t xml:space="preserve">BLOC 7  -  SIGNAUX DE DISQUALIFICATION</w:t>
+        <w:t xml:space="preserve">BLOC 7 , SIGNAUX DE DISQUALIFICATION</w:t>
       </w:r>
     </w:p>
     <w:p>
@@ -26011,7 +26319,7 @@
           <w:color w:val="222222"/>
           <w:rtl w:val="0"/>
         </w:rPr>
-        <w:t xml:space="preserve">Décision de clore définitivement une conversation sans suivi prévu. C'est radical  -  pas fréquent. 5 à 10% des conversations maximum. À ne pas confondre avec le suivi (mauvais timing → on garde le contact) ou l'espace de vérification (signal d'alerte → l'utilisateur décide).</w:t>
+        <w:t xml:space="preserve">Décision de clore définitivement une conversation sans suivi prévu. C'est radical , pas fréquent. 5 à 10% des conversations maximum. À ne pas confondre avec le suivi (mauvais timing → on garde le contact) ou l'espace de vérification (signal d'alerte → l'utilisateur décide).</w:t>
       </w:r>
     </w:p>
     <w:p>
@@ -26037,7 +26345,7 @@
           <w:color w:val="222222"/>
           <w:rtl w:val="0"/>
         </w:rPr>
-        <w:t xml:space="preserve">Zone dans l'interface Yadulink où les conversations qui déclenchent un signal d'alerte sont remontées à l'utilisateur pour décision. L'IA ne disqualifie pas seule  -  elle détecte, signale, et attend la décision humaine.</w:t>
+        <w:t xml:space="preserve">Zone dans l'interface Yadulink où les conversations qui déclenchent un signal d'alerte sont remontées à l'utilisateur pour décision. L'IA ne disqualifie pas seule , elle détecte, signale, et attend la décision humaine.</w:t>
       </w:r>
     </w:p>
     <w:p>
@@ -26061,7 +26369,7 @@
           <w:szCs w:val="21"/>
           <w:rtl w:val="0"/>
         </w:rPr>
-        <w:t xml:space="preserve">⚠ Point d'attention  -  à définir avec Kevin</w:t>
+        <w:t xml:space="preserve">⚠ Point d'attention , à définir avec Kevin</w:t>
       </w:r>
     </w:p>
     <w:p>
@@ -26107,7 +26415,7 @@
           <w:color w:val="222222"/>
           <w:rtl w:val="0"/>
         </w:rPr>
-        <w:t xml:space="preserve">Comportement ou formulation qui indique une friction, une résistance ou un profil potentiellement problématique  -  sans déclencher automatiquement la disqualification. Remonte dans l'espace de vérification pour décision utilisateur.</w:t>
+        <w:t xml:space="preserve">Comportement ou formulation qui indique une friction, une résistance ou un profil potentiellement problématique , sans déclencher automatiquement la disqualification. Remonte dans l'espace de vérification pour décision utilisateur.</w:t>
       </w:r>
     </w:p>
     <w:p>
@@ -26178,7 +26486,7 @@
           <w:szCs w:val="21"/>
           <w:rtl w:val="0"/>
         </w:rPr>
-        <w:t xml:space="preserve">Les formulations précises des relances selon le profil et le contexte sont à définir séparément. Ce bloc pose le seuil  -  pas le contenu des relances.</w:t>
+        <w:t xml:space="preserve">Les formulations précises des relances selon le profil et le contexte sont à définir séparément. Ce bloc pose le seuil , pas le contenu des relances.</w:t>
       </w:r>
     </w:p>
     <w:p>
@@ -26239,7 +26547,7 @@
           <w:color w:val="222222"/>
           <w:rtl w:val="0"/>
         </w:rPr>
-        <w:t xml:space="preserve">L'IA détecte et signale  -  la décision finale appartient toujours à l'utilisateur.</w:t>
+        <w:t xml:space="preserve">L'IA détecte et signale , la décision finale appartient toujours à l'utilisateur.</w:t>
       </w:r>
     </w:p>
     <w:p>
@@ -26254,7 +26562,7 @@
           <w:color w:val="222222"/>
           <w:rtl w:val="0"/>
         </w:rPr>
-        <w:t xml:space="preserve">La disqualification est rare. Dans la grande majorité des cas où une conversation "tombe à l'eau", ce n'est pas une disqualification  -  c'est soit un suivi (mauvais timing), soit une conversation à gérer différemment avec les bons outils (carte sur table, humour, redescente de pression).</w:t>
+        <w:t xml:space="preserve">La disqualification est rare. Dans la grande majorité des cas où une conversation "tombe à l'eau", ce n'est pas une disqualification , c'est soit un suivi (mauvais timing), soit une conversation à gérer différemment avec les bons outils (carte sur table, humour, redescente de pression).</w:t>
       </w:r>
     </w:p>
     <w:p>
@@ -26313,7 +26621,7 @@
           <w:szCs w:val="21"/>
           <w:rtl w:val="0"/>
         </w:rPr>
-        <w:t xml:space="preserve">La plupart des signaux qui ressemblent à une fermeture sont en réalité des objections, des résistances ou des mauvais timings  -  qui se gèrent. La disqualification vraie, c'est quand il n'y a plus rien à faire : soit le prospect a confirmé qu'il n'y a pas d'alignement après clarification, soit il n'a tout simplement plus donné signe de vie après 3 tentatives.</w:t>
+        <w:t xml:space="preserve">La plupart des signaux qui ressemblent à une fermeture sont en réalité des objections, des résistances ou des mauvais timings , qui se gèrent. La disqualification vraie, c'est quand il n'y a plus rien à faire : soit le prospect a confirmé qu'il n'y a pas d'alignement après clarification, soit il n'a tout simplement plus donné signe de vie après 3 tentatives.</w:t>
       </w:r>
     </w:p>
     <w:p>
@@ -26359,7 +26667,7 @@
           <w:szCs w:val="28"/>
           <w:rtl w:val="0"/>
         </w:rPr>
-        <w:t xml:space="preserve">SECTION 1  -  SIGNAUX DE DISQUALIFICATION RÉELS</w:t>
+        <w:t xml:space="preserve">SECTION 1 , SIGNAUX DE DISQUALIFICATION RÉELS</w:t>
       </w:r>
     </w:p>
     <w:p>
@@ -26387,7 +26695,7 @@
           <w:szCs w:val="22"/>
           <w:rtl w:val="0"/>
         </w:rPr>
-        <w:t xml:space="preserve">1.1  -  Trois relances sans réponse</w:t>
+        <w:t xml:space="preserve">1.1 , Trois relances sans réponse</w:t>
       </w:r>
     </w:p>
     <w:p>
@@ -26462,7 +26770,7 @@
           <w:color w:val="222222"/>
           <w:rtl w:val="0"/>
         </w:rPr>
-        <w:t xml:space="preserve">Que le prospect ait laissé un "vu" ou non ne change rien à la règle. L'agent n'a pas la capacité de savoir avec certitude si un message a été lu  -  certains prospects masquent les accusés de lecture.</w:t>
+        <w:t xml:space="preserve">Que le prospect ait laissé un "vu" ou non ne change rien à la règle. L'agent n'a pas la capacité de savoir avec certitude si un message a été lu , certains prospects masquent les accusés de lecture.</w:t>
       </w:r>
     </w:p>
     <w:p>
@@ -26578,7 +26886,7 @@
           <w:szCs w:val="22"/>
           <w:rtl w:val="0"/>
         </w:rPr>
-        <w:t xml:space="preserve">1.2  -  Entonnoir inversé : clarification confirmée, vraiment pas leur sujet</w:t>
+        <w:t xml:space="preserve">1.2 , Entonnoir inversé : clarification confirmée, vraiment pas leur sujet</w:t>
       </w:r>
     </w:p>
     <w:p>
@@ -26725,7 +27033,7 @@
           <w:szCs w:val="21"/>
           <w:rtl w:val="0"/>
         </w:rPr>
-        <w:t xml:space="preserve">Définir précisément la séquence de clarification et de creusage avant d'arriver à ce point  -  pour s'assurer qu'on a vraiment épuisé les angles avant de clore.</w:t>
+        <w:t xml:space="preserve">Définir précisément la séquence de clarification et de creusage avant d'arriver à ce point , pour s'assurer qu'on a vraiment épuisé les angles avant de clore.</w:t>
       </w:r>
     </w:p>
     <w:p>
@@ -26753,7 +27061,7 @@
           <w:szCs w:val="22"/>
           <w:rtl w:val="0"/>
         </w:rPr>
-        <w:t xml:space="preserve">1.3  -  Fermeture explicite confirmée</w:t>
+        <w:t xml:space="preserve">1.3 , Fermeture explicite confirmée</w:t>
       </w:r>
     </w:p>
     <w:p>
@@ -26768,7 +27076,7 @@
           <w:color w:val="222222"/>
           <w:rtl w:val="0"/>
         </w:rPr>
-        <w:t xml:space="preserve">Un prospect qui dit "arrête de m'envoyer des messages" ou équivalent. Rare  -  mais ça arrive.</w:t>
+        <w:t xml:space="preserve">Un prospect qui dit "arrête de m'envoyer des messages" ou équivalent. Rare , mais ça arrive.</w:t>
       </w:r>
     </w:p>
     <w:p>
@@ -26879,7 +27187,7 @@
           <w:szCs w:val="20"/>
           <w:rtl w:val="0"/>
         </w:rPr>
-        <w:t xml:space="preserve">⚠ On ne ferme pas sur le premier signal de ce type sans tenter une réponse légère. Voir Section 3  -  situations D1/D2.</w:t>
+        <w:t xml:space="preserve">⚠ On ne ferme pas sur le premier signal de ce type sans tenter une réponse légère. Voir Section 3 , situations D1/D2.</w:t>
       </w:r>
     </w:p>
     <w:p>
@@ -26926,7 +27234,7 @@
           <w:szCs w:val="28"/>
           <w:rtl w:val="0"/>
         </w:rPr>
-        <w:t xml:space="preserve">SECTION 2  -  SIGNAUX D'ALERTE → ESPACE DE VÉRIFICATION UTILISATEUR</w:t>
+        <w:t xml:space="preserve">SECTION 2 , SIGNAUX D'ALERTE → ESPACE DE VÉRIFICATION UTILISATEUR</w:t>
       </w:r>
     </w:p>
     <w:p>
@@ -26969,7 +27277,7 @@
           <w:szCs w:val="22"/>
           <w:rtl w:val="0"/>
         </w:rPr>
-        <w:t xml:space="preserve">2.1  -  Profil hors niche découvert en cours de conversation</w:t>
+        <w:t xml:space="preserve">2.1 , Profil hors niche découvert en cours de conversation</w:t>
       </w:r>
     </w:p>
     <w:p>
@@ -27159,7 +27467,7 @@
           <w:szCs w:val="20"/>
           <w:rtl w:val="0"/>
         </w:rPr>
-        <w:t xml:space="preserve">⚠ Ce critère dépend entièrement de la configuration utilisateur (sa niche, sa cible exacte). Le tronc central pose le principe  -  le contenu exact est dans les modules niche et la configuration utilisateur.</w:t>
+        <w:t xml:space="preserve">⚠ Ce critère dépend entièrement de la configuration utilisateur (sa niche, sa cible exacte). Le tronc central pose le principe , le contenu exact est dans les modules niche et la configuration utilisateur.</w:t>
       </w:r>
     </w:p>
     <w:p>
@@ -27187,7 +27495,7 @@
           <w:szCs w:val="22"/>
           <w:rtl w:val="0"/>
         </w:rPr>
-        <w:t xml:space="preserve">2.2  -  Plaintes répétées sur les anciens coaches / formateurs</w:t>
+        <w:t xml:space="preserve">2.2 , Plaintes répétées sur les anciens coaches / formateurs</w:t>
       </w:r>
     </w:p>
     <w:p>
@@ -27202,7 +27510,7 @@
           <w:color w:val="222222"/>
           <w:rtl w:val="0"/>
         </w:rPr>
-        <w:t xml:space="preserve">Mentionner une mauvaise expérience passée une fois, c'est normal  -  c'est même souvent un signal de douleur. Revenir dessus dans plusieurs messages distincts, se victimiser régulièrement : signal d'alerte.</w:t>
+        <w:t xml:space="preserve">Mentionner une mauvaise expérience passée une fois, c'est normal , c'est même souvent un signal de douleur. Revenir dessus dans plusieurs messages distincts, se victimiser régulièrement : signal d'alerte.</w:t>
       </w:r>
     </w:p>
     <w:p>
@@ -27336,7 +27644,7 @@
           <w:szCs w:val="21"/>
           <w:rtl w:val="0"/>
         </w:rPr>
-        <w:t xml:space="preserve">Quelqu'un qui a été déçu par un accompagnement peut très bien être un excellent client  -  parfois même plus motivé parce qu'il a compris ce qui ne marchait pas. La répétition du signal est ce qui indique un profil potentiellement problématique, pas la mention unique. C'est l'utilisateur qui connaît son offre et sa capacité à gérer ce type de profil  -  pas l'IA.</w:t>
+        <w:t xml:space="preserve">Quelqu'un qui a été déçu par un accompagnement peut très bien être un excellent client , parfois même plus motivé parce qu'il a compris ce qui ne marchait pas. La répétition du signal est ce qui indique un profil potentiellement problématique, pas la mention unique. C'est l'utilisateur qui connaît son offre et sa capacité à gérer ce type de profil , pas l'IA.</w:t>
       </w:r>
     </w:p>
     <w:p>
@@ -27364,7 +27672,7 @@
           <w:szCs w:val="22"/>
           <w:rtl w:val="0"/>
         </w:rPr>
-        <w:t xml:space="preserve">2.3  -  Questions de garantie répétées</w:t>
+        <w:t xml:space="preserve">2.3 , Questions de garantie répétées</w:t>
       </w:r>
     </w:p>
     <w:p>
@@ -27379,7 +27687,7 @@
           <w:color w:val="222222"/>
           <w:rtl w:val="0"/>
         </w:rPr>
-        <w:t xml:space="preserve">Une question sur la garantie en DM : légitime. Ce n'est pas le rôle de l'agent d'y répondre  -  c'est un sujet pour l'appel.</w:t>
+        <w:t xml:space="preserve">Une question sur la garantie en DM : légitime. Ce n'est pas le rôle de l'agent d'y répondre , c'est un sujet pour l'appel.</w:t>
       </w:r>
     </w:p>
     <w:p>
@@ -27466,7 +27774,7 @@
           <w:szCs w:val="22"/>
           <w:rtl w:val="0"/>
         </w:rPr>
-        <w:t xml:space="preserve">2.4  -  Prospect en mode collecte d'informations</w:t>
+        <w:t xml:space="preserve">2.4 , Prospect en mode collecte d'informations</w:t>
       </w:r>
     </w:p>
     <w:p>
@@ -27615,7 +27923,7 @@
           <w:szCs w:val="28"/>
           <w:rtl w:val="0"/>
         </w:rPr>
-        <w:t xml:space="preserve">SECTION 3  -  CE QUI N'EST PAS UNE DISQUALIFICATION</w:t>
+        <w:t xml:space="preserve">SECTION 3 , CE QUI N'EST PAS UNE DISQUALIFICATION</w:t>
       </w:r>
     </w:p>
     <w:p>
@@ -28868,7 +29176,7 @@
           <w:color w:val="1155cc"/>
           <w:rtl w:val="0"/>
         </w:rPr>
-        <w:t xml:space="preserve">SITUATION D1 / D2  -  "Arrête de m'envoyer des messages" / "C'est quoi ce spam ?"</w:t>
+        <w:t xml:space="preserve">SITUATION D1 / D2 , "Arrête de m'envoyer des messages" / "C'est quoi ce spam ?"</w:t>
       </w:r>
     </w:p>
     <w:p>
@@ -28884,7 +29192,7 @@
           <w:color w:val="222222"/>
           <w:rtl w:val="0"/>
         </w:rPr>
-        <w:t xml:space="preserve">Ne pas abandonner immédiatement. Répondre avec légèreté et humour  -  reconnaître que le prospect se fait spammer sans s'en excuser. Attendre la réponse.</w:t>
+        <w:t xml:space="preserve">Ne pas abandonner immédiatement. Répondre avec légèreté et humour , reconnaître que le prospect se fait spammer sans s'en excuser. Attendre la réponse.</w:t>
       </w:r>
     </w:p>
     <w:p>
@@ -28986,7 +29294,7 @@
           <w:color w:val="1155cc"/>
           <w:rtl w:val="0"/>
         </w:rPr>
-        <w:t xml:space="preserve">SITUATION D3  -  "Je suis pas intéressé, merci."</w:t>
+        <w:t xml:space="preserve">SITUATION D3 , "Je suis pas intéressé, merci."</w:t>
       </w:r>
     </w:p>
     <w:p>
@@ -29056,7 +29364,7 @@
           <w:color w:val="1155cc"/>
           <w:rtl w:val="0"/>
         </w:rPr>
-        <w:t xml:space="preserve">SITUATION D4  -  "J'ai déjà ce qu'il me faut."</w:t>
+        <w:t xml:space="preserve">SITUATION D4 , "J'ai déjà ce qu'il me faut."</w:t>
       </w:r>
     </w:p>
     <w:p>
@@ -29092,7 +29400,7 @@
           <w:color w:val="1155cc"/>
           <w:rtl w:val="0"/>
         </w:rPr>
-        <w:t xml:space="preserve">SITUATION A3 / A6  -  "Je vois pas où tu veux en venir" / "J'ai pas le temps pour ces conversations"</w:t>
+        <w:t xml:space="preserve">SITUATION A3 / A6 , "Je vois pas où tu veux en venir" / "J'ai pas le temps pour ces conversations"</w:t>
       </w:r>
     </w:p>
     <w:p>
@@ -29108,7 +29416,7 @@
           <w:color w:val="222222"/>
           <w:rtl w:val="0"/>
         </w:rPr>
-        <w:t xml:space="preserve">Jouer carte sur table. Avec rondeur  -  pas de façon abrupte. Le prospect a détecté un pattern, on ne l'esquive pas. On est honnête sur l'intention tout en restant désintéressé dans la forme.</w:t>
+        <w:t xml:space="preserve">Jouer carte sur table. Avec rondeur , pas de façon abrupte. Le prospect a détecté un pattern, on ne l'esquive pas. On est honnête sur l'intention tout en restant désintéressé dans la forme.</w:t>
       </w:r>
     </w:p>
     <w:p>
@@ -29162,7 +29470,7 @@
           <w:color w:val="1155cc"/>
           <w:rtl w:val="0"/>
         </w:rPr>
-        <w:t xml:space="preserve">SITUATION A5  -  Réponses de plus en plus courtes</w:t>
+        <w:t xml:space="preserve">SITUATION A5 , Réponses de plus en plus courtes</w:t>
       </w:r>
     </w:p>
     <w:p>
@@ -29232,7 +29540,7 @@
           <w:color w:val="1155cc"/>
           <w:rtl w:val="0"/>
         </w:rPr>
-        <w:t xml:space="preserve">SITUATION A7  -  "Je pense qu'on n'est pas alignés. Bonne continuation."</w:t>
+        <w:t xml:space="preserve">SITUATION A7 , "Je pense qu'on n'est pas alignés. Bonne continuation."</w:t>
       </w:r>
     </w:p>
     <w:p>
@@ -29248,7 +29556,7 @@
           <w:color w:val="222222"/>
           <w:rtl w:val="0"/>
         </w:rPr>
-        <w:t xml:space="preserve">Ne pas lâcher sans avoir clarifié. Aller dans le sens du prospect avec rondeur et légèreté. Comprendre pourquoi il pense ça  -  parfois avec humour.</w:t>
+        <w:t xml:space="preserve">Ne pas lâcher sans avoir clarifié. Aller dans le sens du prospect avec rondeur et légèreté. Comprendre pourquoi il pense ça , parfois avec humour.</w:t>
       </w:r>
     </w:p>
     <w:p>
@@ -29328,7 +29636,7 @@
           <w:szCs w:val="28"/>
           <w:rtl w:val="0"/>
         </w:rPr>
-        <w:t xml:space="preserve">SECTION 4  -  POINTS D'ATTENTION TRANSVERSAUX</w:t>
+        <w:t xml:space="preserve">SECTION 4 , POINTS D'ATTENTION TRANSVERSAUX</w:t>
       </w:r>
     </w:p>
     <w:p>
@@ -29354,7 +29662,7 @@
           <w:color w:val="222222"/>
           <w:rtl w:val="0"/>
         </w:rPr>
-        <w:t xml:space="preserve"> (situations A3, A6) : scripts à développer et tester en A/B testing  -  c'est l'un des moments les plus délicats du setting.</w:t>
+        <w:t xml:space="preserve"> (situations A3, A6) : scripts à développer et tester en A/B testing , c'est l'un des moments les plus délicats du setting.</w:t>
       </w:r>
     </w:p>
     <w:p>
@@ -29432,7 +29740,7 @@
           <w:color w:val="222222"/>
           <w:rtl w:val="0"/>
         </w:rPr>
-        <w:t xml:space="preserve"> : seuil posé ici  -  contenu exact (formulations, timing, ton selon profil et stade de la conversation) à développer dans un atelier dédié.</w:t>
+        <w:t xml:space="preserve"> : seuil posé ici , contenu exact (formulations, timing, ton selon profil et stade de la conversation) à développer dans un atelier dédié.</w:t>
       </w:r>
     </w:p>
     <w:p>
@@ -29594,7 +29902,7 @@
   <ns0:comment ns0:id="8" ns0:author="Matthias" ns0:date="2026-03-09T10:00:00Z" ns0:initials="M">
     <ns0:p>
       <ns0:r>
-        <ns0:t xml:space="preserve">Règle appliquée sur tout le document : suppression de tous les tirets longs ( - ). Remplacés par ' - '. Signal fort d'IA à éliminer.</ns0:t>
+        <ns0:t xml:space="preserve">Règle appliquée sur tout le document : suppression de tous les tirets longs (—). Remplacés par ','. Signal fort d'IA à éliminer.</ns0:t>
       </ns0:r>
     </ns0:p>
   </ns0:comment>

</xml_diff>